<commit_message>
docs(spec): define SET-04 high-risk service criteria
</commit_message>
<xml_diff>
--- a/docs/기능정의서.docx
+++ b/docs/기능정의서.docx
@@ -2267,7 +2267,7 @@
                 <w:color w:val="16243A"/>
                 <w:sz w:val="17"/>
               </w:rPr>
-              <w:t>회사 표시정보</w:t>
+              <w:t>회사 기본정보 등록·수정</w:t>
             </w:r>
           </w:p>
         </w:tc>
@@ -2295,7 +2295,7 @@
                 <w:color w:val="16243A"/>
                 <w:sz w:val="17"/>
               </w:rPr>
-              <w:t>문서에 표시할 회사명·주소·연락처·보호 담당 정보를 관리한다.</w:t>
+              <w:t>회사명·사업장 주소·문의 연락처·개인정보 보호 담당 정보를 입력·수정하고 국가별 문서에서 공통으로 사용한다.</w:t>
             </w:r>
           </w:p>
         </w:tc>
@@ -2323,7 +2323,7 @@
                 <w:color w:val="16243A"/>
                 <w:sz w:val="17"/>
               </w:rPr>
-              <w:t>목표 국가의 필수 표시정보가 없으면 발행을 막는다.</w:t>
+              <w:t>필수 기본정보를 저장하고, 수정 시 영향을 받는 국가별 초안을 재검토 상태로 바꾼다.</w:t>
             </w:r>
           </w:p>
         </w:tc>
@@ -2501,7 +2501,7 @@
                 <w:color w:val="16243A"/>
                 <w:sz w:val="17"/>
               </w:rPr>
-              <w:t>고위험 서비스 제한</w:t>
+              <w:t>고위험 서비스 판정·제한</w:t>
             </w:r>
           </w:p>
         </w:tc>
@@ -2529,7 +2529,7 @@
                 <w:color w:val="16243A"/>
                 <w:sz w:val="17"/>
               </w:rPr>
-              <w:t>민감·고위험 서비스 유형은 자동 생성 경로에서 제외하고 외부 검토로 안내한다.</w:t>
+              <w:t>프로젝트 생성 시 다섯 가지 제품 기준을 질문하고, 하나라도 해당하면 일반 SaaS용 자동 생성·발행 경로에서 제외한다.</w:t>
             </w:r>
           </w:p>
         </w:tc>
@@ -2557,7 +2557,591 @@
                 <w:color w:val="16243A"/>
                 <w:sz w:val="17"/>
               </w:rPr>
-              <w:t>차단 사유와 사용자가 취할 행동을 한 가지로 명확히 제시한다.</w:t>
+              <w:t>판정 항목·응답·시각을 기록하고 차단 사유와 관할별 외부 검토 행동을 제시한다.</w:t>
+            </w:r>
+          </w:p>
+        </w:tc>
+      </w:tr>
+    </w:tbl>
+    <w:p>
+      <w:pPr>
+        <w:spacing w:before="80" w:after="0"/>
+      </w:pPr>
+    </w:p>
+    <w:p>
+      <w:r>
+        <w:br w:type="page"/>
+      </w:r>
+    </w:p>
+    <w:p>
+      <w:pPr>
+        <w:pStyle w:val="Heading3"/>
+      </w:pPr>
+      <w:r>
+        <w:t>SET-04 고위험 서비스 판단 기준</w:t>
+      </w:r>
+    </w:p>
+    <w:p>
+      <w:r>
+        <w:rPr>
+          <w:rFonts w:ascii="Arial Unicode MS" w:hAnsi="Arial Unicode MS" w:eastAsia="Arial Unicode MS"/>
+          <w:color w:val="16243A"/>
+          <w:sz w:val="22"/>
+        </w:rPr>
+        <w:t>아래 항목은 여러 관할의 강화된 보호 영역을 바탕으로 정한 Lawready MVP 지원 제외 기준입니다. 법률상 단일한 ‘고위험 서비스’ 정의나 위법 판정이 아닙니다. 하나라도 해당하면 일반 자동 생성·발행을 중단하고 관할별 외부 검토로 전환합니다.</w:t>
+      </w:r>
+    </w:p>
+    <w:tbl>
+      <w:tblPr>
+        <w:tblStyle w:val="TableGrid"/>
+        <w:tblW w:type="dxa" w:w="9360"/>
+        <w:jc w:val="left"/>
+        <w:tblLayout w:type="fixed"/>
+        <w:tblLook w:firstColumn="1" w:firstRow="1" w:lastColumn="0" w:lastRow="0" w:noHBand="0" w:noVBand="1" w:val="04A0"/>
+        <w:tblInd w:w="120" w:type="dxa"/>
+      </w:tblPr>
+      <w:tblGrid>
+        <w:gridCol w:w="1900"/>
+        <w:gridCol w:w="4200"/>
+        <w:gridCol w:w="3260"/>
+      </w:tblGrid>
+      <w:tr>
+        <w:trPr>
+          <w:tblHeader w:val="true"/>
+          <w:cantSplit/>
+        </w:trPr>
+        <w:tc>
+          <w:tcPr>
+            <w:tcW w:type="dxa" w:w="1900"/>
+            <w:shd w:fill="E8EEF9"/>
+            <w:tcMar>
+              <w:top w:w="80" w:type="dxa"/>
+              <w:start w:w="120" w:type="dxa"/>
+              <w:bottom w:w="80" w:type="dxa"/>
+              <w:end w:w="120" w:type="dxa"/>
+            </w:tcMar>
+            <w:vAlign w:val="center"/>
+          </w:tcPr>
+          <w:p>
+            <w:pPr>
+              <w:keepNext/>
+              <w:spacing w:before="0" w:after="0" w:line="276" w:lineRule="auto"/>
+              <w:jc w:val="left"/>
+            </w:pPr>
+            <w:r/>
+            <w:r>
+              <w:rPr>
+                <w:rFonts w:ascii="Arial Unicode MS" w:hAnsi="Arial Unicode MS" w:eastAsia="Arial Unicode MS"/>
+                <w:b/>
+                <w:color w:val="16243A"/>
+                <w:sz w:val="17"/>
+              </w:rPr>
+              <w:t>판정 유형</w:t>
+            </w:r>
+          </w:p>
+        </w:tc>
+        <w:tc>
+          <w:tcPr>
+            <w:tcW w:type="dxa" w:w="4200"/>
+            <w:shd w:fill="E8EEF9"/>
+            <w:tcMar>
+              <w:top w:w="80" w:type="dxa"/>
+              <w:start w:w="120" w:type="dxa"/>
+              <w:bottom w:w="80" w:type="dxa"/>
+              <w:end w:w="120" w:type="dxa"/>
+            </w:tcMar>
+            <w:vAlign w:val="center"/>
+          </w:tcPr>
+          <w:p>
+            <w:pPr>
+              <w:keepNext/>
+              <w:spacing w:before="0" w:after="0" w:line="276" w:lineRule="auto"/>
+              <w:jc w:val="left"/>
+            </w:pPr>
+            <w:r/>
+            <w:r>
+              <w:rPr>
+                <w:rFonts w:ascii="Arial Unicode MS" w:hAnsi="Arial Unicode MS" w:eastAsia="Arial Unicode MS"/>
+                <w:b/>
+                <w:color w:val="16243A"/>
+                <w:sz w:val="17"/>
+              </w:rPr>
+              <w:t>해당 서비스·처리 예</w:t>
+            </w:r>
+          </w:p>
+        </w:tc>
+        <w:tc>
+          <w:tcPr>
+            <w:tcW w:type="dxa" w:w="3260"/>
+            <w:shd w:fill="E8EEF9"/>
+            <w:tcMar>
+              <w:top w:w="80" w:type="dxa"/>
+              <w:start w:w="120" w:type="dxa"/>
+              <w:bottom w:w="80" w:type="dxa"/>
+              <w:end w:w="120" w:type="dxa"/>
+            </w:tcMar>
+            <w:vAlign w:val="center"/>
+          </w:tcPr>
+          <w:p>
+            <w:pPr>
+              <w:keepNext/>
+              <w:spacing w:before="0" w:after="0" w:line="276" w:lineRule="auto"/>
+              <w:jc w:val="left"/>
+            </w:pPr>
+            <w:r/>
+            <w:r>
+              <w:rPr>
+                <w:rFonts w:ascii="Arial Unicode MS" w:hAnsi="Arial Unicode MS" w:eastAsia="Arial Unicode MS"/>
+                <w:b/>
+                <w:color w:val="16243A"/>
+                <w:sz w:val="17"/>
+              </w:rPr>
+              <w:t>MVP 처리</w:t>
+            </w:r>
+          </w:p>
+        </w:tc>
+      </w:tr>
+      <w:tr>
+        <w:trPr>
+          <w:cantSplit/>
+        </w:trPr>
+        <w:tc>
+          <w:tcPr>
+            <w:tcW w:type="dxa" w:w="1900"/>
+            <w:tcMar>
+              <w:top w:w="80" w:type="dxa"/>
+              <w:start w:w="120" w:type="dxa"/>
+              <w:bottom w:w="80" w:type="dxa"/>
+              <w:end w:w="120" w:type="dxa"/>
+            </w:tcMar>
+            <w:vAlign w:val="center"/>
+          </w:tcPr>
+          <w:p>
+            <w:pPr>
+              <w:spacing w:before="0" w:after="0" w:line="276" w:lineRule="auto"/>
+              <w:jc w:val="left"/>
+            </w:pPr>
+            <w:r/>
+            <w:r>
+              <w:rPr>
+                <w:rFonts w:ascii="Arial Unicode MS" w:hAnsi="Arial Unicode MS" w:eastAsia="Arial Unicode MS"/>
+                <w:b/>
+                <w:color w:val="16243A"/>
+                <w:sz w:val="17"/>
+              </w:rPr>
+              <w:t>아동·청소년 대상</w:t>
+            </w:r>
+          </w:p>
+        </w:tc>
+        <w:tc>
+          <w:tcPr>
+            <w:tcW w:type="dxa" w:w="4200"/>
+            <w:tcMar>
+              <w:top w:w="80" w:type="dxa"/>
+              <w:start w:w="120" w:type="dxa"/>
+              <w:bottom w:w="80" w:type="dxa"/>
+              <w:end w:w="120" w:type="dxa"/>
+            </w:tcMar>
+            <w:vAlign w:val="center"/>
+          </w:tcPr>
+          <w:p>
+            <w:pPr>
+              <w:spacing w:before="0" w:after="0" w:line="276" w:lineRule="auto"/>
+              <w:jc w:val="left"/>
+            </w:pPr>
+            <w:r/>
+            <w:r>
+              <w:rPr>
+                <w:rFonts w:ascii="Arial Unicode MS" w:hAnsi="Arial Unicode MS" w:eastAsia="Arial Unicode MS"/>
+                <w:b w:val="0"/>
+                <w:color w:val="16243A"/>
+                <w:sz w:val="17"/>
+              </w:rPr>
+              <w:t>아동·청소년이 주 이용자이거나 연령 확인·보호자 동의가 필요한 서비스</w:t>
+            </w:r>
+          </w:p>
+        </w:tc>
+        <w:tc>
+          <w:tcPr>
+            <w:tcW w:type="dxa" w:w="3260"/>
+            <w:tcMar>
+              <w:top w:w="80" w:type="dxa"/>
+              <w:start w:w="120" w:type="dxa"/>
+              <w:bottom w:w="80" w:type="dxa"/>
+              <w:end w:w="120" w:type="dxa"/>
+            </w:tcMar>
+            <w:vAlign w:val="center"/>
+          </w:tcPr>
+          <w:p>
+            <w:pPr>
+              <w:spacing w:before="0" w:after="0" w:line="276" w:lineRule="auto"/>
+              <w:jc w:val="left"/>
+            </w:pPr>
+            <w:r/>
+            <w:r>
+              <w:rPr>
+                <w:rFonts w:ascii="Arial Unicode MS" w:hAnsi="Arial Unicode MS" w:eastAsia="Arial Unicode MS"/>
+                <w:b w:val="0"/>
+                <w:color w:val="16243A"/>
+                <w:sz w:val="17"/>
+              </w:rPr>
+              <w:t>자동 생성·발행 제외 → 아동 데이터 절차 외부 검토</w:t>
+            </w:r>
+          </w:p>
+        </w:tc>
+      </w:tr>
+      <w:tr>
+        <w:trPr>
+          <w:cantSplit/>
+        </w:trPr>
+        <w:tc>
+          <w:tcPr>
+            <w:tcW w:type="dxa" w:w="1900"/>
+            <w:tcMar>
+              <w:top w:w="80" w:type="dxa"/>
+              <w:start w:w="120" w:type="dxa"/>
+              <w:bottom w:w="80" w:type="dxa"/>
+              <w:end w:w="120" w:type="dxa"/>
+            </w:tcMar>
+            <w:vAlign w:val="center"/>
+          </w:tcPr>
+          <w:p>
+            <w:pPr>
+              <w:spacing w:before="0" w:after="0" w:line="276" w:lineRule="auto"/>
+              <w:jc w:val="left"/>
+            </w:pPr>
+            <w:r/>
+            <w:r>
+              <w:rPr>
+                <w:rFonts w:ascii="Arial Unicode MS" w:hAnsi="Arial Unicode MS" w:eastAsia="Arial Unicode MS"/>
+                <w:b/>
+                <w:color w:val="16243A"/>
+                <w:sz w:val="17"/>
+              </w:rPr>
+              <w:t>민감·특별관리 정보</w:t>
+            </w:r>
+          </w:p>
+        </w:tc>
+        <w:tc>
+          <w:tcPr>
+            <w:tcW w:type="dxa" w:w="4200"/>
+            <w:tcMar>
+              <w:top w:w="80" w:type="dxa"/>
+              <w:start w:w="120" w:type="dxa"/>
+              <w:bottom w:w="80" w:type="dxa"/>
+              <w:end w:w="120" w:type="dxa"/>
+            </w:tcMar>
+            <w:vAlign w:val="center"/>
+          </w:tcPr>
+          <w:p>
+            <w:pPr>
+              <w:spacing w:before="0" w:after="0" w:line="276" w:lineRule="auto"/>
+              <w:jc w:val="left"/>
+            </w:pPr>
+            <w:r/>
+            <w:r>
+              <w:rPr>
+                <w:rFonts w:ascii="Arial Unicode MS" w:hAnsi="Arial Unicode MS" w:eastAsia="Arial Unicode MS"/>
+                <w:b w:val="0"/>
+                <w:color w:val="16243A"/>
+                <w:sz w:val="17"/>
+              </w:rPr>
+              <w:t>건강·진료, 생체·유전·신경, 인종·신념·성생활, 범죄, 정밀 위치, 계정 접근정보를 핵심적으로 처리</w:t>
+            </w:r>
+          </w:p>
+        </w:tc>
+        <w:tc>
+          <w:tcPr>
+            <w:tcW w:type="dxa" w:w="3260"/>
+            <w:tcMar>
+              <w:top w:w="80" w:type="dxa"/>
+              <w:start w:w="120" w:type="dxa"/>
+              <w:bottom w:w="80" w:type="dxa"/>
+              <w:end w:w="120" w:type="dxa"/>
+            </w:tcMar>
+            <w:vAlign w:val="center"/>
+          </w:tcPr>
+          <w:p>
+            <w:pPr>
+              <w:spacing w:before="0" w:after="0" w:line="276" w:lineRule="auto"/>
+              <w:jc w:val="left"/>
+            </w:pPr>
+            <w:r/>
+            <w:r>
+              <w:rPr>
+                <w:rFonts w:ascii="Arial Unicode MS" w:hAnsi="Arial Unicode MS" w:eastAsia="Arial Unicode MS"/>
+                <w:b w:val="0"/>
+                <w:color w:val="16243A"/>
+                <w:sz w:val="17"/>
+              </w:rPr>
+              <w:t>자동 생성·발행 제외 → 관할별 동의·권리·보안 검토</w:t>
+            </w:r>
+          </w:p>
+        </w:tc>
+      </w:tr>
+      <w:tr>
+        <w:trPr>
+          <w:cantSplit/>
+        </w:trPr>
+        <w:tc>
+          <w:tcPr>
+            <w:tcW w:type="dxa" w:w="1900"/>
+            <w:tcMar>
+              <w:top w:w="80" w:type="dxa"/>
+              <w:start w:w="120" w:type="dxa"/>
+              <w:bottom w:w="80" w:type="dxa"/>
+              <w:end w:w="120" w:type="dxa"/>
+            </w:tcMar>
+            <w:vAlign w:val="center"/>
+          </w:tcPr>
+          <w:p>
+            <w:pPr>
+              <w:spacing w:before="0" w:after="0" w:line="276" w:lineRule="auto"/>
+              <w:jc w:val="left"/>
+            </w:pPr>
+            <w:r/>
+            <w:r>
+              <w:rPr>
+                <w:rFonts w:ascii="Arial Unicode MS" w:hAnsi="Arial Unicode MS" w:eastAsia="Arial Unicode MS"/>
+                <w:b/>
+                <w:color w:val="16243A"/>
+                <w:sz w:val="17"/>
+              </w:rPr>
+              <w:t>중대한 자동화 결정</w:t>
+            </w:r>
+          </w:p>
+        </w:tc>
+        <w:tc>
+          <w:tcPr>
+            <w:tcW w:type="dxa" w:w="4200"/>
+            <w:tcMar>
+              <w:top w:w="80" w:type="dxa"/>
+              <w:start w:w="120" w:type="dxa"/>
+              <w:bottom w:w="80" w:type="dxa"/>
+              <w:end w:w="120" w:type="dxa"/>
+            </w:tcMar>
+            <w:vAlign w:val="center"/>
+          </w:tcPr>
+          <w:p>
+            <w:pPr>
+              <w:spacing w:before="0" w:after="0" w:line="276" w:lineRule="auto"/>
+              <w:jc w:val="left"/>
+            </w:pPr>
+            <w:r/>
+            <w:r>
+              <w:rPr>
+                <w:rFonts w:ascii="Arial Unicode MS" w:hAnsi="Arial Unicode MS" w:eastAsia="Arial Unicode MS"/>
+                <w:b w:val="0"/>
+                <w:color w:val="16243A"/>
+                <w:sz w:val="17"/>
+              </w:rPr>
+              <w:t>채용·보상, 금융·대출, 주거, 교육 기회, 의료 제공을 자동 판단하거나 프로파일링</w:t>
+            </w:r>
+          </w:p>
+        </w:tc>
+        <w:tc>
+          <w:tcPr>
+            <w:tcW w:type="dxa" w:w="3260"/>
+            <w:tcMar>
+              <w:top w:w="80" w:type="dxa"/>
+              <w:start w:w="120" w:type="dxa"/>
+              <w:bottom w:w="80" w:type="dxa"/>
+              <w:end w:w="120" w:type="dxa"/>
+            </w:tcMar>
+            <w:vAlign w:val="center"/>
+          </w:tcPr>
+          <w:p>
+            <w:pPr>
+              <w:spacing w:before="0" w:after="0" w:line="276" w:lineRule="auto"/>
+              <w:jc w:val="left"/>
+            </w:pPr>
+            <w:r/>
+            <w:r>
+              <w:rPr>
+                <w:rFonts w:ascii="Arial Unicode MS" w:hAnsi="Arial Unicode MS" w:eastAsia="Arial Unicode MS"/>
+                <w:b w:val="0"/>
+                <w:color w:val="16243A"/>
+                <w:sz w:val="17"/>
+              </w:rPr>
+              <w:t>자동 생성·발행 제외 → 설명·거부·사람 검토 절차 검토</w:t>
+            </w:r>
+          </w:p>
+        </w:tc>
+      </w:tr>
+      <w:tr>
+        <w:trPr>
+          <w:cantSplit/>
+        </w:trPr>
+        <w:tc>
+          <w:tcPr>
+            <w:tcW w:type="dxa" w:w="1900"/>
+            <w:tcMar>
+              <w:top w:w="80" w:type="dxa"/>
+              <w:start w:w="120" w:type="dxa"/>
+              <w:bottom w:w="80" w:type="dxa"/>
+              <w:end w:w="120" w:type="dxa"/>
+            </w:tcMar>
+            <w:vAlign w:val="center"/>
+          </w:tcPr>
+          <w:p>
+            <w:pPr>
+              <w:spacing w:before="0" w:after="0" w:line="276" w:lineRule="auto"/>
+              <w:jc w:val="left"/>
+            </w:pPr>
+            <w:r/>
+            <w:r>
+              <w:rPr>
+                <w:rFonts w:ascii="Arial Unicode MS" w:hAnsi="Arial Unicode MS" w:eastAsia="Arial Unicode MS"/>
+                <w:b/>
+                <w:color w:val="16243A"/>
+                <w:sz w:val="17"/>
+              </w:rPr>
+              <w:t>지속적 감시·추적</w:t>
+            </w:r>
+          </w:p>
+        </w:tc>
+        <w:tc>
+          <w:tcPr>
+            <w:tcW w:type="dxa" w:w="4200"/>
+            <w:tcMar>
+              <w:top w:w="80" w:type="dxa"/>
+              <w:start w:w="120" w:type="dxa"/>
+              <w:bottom w:w="80" w:type="dxa"/>
+              <w:end w:w="120" w:type="dxa"/>
+            </w:tcMar>
+            <w:vAlign w:val="center"/>
+          </w:tcPr>
+          <w:p>
+            <w:pPr>
+              <w:spacing w:before="0" w:after="0" w:line="276" w:lineRule="auto"/>
+              <w:jc w:val="left"/>
+            </w:pPr>
+            <w:r/>
+            <w:r>
+              <w:rPr>
+                <w:rFonts w:ascii="Arial Unicode MS" w:hAnsi="Arial Unicode MS" w:eastAsia="Arial Unicode MS"/>
+                <w:b w:val="0"/>
+                <w:color w:val="16243A"/>
+                <w:sz w:val="17"/>
+              </w:rPr>
+              <w:t>얼굴·음성·행동 식별, 정밀 위치 추적, 공공장소·업무공간의 지속 관찰</w:t>
+            </w:r>
+          </w:p>
+        </w:tc>
+        <w:tc>
+          <w:tcPr>
+            <w:tcW w:type="dxa" w:w="3260"/>
+            <w:tcMar>
+              <w:top w:w="80" w:type="dxa"/>
+              <w:start w:w="120" w:type="dxa"/>
+              <w:bottom w:w="80" w:type="dxa"/>
+              <w:end w:w="120" w:type="dxa"/>
+            </w:tcMar>
+            <w:vAlign w:val="center"/>
+          </w:tcPr>
+          <w:p>
+            <w:pPr>
+              <w:spacing w:before="0" w:after="0" w:line="276" w:lineRule="auto"/>
+              <w:jc w:val="left"/>
+            </w:pPr>
+            <w:r/>
+            <w:r>
+              <w:rPr>
+                <w:rFonts w:ascii="Arial Unicode MS" w:hAnsi="Arial Unicode MS" w:eastAsia="Arial Unicode MS"/>
+                <w:b w:val="0"/>
+                <w:color w:val="16243A"/>
+                <w:sz w:val="17"/>
+              </w:rPr>
+              <w:t>자동 생성·발행 제외 → 필요성·비례성·영향평가 검토</w:t>
+            </w:r>
+          </w:p>
+        </w:tc>
+      </w:tr>
+      <w:tr>
+        <w:trPr>
+          <w:cantSplit/>
+        </w:trPr>
+        <w:tc>
+          <w:tcPr>
+            <w:tcW w:type="dxa" w:w="1900"/>
+            <w:tcMar>
+              <w:top w:w="80" w:type="dxa"/>
+              <w:start w:w="120" w:type="dxa"/>
+              <w:bottom w:w="80" w:type="dxa"/>
+              <w:end w:w="120" w:type="dxa"/>
+            </w:tcMar>
+            <w:vAlign w:val="center"/>
+          </w:tcPr>
+          <w:p>
+            <w:pPr>
+              <w:spacing w:before="0" w:after="0" w:line="276" w:lineRule="auto"/>
+              <w:jc w:val="left"/>
+            </w:pPr>
+            <w:r/>
+            <w:r>
+              <w:rPr>
+                <w:rFonts w:ascii="Arial Unicode MS" w:hAnsi="Arial Unicode MS" w:eastAsia="Arial Unicode MS"/>
+                <w:b/>
+                <w:color w:val="16243A"/>
+                <w:sz w:val="17"/>
+              </w:rPr>
+              <w:t>판매·공유 중심 모델</w:t>
+            </w:r>
+          </w:p>
+        </w:tc>
+        <w:tc>
+          <w:tcPr>
+            <w:tcW w:type="dxa" w:w="4200"/>
+            <w:tcMar>
+              <w:top w:w="80" w:type="dxa"/>
+              <w:start w:w="120" w:type="dxa"/>
+              <w:bottom w:w="80" w:type="dxa"/>
+              <w:end w:w="120" w:type="dxa"/>
+            </w:tcMar>
+            <w:vAlign w:val="center"/>
+          </w:tcPr>
+          <w:p>
+            <w:pPr>
+              <w:spacing w:before="0" w:after="0" w:line="276" w:lineRule="auto"/>
+              <w:jc w:val="left"/>
+            </w:pPr>
+            <w:r/>
+            <w:r>
+              <w:rPr>
+                <w:rFonts w:ascii="Arial Unicode MS" w:hAnsi="Arial Unicode MS" w:eastAsia="Arial Unicode MS"/>
+                <w:b w:val="0"/>
+                <w:color w:val="16243A"/>
+                <w:sz w:val="17"/>
+              </w:rPr>
+              <w:t>개인정보 판매·교환, 데이터 브로커, 교차 맥락 맞춤광고가 핵심 수익모델</w:t>
+            </w:r>
+          </w:p>
+        </w:tc>
+        <w:tc>
+          <w:tcPr>
+            <w:tcW w:type="dxa" w:w="3260"/>
+            <w:tcMar>
+              <w:top w:w="80" w:type="dxa"/>
+              <w:start w:w="120" w:type="dxa"/>
+              <w:bottom w:w="80" w:type="dxa"/>
+              <w:end w:w="120" w:type="dxa"/>
+            </w:tcMar>
+            <w:vAlign w:val="center"/>
+          </w:tcPr>
+          <w:p>
+            <w:pPr>
+              <w:spacing w:before="0" w:after="0" w:line="276" w:lineRule="auto"/>
+              <w:jc w:val="left"/>
+            </w:pPr>
+            <w:r/>
+            <w:r>
+              <w:rPr>
+                <w:rFonts w:ascii="Arial Unicode MS" w:hAnsi="Arial Unicode MS" w:eastAsia="Arial Unicode MS"/>
+                <w:b w:val="0"/>
+                <w:color w:val="16243A"/>
+                <w:sz w:val="17"/>
+              </w:rPr>
+              <w:t>MVP 범위 밖 → 전용 고지·옵트아웃 설계 후 재검토</w:t>
             </w:r>
           </w:p>
         </w:tc>
@@ -6991,6 +7575,95 @@
           </w:p>
         </w:tc>
       </w:tr>
+      <w:tr>
+        <w:trPr>
+          <w:cantSplit/>
+        </w:trPr>
+        <w:tc>
+          <w:tcPr>
+            <w:tcW w:type="dxa" w:w="1100"/>
+            <w:tcMar>
+              <w:top w:w="80" w:type="dxa"/>
+              <w:start w:w="120" w:type="dxa"/>
+              <w:bottom w:w="80" w:type="dxa"/>
+              <w:end w:w="120" w:type="dxa"/>
+            </w:tcMar>
+            <w:vAlign w:val="center"/>
+          </w:tcPr>
+          <w:p>
+            <w:pPr>
+              <w:spacing w:before="0" w:after="0" w:line="276" w:lineRule="auto"/>
+              <w:jc w:val="center"/>
+            </w:pPr>
+            <w:r/>
+            <w:r>
+              <w:rPr>
+                <w:rFonts w:ascii="Arial Unicode MS" w:hAnsi="Arial Unicode MS" w:eastAsia="Arial Unicode MS"/>
+                <w:b/>
+                <w:color w:val="16243A"/>
+                <w:sz w:val="18"/>
+              </w:rPr>
+              <w:t>VAL-09</w:t>
+            </w:r>
+          </w:p>
+        </w:tc>
+        <w:tc>
+          <w:tcPr>
+            <w:tcW w:type="dxa" w:w="4670"/>
+            <w:tcMar>
+              <w:top w:w="80" w:type="dxa"/>
+              <w:start w:w="120" w:type="dxa"/>
+              <w:bottom w:w="80" w:type="dxa"/>
+              <w:end w:w="120" w:type="dxa"/>
+            </w:tcMar>
+            <w:vAlign w:val="center"/>
+          </w:tcPr>
+          <w:p>
+            <w:pPr>
+              <w:spacing w:before="0" w:after="0" w:line="276" w:lineRule="auto"/>
+              <w:jc w:val="left"/>
+            </w:pPr>
+            <w:r/>
+            <w:r>
+              <w:rPr>
+                <w:rFonts w:ascii="Arial Unicode MS" w:hAnsi="Arial Unicode MS" w:eastAsia="Arial Unicode MS"/>
+                <w:b w:val="0"/>
+                <w:color w:val="16243A"/>
+                <w:sz w:val="18"/>
+              </w:rPr>
+              <w:t>SET-04 기준 중 하나 이상 해당</w:t>
+            </w:r>
+          </w:p>
+        </w:tc>
+        <w:tc>
+          <w:tcPr>
+            <w:tcW w:type="dxa" w:w="3590"/>
+            <w:tcMar>
+              <w:top w:w="80" w:type="dxa"/>
+              <w:start w:w="120" w:type="dxa"/>
+              <w:bottom w:w="80" w:type="dxa"/>
+              <w:end w:w="120" w:type="dxa"/>
+            </w:tcMar>
+            <w:vAlign w:val="center"/>
+          </w:tcPr>
+          <w:p>
+            <w:pPr>
+              <w:spacing w:before="0" w:after="0" w:line="276" w:lineRule="auto"/>
+              <w:jc w:val="left"/>
+            </w:pPr>
+            <w:r/>
+            <w:r>
+              <w:rPr>
+                <w:rFonts w:ascii="Arial Unicode MS" w:hAnsi="Arial Unicode MS" w:eastAsia="Arial Unicode MS"/>
+                <w:b w:val="0"/>
+                <w:color w:val="16243A"/>
+                <w:sz w:val="18"/>
+              </w:rPr>
+              <w:t>일반 자동 생성·발행 차단 후 판정 근거와 외부 검토 행동 표시</w:t>
+            </w:r>
+          </w:p>
+        </w:tc>
+      </w:tr>
     </w:tbl>
     <w:p>
       <w:pPr>
@@ -8073,6 +8746,95 @@
                 <w:color w:val="16243A"/>
                 <w:sz w:val="18"/>
               </w:rPr>
+              <w:t>고위험 서비스</w:t>
+            </w:r>
+          </w:p>
+        </w:tc>
+        <w:tc>
+          <w:tcPr>
+            <w:tcW w:type="dxa" w:w="2350"/>
+            <w:tcMar>
+              <w:top w:w="80" w:type="dxa"/>
+              <w:start w:w="120" w:type="dxa"/>
+              <w:bottom w:w="80" w:type="dxa"/>
+              <w:end w:w="120" w:type="dxa"/>
+            </w:tcMar>
+            <w:vAlign w:val="center"/>
+          </w:tcPr>
+          <w:p>
+            <w:pPr>
+              <w:spacing w:before="0" w:after="0" w:line="276" w:lineRule="auto"/>
+              <w:jc w:val="left"/>
+            </w:pPr>
+            <w:r/>
+            <w:r>
+              <w:rPr>
+                <w:rFonts w:ascii="Arial Unicode MS" w:hAnsi="Arial Unicode MS" w:eastAsia="Arial Unicode MS"/>
+                <w:b w:val="0"/>
+                <w:color w:val="16243A"/>
+                <w:sz w:val="18"/>
+              </w:rPr>
+              <w:t>SET-04 · VAL-09</w:t>
+            </w:r>
+          </w:p>
+        </w:tc>
+        <w:tc>
+          <w:tcPr>
+            <w:tcW w:type="dxa" w:w="4960"/>
+            <w:tcMar>
+              <w:top w:w="80" w:type="dxa"/>
+              <w:start w:w="120" w:type="dxa"/>
+              <w:bottom w:w="80" w:type="dxa"/>
+              <w:end w:w="120" w:type="dxa"/>
+            </w:tcMar>
+            <w:vAlign w:val="center"/>
+          </w:tcPr>
+          <w:p>
+            <w:pPr>
+              <w:spacing w:before="0" w:after="0" w:line="276" w:lineRule="auto"/>
+              <w:jc w:val="left"/>
+            </w:pPr>
+            <w:r/>
+            <w:r>
+              <w:rPr>
+                <w:rFonts w:ascii="Arial Unicode MS" w:hAnsi="Arial Unicode MS" w:eastAsia="Arial Unicode MS"/>
+                <w:b w:val="0"/>
+                <w:color w:val="16243A"/>
+                <w:sz w:val="18"/>
+              </w:rPr>
+              <w:t>다섯 기준 중 하나라도 해당하면 자동 생성·발행을 막고 판정 근거와 외부 검토 행동을 표시</w:t>
+            </w:r>
+          </w:p>
+        </w:tc>
+      </w:tr>
+      <w:tr>
+        <w:trPr>
+          <w:cantSplit/>
+        </w:trPr>
+        <w:tc>
+          <w:tcPr>
+            <w:tcW w:type="dxa" w:w="2050"/>
+            <w:tcMar>
+              <w:top w:w="80" w:type="dxa"/>
+              <w:start w:w="120" w:type="dxa"/>
+              <w:bottom w:w="80" w:type="dxa"/>
+              <w:end w:w="120" w:type="dxa"/>
+            </w:tcMar>
+            <w:vAlign w:val="center"/>
+          </w:tcPr>
+          <w:p>
+            <w:pPr>
+              <w:spacing w:before="0" w:after="0" w:line="276" w:lineRule="auto"/>
+              <w:jc w:val="left"/>
+            </w:pPr>
+            <w:r/>
+            <w:r>
+              <w:rPr>
+                <w:rFonts w:ascii="Arial Unicode MS" w:hAnsi="Arial Unicode MS" w:eastAsia="Arial Unicode MS"/>
+                <w:b/>
+                <w:color w:val="16243A"/>
+                <w:sz w:val="18"/>
+              </w:rPr>
               <w:t>안전하지 않은 자료</w:t>
             </w:r>
           </w:p>
@@ -8690,7 +9452,7 @@
         <w:color w:val="5E6878"/>
         <w:sz w:val="17"/>
       </w:rPr>
-      <w:t>핵심 기능정의서   ·   FDS-2026-08-v2.0</w:t>
+      <w:t>핵심 기능정의서   ·   FDS-2026-08-v2.1</w:t>
     </w:r>
   </w:p>
 </w:hdr>

</xml_diff>

<commit_message>
docs(spec): clarify FAC input-output flow
</commit_message>
<xml_diff>
--- a/docs/기능정의서.docx
+++ b/docs/기능정의서.docx
@@ -3783,6 +3783,16 @@
         <w:t>C. 처리 사실 추출과 고객 확인</w:t>
       </w:r>
     </w:p>
+    <w:p>
+      <w:r>
+        <w:rPr>
+          <w:rFonts w:ascii="Arial Unicode MS" w:hAnsi="Arial Unicode MS" w:eastAsia="Arial Unicode MS"/>
+          <w:color w:val="16243A"/>
+          <w:sz w:val="22"/>
+        </w:rPr>
+        <w:t>FAC-01~05는 독립된 다섯 여정이 아니라 ‘자료 분석 완료 → 후보 생성 → 검토함 → 건별 확인 → 예외 해결 → 사실 버전 확정’으로 이어지는 하나의 처리 사실 검토·확정 흐름입니다. FAC-01은 시스템 작업, FAC-02~04는 사용자 검토 업무, FAC-05는 검토 완료 액션입니다.</w:t>
+      </w:r>
+    </w:p>
     <w:tbl>
       <w:tblPr>
         <w:tblStyle w:val="TableGrid"/>
@@ -3793,10 +3803,11 @@
         <w:tblInd w:w="120" w:type="dxa"/>
       </w:tblPr>
       <w:tblGrid>
-        <w:gridCol w:w="1350"/>
-        <w:gridCol w:w="1850"/>
-        <w:gridCol w:w="3150"/>
-        <w:gridCol w:w="3010"/>
+        <w:gridCol w:w="1220"/>
+        <w:gridCol w:w="1500"/>
+        <w:gridCol w:w="2050"/>
+        <w:gridCol w:w="2470"/>
+        <w:gridCol w:w="2120"/>
       </w:tblGrid>
       <w:tr>
         <w:trPr>
@@ -3805,7 +3816,7 @@
         </w:trPr>
         <w:tc>
           <w:tcPr>
-            <w:tcW w:type="dxa" w:w="1350"/>
+            <w:tcW w:type="dxa" w:w="1220"/>
             <w:shd w:fill="E8EEF9"/>
             <w:tcMar>
               <w:top w:w="80" w:type="dxa"/>
@@ -3827,15 +3838,17 @@
                 <w:rFonts w:ascii="Arial Unicode MS" w:hAnsi="Arial Unicode MS" w:eastAsia="Arial Unicode MS"/>
                 <w:b/>
                 <w:color w:val="16243A"/>
-                <w:sz w:val="17"/>
+                <w:sz w:val="16"/>
               </w:rPr>
               <w:t>ID·우선</w:t>
+              <w:br/>
+              <w:t>주체</w:t>
             </w:r>
           </w:p>
         </w:tc>
         <w:tc>
           <w:tcPr>
-            <w:tcW w:type="dxa" w:w="1850"/>
+            <w:tcW w:type="dxa" w:w="1500"/>
             <w:shd w:fill="E8EEF9"/>
             <w:tcMar>
               <w:top w:w="80" w:type="dxa"/>
@@ -3857,7 +3870,7 @@
                 <w:rFonts w:ascii="Arial Unicode MS" w:hAnsi="Arial Unicode MS" w:eastAsia="Arial Unicode MS"/>
                 <w:b/>
                 <w:color w:val="16243A"/>
-                <w:sz w:val="17"/>
+                <w:sz w:val="16"/>
               </w:rPr>
               <w:t>기능</w:t>
             </w:r>
@@ -3865,7 +3878,7 @@
         </w:tc>
         <w:tc>
           <w:tcPr>
-            <w:tcW w:type="dxa" w:w="3150"/>
+            <w:tcW w:type="dxa" w:w="2050"/>
             <w:shd w:fill="E8EEF9"/>
             <w:tcMar>
               <w:top w:w="80" w:type="dxa"/>
@@ -3887,15 +3900,15 @@
                 <w:rFonts w:ascii="Arial Unicode MS" w:hAnsi="Arial Unicode MS" w:eastAsia="Arial Unicode MS"/>
                 <w:b/>
                 <w:color w:val="16243A"/>
-                <w:sz w:val="17"/>
+                <w:sz w:val="16"/>
               </w:rPr>
-              <w:t>동작·결과</w:t>
+              <w:t>Input</w:t>
             </w:r>
           </w:p>
         </w:tc>
         <w:tc>
           <w:tcPr>
-            <w:tcW w:type="dxa" w:w="3010"/>
+            <w:tcW w:type="dxa" w:w="2470"/>
             <w:shd w:fill="E8EEF9"/>
             <w:tcMar>
               <w:top w:w="80" w:type="dxa"/>
@@ -3917,9 +3930,39 @@
                 <w:rFonts w:ascii="Arial Unicode MS" w:hAnsi="Arial Unicode MS" w:eastAsia="Arial Unicode MS"/>
                 <w:b/>
                 <w:color w:val="16243A"/>
-                <w:sz w:val="17"/>
+                <w:sz w:val="16"/>
               </w:rPr>
-              <w:t>완료조건</w:t>
+              <w:t>처리·사용자 행동</w:t>
+            </w:r>
+          </w:p>
+        </w:tc>
+        <w:tc>
+          <w:tcPr>
+            <w:tcW w:type="dxa" w:w="2120"/>
+            <w:shd w:fill="E8EEF9"/>
+            <w:tcMar>
+              <w:top w:w="80" w:type="dxa"/>
+              <w:start w:w="120" w:type="dxa"/>
+              <w:bottom w:w="80" w:type="dxa"/>
+              <w:end w:w="120" w:type="dxa"/>
+            </w:tcMar>
+            <w:vAlign w:val="center"/>
+          </w:tcPr>
+          <w:p>
+            <w:pPr>
+              <w:keepNext/>
+              <w:spacing w:before="0" w:after="0" w:line="276" w:lineRule="auto"/>
+              <w:jc w:val="left"/>
+            </w:pPr>
+            <w:r/>
+            <w:r>
+              <w:rPr>
+                <w:rFonts w:ascii="Arial Unicode MS" w:hAnsi="Arial Unicode MS" w:eastAsia="Arial Unicode MS"/>
+                <w:b/>
+                <w:color w:val="16243A"/>
+                <w:sz w:val="16"/>
+              </w:rPr>
+              <w:t>Output·다음 단계</w:t>
             </w:r>
           </w:p>
         </w:tc>
@@ -3930,7 +3973,7 @@
         </w:trPr>
         <w:tc>
           <w:tcPr>
-            <w:tcW w:type="dxa" w:w="1350"/>
+            <w:tcW w:type="dxa" w:w="1220"/>
             <w:tcMar>
               <w:top w:w="80" w:type="dxa"/>
               <w:start w:w="120" w:type="dxa"/>
@@ -3950,15 +3993,17 @@
                 <w:rFonts w:ascii="Arial Unicode MS" w:hAnsi="Arial Unicode MS" w:eastAsia="Arial Unicode MS"/>
                 <w:b/>
                 <w:color w:val="16243A"/>
-                <w:sz w:val="17"/>
+                <w:sz w:val="16"/>
               </w:rPr>
               <w:t>FAC-01 · MVP</w:t>
+              <w:br/>
+              <w:t>시스템</w:t>
             </w:r>
           </w:p>
         </w:tc>
         <w:tc>
           <w:tcPr>
-            <w:tcW w:type="dxa" w:w="1850"/>
+            <w:tcW w:type="dxa" w:w="1500"/>
             <w:tcMar>
               <w:top w:w="80" w:type="dxa"/>
               <w:start w:w="120" w:type="dxa"/>
@@ -3978,15 +4023,15 @@
                 <w:rFonts w:ascii="Arial Unicode MS" w:hAnsi="Arial Unicode MS" w:eastAsia="Arial Unicode MS"/>
                 <w:b w:val="0"/>
                 <w:color w:val="16243A"/>
-                <w:sz w:val="17"/>
+                <w:sz w:val="16"/>
               </w:rPr>
-              <w:t>사실 후보와 근거 추출</w:t>
+              <w:t>사실 후보 자동 추출</w:t>
             </w:r>
           </w:p>
         </w:tc>
         <w:tc>
           <w:tcPr>
-            <w:tcW w:type="dxa" w:w="3150"/>
+            <w:tcW w:type="dxa" w:w="2050"/>
             <w:tcMar>
               <w:top w:w="80" w:type="dxa"/>
               <w:start w:w="120" w:type="dxa"/>
@@ -4006,15 +4051,15 @@
                 <w:rFonts w:ascii="Arial Unicode MS" w:hAnsi="Arial Unicode MS" w:eastAsia="Arial Unicode MS"/>
                 <w:b w:val="0"/>
                 <w:color w:val="16243A"/>
-                <w:sz w:val="17"/>
+                <w:sz w:val="16"/>
               </w:rPr>
-              <w:t>자료에서 수집 항목·목적·보유·제공·위탁·국외이전 후보와 근거 위치를 찾는다.</w:t>
+              <w:t>안전검사를 통과한 URL·PRD·기능명세·공급업체 자료, 적용할 추출 버전</w:t>
             </w:r>
           </w:p>
         </w:tc>
         <w:tc>
           <w:tcPr>
-            <w:tcW w:type="dxa" w:w="3010"/>
+            <w:tcW w:type="dxa" w:w="2470"/>
             <w:tcMar>
               <w:top w:w="80" w:type="dxa"/>
               <w:start w:w="120" w:type="dxa"/>
@@ -4034,9 +4079,37 @@
                 <w:rFonts w:ascii="Arial Unicode MS" w:hAnsi="Arial Unicode MS" w:eastAsia="Arial Unicode MS"/>
                 <w:b w:val="0"/>
                 <w:color w:val="16243A"/>
-                <w:sz w:val="17"/>
+                <w:sz w:val="16"/>
               </w:rPr>
-              <w:t>모든 후보에 출처, 근거 위치, 추출 버전이 연결된다.</w:t>
+              <w:t>수집 항목·목적·보유·제공·위탁·국외이전 후보와 원문 근거 위치를 추출</w:t>
+            </w:r>
+          </w:p>
+        </w:tc>
+        <w:tc>
+          <w:tcPr>
+            <w:tcW w:type="dxa" w:w="2120"/>
+            <w:tcMar>
+              <w:top w:w="80" w:type="dxa"/>
+              <w:start w:w="120" w:type="dxa"/>
+              <w:bottom w:w="80" w:type="dxa"/>
+              <w:end w:w="120" w:type="dxa"/>
+            </w:tcMar>
+            <w:vAlign w:val="center"/>
+          </w:tcPr>
+          <w:p>
+            <w:pPr>
+              <w:spacing w:before="0" w:after="0" w:line="276" w:lineRule="auto"/>
+              <w:jc w:val="left"/>
+            </w:pPr>
+            <w:r/>
+            <w:r>
+              <w:rPr>
+                <w:rFonts w:ascii="Arial Unicode MS" w:hAnsi="Arial Unicode MS" w:eastAsia="Arial Unicode MS"/>
+                <w:b w:val="0"/>
+                <w:color w:val="16243A"/>
+                <w:sz w:val="16"/>
+              </w:rPr>
+              <w:t>출처·근거 위치·신뢰도·추출 버전이 연결된 사실 후보 묶음 → FAC-02</w:t>
             </w:r>
           </w:p>
         </w:tc>
@@ -4047,7 +4120,7 @@
         </w:trPr>
         <w:tc>
           <w:tcPr>
-            <w:tcW w:type="dxa" w:w="1350"/>
+            <w:tcW w:type="dxa" w:w="1220"/>
             <w:tcMar>
               <w:top w:w="80" w:type="dxa"/>
               <w:start w:w="120" w:type="dxa"/>
@@ -4067,15 +4140,17 @@
                 <w:rFonts w:ascii="Arial Unicode MS" w:hAnsi="Arial Unicode MS" w:eastAsia="Arial Unicode MS"/>
                 <w:b/>
                 <w:color w:val="16243A"/>
-                <w:sz w:val="17"/>
+                <w:sz w:val="16"/>
               </w:rPr>
               <w:t>FAC-02 · MVP</w:t>
+              <w:br/>
+              <w:t>사용자</w:t>
             </w:r>
           </w:p>
         </w:tc>
         <w:tc>
           <w:tcPr>
-            <w:tcW w:type="dxa" w:w="1850"/>
+            <w:tcW w:type="dxa" w:w="1500"/>
             <w:tcMar>
               <w:top w:w="80" w:type="dxa"/>
               <w:start w:w="120" w:type="dxa"/>
@@ -4095,15 +4170,15 @@
                 <w:rFonts w:ascii="Arial Unicode MS" w:hAnsi="Arial Unicode MS" w:eastAsia="Arial Unicode MS"/>
                 <w:b w:val="0"/>
                 <w:color w:val="16243A"/>
-                <w:sz w:val="17"/>
+                <w:sz w:val="16"/>
               </w:rPr>
-              <w:t>확인 대기열</w:t>
+              <w:t>처리 사실 검토함</w:t>
             </w:r>
           </w:p>
         </w:tc>
         <w:tc>
           <w:tcPr>
-            <w:tcW w:type="dxa" w:w="3150"/>
+            <w:tcW w:type="dxa" w:w="2050"/>
             <w:tcMar>
               <w:top w:w="80" w:type="dxa"/>
               <w:start w:w="120" w:type="dxa"/>
@@ -4123,15 +4198,15 @@
                 <w:rFonts w:ascii="Arial Unicode MS" w:hAnsi="Arial Unicode MS" w:eastAsia="Arial Unicode MS"/>
                 <w:b w:val="0"/>
                 <w:color w:val="16243A"/>
-                <w:sz w:val="17"/>
+                <w:sz w:val="16"/>
               </w:rPr>
-              <w:t>후보를 확인 필요·높은 영향·낮은 신뢰도 순으로 정리한다.</w:t>
+              <w:t>FAC-01의 사실 후보, 확인 상태, 신뢰도, 문서 발행 영향도</w:t>
             </w:r>
           </w:p>
         </w:tc>
         <w:tc>
           <w:tcPr>
-            <w:tcW w:type="dxa" w:w="3010"/>
+            <w:tcW w:type="dxa" w:w="2470"/>
             <w:tcMar>
               <w:top w:w="80" w:type="dxa"/>
               <w:start w:w="120" w:type="dxa"/>
@@ -4151,9 +4226,37 @@
                 <w:rFonts w:ascii="Arial Unicode MS" w:hAnsi="Arial Unicode MS" w:eastAsia="Arial Unicode MS"/>
                 <w:b w:val="0"/>
                 <w:color w:val="16243A"/>
-                <w:sz w:val="17"/>
+                <w:sz w:val="16"/>
               </w:rPr>
-              <w:t>상태와 신뢰도를 색상 이외의 텍스트로 표시하고 다음 행동을 제시한다.</w:t>
+              <w:t>사용자가 확인 필요·높은 영향·낮은 신뢰도 기준으로 정렬·필터하고 후보를 선택</w:t>
+            </w:r>
+          </w:p>
+        </w:tc>
+        <w:tc>
+          <w:tcPr>
+            <w:tcW w:type="dxa" w:w="2120"/>
+            <w:tcMar>
+              <w:top w:w="80" w:type="dxa"/>
+              <w:start w:w="120" w:type="dxa"/>
+              <w:bottom w:w="80" w:type="dxa"/>
+              <w:end w:w="120" w:type="dxa"/>
+            </w:tcMar>
+            <w:vAlign w:val="center"/>
+          </w:tcPr>
+          <w:p>
+            <w:pPr>
+              <w:spacing w:before="0" w:after="0" w:line="276" w:lineRule="auto"/>
+              <w:jc w:val="left"/>
+            </w:pPr>
+            <w:r/>
+            <w:r>
+              <w:rPr>
+                <w:rFonts w:ascii="Arial Unicode MS" w:hAnsi="Arial Unicode MS" w:eastAsia="Arial Unicode MS"/>
+                <w:b w:val="0"/>
+                <w:color w:val="16243A"/>
+                <w:sz w:val="16"/>
+              </w:rPr>
+              <w:t>우선순위가 표시된 검토 목록과 선택한 후보 ID → FAC-03</w:t>
             </w:r>
           </w:p>
         </w:tc>
@@ -4164,7 +4267,7 @@
         </w:trPr>
         <w:tc>
           <w:tcPr>
-            <w:tcW w:type="dxa" w:w="1350"/>
+            <w:tcW w:type="dxa" w:w="1220"/>
             <w:tcMar>
               <w:top w:w="80" w:type="dxa"/>
               <w:start w:w="120" w:type="dxa"/>
@@ -4184,15 +4287,17 @@
                 <w:rFonts w:ascii="Arial Unicode MS" w:hAnsi="Arial Unicode MS" w:eastAsia="Arial Unicode MS"/>
                 <w:b/>
                 <w:color w:val="16243A"/>
-                <w:sz w:val="17"/>
+                <w:sz w:val="16"/>
               </w:rPr>
               <w:t>FAC-03 · MVP</w:t>
+              <w:br/>
+              <w:t>사용자</w:t>
             </w:r>
           </w:p>
         </w:tc>
         <w:tc>
           <w:tcPr>
-            <w:tcW w:type="dxa" w:w="1850"/>
+            <w:tcW w:type="dxa" w:w="1500"/>
             <w:tcMar>
               <w:top w:w="80" w:type="dxa"/>
               <w:start w:w="120" w:type="dxa"/>
@@ -4212,15 +4317,15 @@
                 <w:rFonts w:ascii="Arial Unicode MS" w:hAnsi="Arial Unicode MS" w:eastAsia="Arial Unicode MS"/>
                 <w:b w:val="0"/>
                 <w:color w:val="16243A"/>
-                <w:sz w:val="17"/>
+                <w:sz w:val="16"/>
               </w:rPr>
-              <w:t>고객 확인</w:t>
+              <w:t>사실 후보 확인·수정</w:t>
             </w:r>
           </w:p>
         </w:tc>
         <w:tc>
           <w:tcPr>
-            <w:tcW w:type="dxa" w:w="3150"/>
+            <w:tcW w:type="dxa" w:w="2050"/>
             <w:tcMar>
               <w:top w:w="80" w:type="dxa"/>
               <w:start w:w="120" w:type="dxa"/>
@@ -4240,15 +4345,15 @@
                 <w:rFonts w:ascii="Arial Unicode MS" w:hAnsi="Arial Unicode MS" w:eastAsia="Arial Unicode MS"/>
                 <w:b w:val="0"/>
                 <w:color w:val="16243A"/>
-                <w:sz w:val="17"/>
+                <w:sz w:val="16"/>
               </w:rPr>
-              <w:t>사용자는 후보를 확인·수정·해당 없음 처리한다.</w:t>
+              <w:t>선택한 후보, 원문 근거, 기존 확정 값, 관련 자료</w:t>
             </w:r>
           </w:p>
         </w:tc>
         <w:tc>
           <w:tcPr>
-            <w:tcW w:type="dxa" w:w="3010"/>
+            <w:tcW w:type="dxa" w:w="2470"/>
             <w:tcMar>
               <w:top w:w="80" w:type="dxa"/>
               <w:start w:w="120" w:type="dxa"/>
@@ -4268,9 +4373,37 @@
                 <w:rFonts w:ascii="Arial Unicode MS" w:hAnsi="Arial Unicode MS" w:eastAsia="Arial Unicode MS"/>
                 <w:b w:val="0"/>
                 <w:color w:val="16243A"/>
-                <w:sz w:val="17"/>
+                <w:sz w:val="16"/>
               </w:rPr>
-              <w:t>확인자·시각·수정 전후 값·사유가 기록되고 미확인 값은 확정 사실이 되지 않는다.</w:t>
+              <w:t>사용자가 확인·수정·해당 없음·보류 중 하나를 선택하고 필요하면 사유를 입력</w:t>
+            </w:r>
+          </w:p>
+        </w:tc>
+        <w:tc>
+          <w:tcPr>
+            <w:tcW w:type="dxa" w:w="2120"/>
+            <w:tcMar>
+              <w:top w:w="80" w:type="dxa"/>
+              <w:start w:w="120" w:type="dxa"/>
+              <w:bottom w:w="80" w:type="dxa"/>
+              <w:end w:w="120" w:type="dxa"/>
+            </w:tcMar>
+            <w:vAlign w:val="center"/>
+          </w:tcPr>
+          <w:p>
+            <w:pPr>
+              <w:spacing w:before="0" w:after="0" w:line="276" w:lineRule="auto"/>
+              <w:jc w:val="left"/>
+            </w:pPr>
+            <w:r/>
+            <w:r>
+              <w:rPr>
+                <w:rFonts w:ascii="Arial Unicode MS" w:hAnsi="Arial Unicode MS" w:eastAsia="Arial Unicode MS"/>
+                <w:b w:val="0"/>
+                <w:color w:val="16243A"/>
+                <w:sz w:val="16"/>
+              </w:rPr>
+              <w:t>결정 상태·확정 값·근거·확인자·시각·수정 사유 → 목록 반복 또는 FAC-04</w:t>
             </w:r>
           </w:p>
         </w:tc>
@@ -4281,7 +4414,7 @@
         </w:trPr>
         <w:tc>
           <w:tcPr>
-            <w:tcW w:type="dxa" w:w="1350"/>
+            <w:tcW w:type="dxa" w:w="1220"/>
             <w:tcMar>
               <w:top w:w="80" w:type="dxa"/>
               <w:start w:w="120" w:type="dxa"/>
@@ -4301,15 +4434,17 @@
                 <w:rFonts w:ascii="Arial Unicode MS" w:hAnsi="Arial Unicode MS" w:eastAsia="Arial Unicode MS"/>
                 <w:b/>
                 <w:color w:val="16243A"/>
-                <w:sz w:val="17"/>
+                <w:sz w:val="16"/>
               </w:rPr>
               <w:t>FAC-04 · MVP</w:t>
+              <w:br/>
+              <w:t>시스템+사용자</w:t>
             </w:r>
           </w:p>
         </w:tc>
         <w:tc>
           <w:tcPr>
-            <w:tcW w:type="dxa" w:w="1850"/>
+            <w:tcW w:type="dxa" w:w="1500"/>
             <w:tcMar>
               <w:top w:w="80" w:type="dxa"/>
               <w:start w:w="120" w:type="dxa"/>
@@ -4329,15 +4464,15 @@
                 <w:rFonts w:ascii="Arial Unicode MS" w:hAnsi="Arial Unicode MS" w:eastAsia="Arial Unicode MS"/>
                 <w:b w:val="0"/>
                 <w:color w:val="16243A"/>
-                <w:sz w:val="17"/>
+                <w:sz w:val="16"/>
               </w:rPr>
-              <w:t>누락·모순 확인</w:t>
+              <w:t>누락·충돌 해결</w:t>
             </w:r>
           </w:p>
         </w:tc>
         <w:tc>
           <w:tcPr>
-            <w:tcW w:type="dxa" w:w="3150"/>
+            <w:tcW w:type="dxa" w:w="2050"/>
             <w:tcMar>
               <w:top w:w="80" w:type="dxa"/>
               <w:start w:w="120" w:type="dxa"/>
@@ -4357,15 +4492,15 @@
                 <w:rFonts w:ascii="Arial Unicode MS" w:hAnsi="Arial Unicode MS" w:eastAsia="Arial Unicode MS"/>
                 <w:b w:val="0"/>
                 <w:color w:val="16243A"/>
-                <w:sz w:val="17"/>
+                <w:sz w:val="16"/>
               </w:rPr>
-              <w:t>자료 간 또는 후보와 기존 확정 사실 간 충돌을 찾는다.</w:t>
+              <w:t>후보별 결정 결과, 자료 간 값, 기존 확정 사실, 문서 생성 필수 항목</w:t>
             </w:r>
           </w:p>
         </w:tc>
         <w:tc>
           <w:tcPr>
-            <w:tcW w:type="dxa" w:w="3010"/>
+            <w:tcW w:type="dxa" w:w="2470"/>
             <w:tcMar>
               <w:top w:w="80" w:type="dxa"/>
               <w:start w:w="120" w:type="dxa"/>
@@ -4385,9 +4520,37 @@
                 <w:rFonts w:ascii="Arial Unicode MS" w:hAnsi="Arial Unicode MS" w:eastAsia="Arial Unicode MS"/>
                 <w:b w:val="0"/>
                 <w:color w:val="16243A"/>
-                <w:sz w:val="17"/>
+                <w:sz w:val="16"/>
               </w:rPr>
-              <w:t>충돌한 값을 함께 보여주고 해결 전 관련 문서의 공개 발행을 막는다.</w:t>
+              <w:t>시스템이 누락·충돌을 탐지하고 사용자가 올바른 값을 선택·수정한 뒤 해결 사유를 입력</w:t>
+            </w:r>
+          </w:p>
+        </w:tc>
+        <w:tc>
+          <w:tcPr>
+            <w:tcW w:type="dxa" w:w="2120"/>
+            <w:tcMar>
+              <w:top w:w="80" w:type="dxa"/>
+              <w:start w:w="120" w:type="dxa"/>
+              <w:bottom w:w="80" w:type="dxa"/>
+              <w:end w:w="120" w:type="dxa"/>
+            </w:tcMar>
+            <w:vAlign w:val="center"/>
+          </w:tcPr>
+          <w:p>
+            <w:pPr>
+              <w:spacing w:before="0" w:after="0" w:line="276" w:lineRule="auto"/>
+              <w:jc w:val="left"/>
+            </w:pPr>
+            <w:r/>
+            <w:r>
+              <w:rPr>
+                <w:rFonts w:ascii="Arial Unicode MS" w:hAnsi="Arial Unicode MS" w:eastAsia="Arial Unicode MS"/>
+                <w:b w:val="0"/>
+                <w:color w:val="16243A"/>
+                <w:sz w:val="16"/>
+              </w:rPr>
+              <w:t>해결된 사실 또는 미해결 차단 항목; 차단 항목이 없으면 FAC-05</w:t>
             </w:r>
           </w:p>
         </w:tc>
@@ -4398,7 +4561,7 @@
         </w:trPr>
         <w:tc>
           <w:tcPr>
-            <w:tcW w:type="dxa" w:w="1350"/>
+            <w:tcW w:type="dxa" w:w="1220"/>
             <w:tcMar>
               <w:top w:w="80" w:type="dxa"/>
               <w:start w:w="120" w:type="dxa"/>
@@ -4418,15 +4581,17 @@
                 <w:rFonts w:ascii="Arial Unicode MS" w:hAnsi="Arial Unicode MS" w:eastAsia="Arial Unicode MS"/>
                 <w:b/>
                 <w:color w:val="16243A"/>
-                <w:sz w:val="17"/>
+                <w:sz w:val="16"/>
               </w:rPr>
               <w:t>FAC-05 · MVP</w:t>
+              <w:br/>
+              <w:t>사용자+시스템</w:t>
             </w:r>
           </w:p>
         </w:tc>
         <w:tc>
           <w:tcPr>
-            <w:tcW w:type="dxa" w:w="1850"/>
+            <w:tcW w:type="dxa" w:w="1500"/>
             <w:tcMar>
               <w:top w:w="80" w:type="dxa"/>
               <w:start w:w="120" w:type="dxa"/>
@@ -4446,15 +4611,15 @@
                 <w:rFonts w:ascii="Arial Unicode MS" w:hAnsi="Arial Unicode MS" w:eastAsia="Arial Unicode MS"/>
                 <w:b w:val="0"/>
                 <w:color w:val="16243A"/>
-                <w:sz w:val="17"/>
+                <w:sz w:val="16"/>
               </w:rPr>
-              <w:t>공통 처리정보 원장</w:t>
+              <w:t>검토 완료·사실 버전 확정</w:t>
             </w:r>
           </w:p>
         </w:tc>
         <w:tc>
           <w:tcPr>
-            <w:tcW w:type="dxa" w:w="3150"/>
+            <w:tcW w:type="dxa" w:w="2050"/>
             <w:tcMar>
               <w:top w:w="80" w:type="dxa"/>
               <w:start w:w="120" w:type="dxa"/>
@@ -4474,15 +4639,15 @@
                 <w:rFonts w:ascii="Arial Unicode MS" w:hAnsi="Arial Unicode MS" w:eastAsia="Arial Unicode MS"/>
                 <w:b w:val="0"/>
                 <w:color w:val="16243A"/>
-                <w:sz w:val="17"/>
+                <w:sz w:val="16"/>
               </w:rPr>
-              <w:t>확인된 사실을 국가 문서가 공통으로 참조하는 리비전으로 고정한다.</w:t>
+              <w:t>필수 후보 결정 완료, 미해결 충돌 없음, 사용자의 ‘검토 완료’ 실행</w:t>
             </w:r>
           </w:p>
         </w:tc>
         <w:tc>
           <w:tcPr>
-            <w:tcW w:type="dxa" w:w="3010"/>
+            <w:tcW w:type="dxa" w:w="2470"/>
             <w:tcMar>
               <w:top w:w="80" w:type="dxa"/>
               <w:start w:w="120" w:type="dxa"/>
@@ -4502,9 +4667,37 @@
                 <w:rFonts w:ascii="Arial Unicode MS" w:hAnsi="Arial Unicode MS" w:eastAsia="Arial Unicode MS"/>
                 <w:b w:val="0"/>
                 <w:color w:val="16243A"/>
-                <w:sz w:val="17"/>
+                <w:sz w:val="16"/>
               </w:rPr>
-              <w:t>사실 변경 시 새 리비전을 만들고 기존 발행본의 근거는 보존한다.</w:t>
+              <w:t>시스템이 확인된 사실·근거·확정자·시각을 묶어 수정 불가능한 새 리비전을 생성</w:t>
+            </w:r>
+          </w:p>
+        </w:tc>
+        <w:tc>
+          <w:tcPr>
+            <w:tcW w:type="dxa" w:w="2120"/>
+            <w:tcMar>
+              <w:top w:w="80" w:type="dxa"/>
+              <w:start w:w="120" w:type="dxa"/>
+              <w:bottom w:w="80" w:type="dxa"/>
+              <w:end w:w="120" w:type="dxa"/>
+            </w:tcMar>
+            <w:vAlign w:val="center"/>
+          </w:tcPr>
+          <w:p>
+            <w:pPr>
+              <w:spacing w:before="0" w:after="0" w:line="276" w:lineRule="auto"/>
+              <w:jc w:val="left"/>
+            </w:pPr>
+            <w:r/>
+            <w:r>
+              <w:rPr>
+                <w:rFonts w:ascii="Arial Unicode MS" w:hAnsi="Arial Unicode MS" w:eastAsia="Arial Unicode MS"/>
+                <w:b w:val="0"/>
+                <w:color w:val="16243A"/>
+                <w:sz w:val="16"/>
+              </w:rPr>
+              <w:t>문서 생성 가능 상태의 사실 버전 ID → DOC-01·02; 이후 변경은 새 리비전 생성</w:t>
             </w:r>
           </w:p>
         </w:tc>
@@ -6736,6 +6929,11 @@
       </w:pPr>
     </w:p>
     <w:p>
+      <w:r>
+        <w:br w:type="page"/>
+      </w:r>
+    </w:p>
+    <w:p>
       <w:pPr>
         <w:pStyle w:val="Heading1"/>
       </w:pPr>
@@ -7669,6 +7867,11 @@
       <w:pPr>
         <w:spacing w:before="80" w:after="0"/>
       </w:pPr>
+    </w:p>
+    <w:p>
+      <w:r>
+        <w:br w:type="page"/>
+      </w:r>
     </w:p>
     <w:p>
       <w:pPr>
@@ -9452,7 +9655,7 @@
         <w:color w:val="5E6878"/>
         <w:sz w:val="17"/>
       </w:rPr>
-      <w:t>핵심 기능정의서   ·   FDS-2026-08-v2.1</w:t>
+      <w:t>핵심 기능정의서   ·   FDS-2026-08-v2.2</w:t>
     </w:r>
   </w:p>
 </w:hdr>

</xml_diff>

<commit_message>
docs: define authoring-time legal source retrieval
</commit_message>
<xml_diff>
--- a/docs/기능정의서.docx
+++ b/docs/기능정의서.docx
@@ -547,7 +547,7 @@
                 <w:color w:val="16243A"/>
                 <w:sz w:val="20"/>
               </w:rPr>
-              <w:t>실제 최종사용자 개인정보는 입력받지 않습니다. 미확인 사실과 미승인 조항은 공개 문서에 반영하지 않습니다. 법률 변경은 사람이 판단하며 고객 승인 없이 자동 발행하지 않습니다.</w:t>
+              <w:t>실제 최종사용자 개인정보는 입력받지 않습니다. 문서 작성 시 공식 법령·지침을 조회하지만 법적 의미와 적용 여부는 사람이 판단합니다. 미확인 사실과 미승인 조항은 공개 문서에 반영하지 않고 고객 승인 없이 자동 발행하지 않습니다.</w:t>
             </w:r>
           </w:p>
         </w:tc>
@@ -1200,7 +1200,7 @@
                 <w:color w:val="16243A"/>
                 <w:sz w:val="17"/>
               </w:rPr>
-              <w:t>승인 규칙으로 4개 독립 초안 생성</w:t>
+              <w:t>작성 시점 공식 법령·지침 조회 후 4개 독립 초안 생성</w:t>
             </w:r>
           </w:p>
         </w:tc>
@@ -1228,7 +1228,7 @@
                 <w:color w:val="16243A"/>
                 <w:sz w:val="17"/>
               </w:rPr>
-              <w:t>차이·근거·차단항목 표시</w:t>
+              <w:t>출처·차이·근거·차단항목 표시</w:t>
             </w:r>
           </w:p>
         </w:tc>
@@ -1705,7 +1705,7 @@
                 <w:color w:val="16243A"/>
                 <w:sz w:val="18"/>
               </w:rPr>
-              <w:t>안전한 자료 입력·사실 확인·4개 관할 문서 생성</w:t>
+              <w:t>안전한 자료 입력·사실 확인·작성 시점 공식 법령·지침 조회</w:t>
             </w:r>
           </w:p>
         </w:tc>
@@ -1733,7 +1733,68 @@
                 <w:color w:val="16243A"/>
                 <w:sz w:val="18"/>
               </w:rPr>
-              <w:t>자동 법률 출처 모니터링·영향 알림</w:t>
+              <w:t>정기 자동 법률 출처 모니터링·영향 알림</w:t>
+            </w:r>
+          </w:p>
+        </w:tc>
+      </w:tr>
+      <w:tr>
+        <w:trPr>
+          <w:cantSplit/>
+        </w:trPr>
+        <w:tc>
+          <w:tcPr>
+            <w:tcW w:type="dxa" w:w="4680"/>
+            <w:tcMar>
+              <w:top w:w="80" w:type="dxa"/>
+              <w:start w:w="120" w:type="dxa"/>
+              <w:bottom w:w="80" w:type="dxa"/>
+              <w:end w:w="120" w:type="dxa"/>
+            </w:tcMar>
+            <w:vAlign w:val="center"/>
+          </w:tcPr>
+          <w:p>
+            <w:pPr>
+              <w:spacing w:before="0" w:after="0" w:line="276" w:lineRule="auto"/>
+              <w:jc w:val="left"/>
+            </w:pPr>
+            <w:r/>
+            <w:r>
+              <w:rPr>
+                <w:rFonts w:ascii="Arial Unicode MS" w:hAnsi="Arial Unicode MS" w:eastAsia="Arial Unicode MS"/>
+                <w:b w:val="0"/>
+                <w:color w:val="16243A"/>
+                <w:sz w:val="18"/>
+              </w:rPr>
+              <w:t>공식 출처 스냅샷·4개 관할 문서 생성</w:t>
+            </w:r>
+          </w:p>
+        </w:tc>
+        <w:tc>
+          <w:tcPr>
+            <w:tcW w:type="dxa" w:w="4680"/>
+            <w:tcMar>
+              <w:top w:w="80" w:type="dxa"/>
+              <w:start w:w="120" w:type="dxa"/>
+              <w:bottom w:w="80" w:type="dxa"/>
+              <w:end w:w="120" w:type="dxa"/>
+            </w:tcMar>
+            <w:vAlign w:val="center"/>
+          </w:tcPr>
+          <w:p>
+            <w:pPr>
+              <w:spacing w:before="0" w:after="0" w:line="276" w:lineRule="auto"/>
+              <w:jc w:val="left"/>
+            </w:pPr>
+            <w:r/>
+            <w:r>
+              <w:rPr>
+                <w:rFonts w:ascii="Arial Unicode MS" w:hAnsi="Arial Unicode MS" w:eastAsia="Arial Unicode MS"/>
+                <w:b w:val="0"/>
+                <w:color w:val="16243A"/>
+                <w:sz w:val="18"/>
+              </w:rPr>
+              <w:t>외부 변호사 검수 상품·결제·환불</w:t>
             </w:r>
           </w:p>
         </w:tc>
@@ -1794,7 +1855,7 @@
                 <w:color w:val="16243A"/>
                 <w:sz w:val="18"/>
               </w:rPr>
-              <w:t>외부 변호사 검수 상품·결제·환불</w:t>
+              <w:t>임베드·다중 사용자 권한·추가 국가</w:t>
             </w:r>
           </w:p>
         </w:tc>
@@ -1855,7 +1916,7 @@
                 <w:color w:val="16243A"/>
                 <w:sz w:val="18"/>
               </w:rPr>
-              <w:t>임베드·다중 사용자 권한·추가 국가</w:t>
+              <w:t>쿠키 동의·이용약관·계약서·웹 자동 스캔</w:t>
             </w:r>
           </w:p>
         </w:tc>
@@ -1916,7 +1977,7 @@
                 <w:color w:val="16243A"/>
                 <w:sz w:val="18"/>
               </w:rPr>
-              <w:t>쿠키 동의·이용약관·계약서·웹 자동 스캔</w:t>
+              <w:t>가격·플랜·결제·환불</w:t>
             </w:r>
           </w:p>
         </w:tc>
@@ -4913,7 +4974,7 @@
                 <w:color w:val="16243A"/>
                 <w:sz w:val="17"/>
               </w:rPr>
-              <w:t>승인 규칙·조항 선택</w:t>
+              <w:t>작성 시점 법령·지침 조회</w:t>
             </w:r>
           </w:p>
         </w:tc>
@@ -4941,7 +5002,7 @@
                 <w:color w:val="16243A"/>
                 <w:sz w:val="17"/>
               </w:rPr>
-              <w:t>목표 국가와 확정 사실에 맞는 승인된 규칙·조항 버전을 선택한다.</w:t>
+              <w:t>문서 생성 요청 시 목표 국가의 공식 법령·지침 공개본을 조회한다.</w:t>
             </w:r>
           </w:p>
         </w:tc>
@@ -4969,7 +5030,7 @@
                 <w:color w:val="16243A"/>
                 <w:sz w:val="17"/>
               </w:rPr>
-              <w:t>미승인·만료 조항이나 자유 생성 문장은 공개 초안에 넣지 않는다.</w:t>
+              <w:t>출처 URL·조회 시각·원문 해시·법률 기준일을 스냅샷으로 기록하고 조회·검증 실패 시 해당 국가 초안 생성을 차단한다.</w:t>
             </w:r>
           </w:p>
         </w:tc>
@@ -5058,7 +5119,7 @@
                 <w:color w:val="16243A"/>
                 <w:sz w:val="17"/>
               </w:rPr>
-              <w:t>대한민국·캘리포니아·일본·싱가포르 개인정보처리방침과 짧은 고지문을 각각 생성한다.</w:t>
+              <w:t>확정 사실과 작성 시점에 조회한 국가별 법령·공식 지침을 함께 입력으로 사용하고, 승인된 규칙·조항을 적용해 4개 관할 문서를 각각 생성한다.</w:t>
             </w:r>
           </w:p>
         </w:tc>
@@ -5086,7 +5147,7 @@
                 <w:color w:val="16243A"/>
                 <w:sz w:val="17"/>
               </w:rPr>
-              <w:t>국가마다 독립 문서 ID·상태·버전·법률 기준일을 가진다.</w:t>
+              <w:t>국가마다 독립 문서 ID·상태·버전·법률 기준일·출처 스냅샷 ID를 가진다.</w:t>
             </w:r>
           </w:p>
         </w:tc>
@@ -5175,7 +5236,7 @@
                 <w:color w:val="16243A"/>
                 <w:sz w:val="17"/>
               </w:rPr>
-              <w:t>국가별 추가·차이 조항과 사용한 사실·규칙·조항을 보여준다.</w:t>
+              <w:t>국가별 추가·차이 조항과 사용한 사실·법령·지침·규칙·조항을 보여준다.</w:t>
             </w:r>
           </w:p>
         </w:tc>
@@ -5203,7 +5264,7 @@
                 <w:color w:val="16243A"/>
                 <w:sz w:val="17"/>
               </w:rPr>
-              <w:t>핵심 조항에서 근거 사실과 승인 조항 버전을 역추적할 수 있다.</w:t>
+              <w:t>핵심 조항에서 근거 사실, 공식 출처 스냅샷, 승인 조항 버전을 역추적할 수 있다.</w:t>
             </w:r>
           </w:p>
         </w:tc>
@@ -5292,7 +5353,7 @@
                 <w:color w:val="16243A"/>
                 <w:sz w:val="17"/>
               </w:rPr>
-              <w:t>누락·모순·미확인·비승인 규칙을 검사하고 워터마크된 초안을 미리 본다.</w:t>
+              <w:t>누락·모순·미확인 사실, 공식 출처 조회 실패, 비승인 규칙을 검사하고 워터마크된 초안을 미리 본다.</w:t>
             </w:r>
           </w:p>
         </w:tc>
@@ -5409,7 +5470,7 @@
                 <w:color w:val="16243A"/>
                 <w:sz w:val="17"/>
               </w:rPr>
-              <w:t>확정 사실이나 승인 규칙이 바뀌면 새 초안을 만든다.</w:t>
+              <w:t>확정 사실이 바뀌거나 법령·지침 재조회 후 새 규칙·조항이 승인되면 새 초안을 만든다.</w:t>
             </w:r>
           </w:p>
         </w:tc>
@@ -5437,7 +5498,7 @@
                 <w:color w:val="16243A"/>
                 <w:sz w:val="17"/>
               </w:rPr>
-              <w:t>기존 발행본을 덮어쓰지 않고 별도 초안과 변경 이유를 남긴다.</w:t>
+              <w:t>기존 발행본을 덮어쓰지 않고 별도 초안과 변경 이유·사용 출처를 남긴다.</w:t>
             </w:r>
           </w:p>
         </w:tc>
@@ -7473,7 +7534,7 @@
                 <w:color w:val="16243A"/>
                 <w:sz w:val="18"/>
               </w:rPr>
-              <w:t>미승인·만료 규칙 또는 조항</w:t>
+              <w:t>공식 법령·지침 조회 실패 또는 미승인·만료 규칙·조항</w:t>
             </w:r>
           </w:p>
         </w:tc>
@@ -7501,7 +7562,7 @@
                 <w:color w:val="16243A"/>
                 <w:sz w:val="18"/>
               </w:rPr>
-              <w:t>생성·재생성 대상에서 제외</w:t>
+              <w:t>해당 국가 초안 생성·재생성 차단</w:t>
             </w:r>
           </w:p>
         </w:tc>
@@ -7562,7 +7623,7 @@
                 <w:color w:val="16243A"/>
                 <w:sz w:val="18"/>
               </w:rPr>
-              <w:t>법률 기준일·생성 근거 누락</w:t>
+              <w:t>법률 기준일·공식 출처 스냅샷·생성 근거 누락</w:t>
             </w:r>
           </w:p>
         </w:tc>
@@ -8314,7 +8375,7 @@
                 <w:color w:val="16243A"/>
                 <w:sz w:val="17"/>
               </w:rPr>
-              <w:t>공식 출처 스냅샷·diff·검토 대기열·영향 계산·고객 재승인</w:t>
+              <w:t>정기 공식 출처 모니터링·변경 알림·영향 계산·고객 재승인</w:t>
             </w:r>
           </w:p>
         </w:tc>
@@ -8342,7 +8403,7 @@
                 <w:color w:val="16243A"/>
                 <w:sz w:val="17"/>
               </w:rPr>
-              <w:t>자동 적용 없이 사람 검토를 거치는 변경 감지 자동화</w:t>
+              <w:t>작성 시점 조회·스냅샷은 MVP에 포함하고 주기 실행·알림 자동화만 출시 후 구현</w:t>
             </w:r>
           </w:p>
         </w:tc>
@@ -9183,7 +9244,96 @@
                 <w:color w:val="16243A"/>
                 <w:sz w:val="18"/>
               </w:rPr>
-              <w:t>확정 사실로 4개 독립 초안을 만들고 국가별 차이와 생성 근거를 확인</w:t>
+              <w:t>확정 사실과 작성 시점의 국가별 법령·공식 지침으로 4개 독립 초안을 만들고 출처·차이·생성 근거를 확인</w:t>
+            </w:r>
+          </w:p>
+        </w:tc>
+      </w:tr>
+      <w:tr>
+        <w:trPr>
+          <w:cantSplit/>
+        </w:trPr>
+        <w:tc>
+          <w:tcPr>
+            <w:tcW w:type="dxa" w:w="2050"/>
+            <w:tcMar>
+              <w:top w:w="80" w:type="dxa"/>
+              <w:start w:w="120" w:type="dxa"/>
+              <w:bottom w:w="80" w:type="dxa"/>
+              <w:end w:w="120" w:type="dxa"/>
+            </w:tcMar>
+            <w:vAlign w:val="center"/>
+          </w:tcPr>
+          <w:p>
+            <w:pPr>
+              <w:spacing w:before="0" w:after="0" w:line="276" w:lineRule="auto"/>
+              <w:jc w:val="left"/>
+            </w:pPr>
+            <w:r/>
+            <w:r>
+              <w:rPr>
+                <w:rFonts w:ascii="Arial Unicode MS" w:hAnsi="Arial Unicode MS" w:eastAsia="Arial Unicode MS"/>
+                <w:b/>
+                <w:color w:val="16243A"/>
+                <w:sz w:val="18"/>
+              </w:rPr>
+              <w:t>법령·지침 조회 실패</w:t>
+            </w:r>
+          </w:p>
+        </w:tc>
+        <w:tc>
+          <w:tcPr>
+            <w:tcW w:type="dxa" w:w="2350"/>
+            <w:tcMar>
+              <w:top w:w="80" w:type="dxa"/>
+              <w:start w:w="120" w:type="dxa"/>
+              <w:bottom w:w="80" w:type="dxa"/>
+              <w:end w:w="120" w:type="dxa"/>
+            </w:tcMar>
+            <w:vAlign w:val="center"/>
+          </w:tcPr>
+          <w:p>
+            <w:pPr>
+              <w:spacing w:before="0" w:after="0" w:line="276" w:lineRule="auto"/>
+              <w:jc w:val="left"/>
+            </w:pPr>
+            <w:r/>
+            <w:r>
+              <w:rPr>
+                <w:rFonts w:ascii="Arial Unicode MS" w:hAnsi="Arial Unicode MS" w:eastAsia="Arial Unicode MS"/>
+                <w:b w:val="0"/>
+                <w:color w:val="16243A"/>
+                <w:sz w:val="18"/>
+              </w:rPr>
+              <w:t>DOC-01 · VAL-05</w:t>
+            </w:r>
+          </w:p>
+        </w:tc>
+        <w:tc>
+          <w:tcPr>
+            <w:tcW w:type="dxa" w:w="4960"/>
+            <w:tcMar>
+              <w:top w:w="80" w:type="dxa"/>
+              <w:start w:w="120" w:type="dxa"/>
+              <w:bottom w:w="80" w:type="dxa"/>
+              <w:end w:w="120" w:type="dxa"/>
+            </w:tcMar>
+            <w:vAlign w:val="center"/>
+          </w:tcPr>
+          <w:p>
+            <w:pPr>
+              <w:spacing w:before="0" w:after="0" w:line="276" w:lineRule="auto"/>
+              <w:jc w:val="left"/>
+            </w:pPr>
+            <w:r/>
+            <w:r>
+              <w:rPr>
+                <w:rFonts w:ascii="Arial Unicode MS" w:hAnsi="Arial Unicode MS" w:eastAsia="Arial Unicode MS"/>
+                <w:b w:val="0"/>
+                <w:color w:val="16243A"/>
+                <w:sz w:val="18"/>
+              </w:rPr>
+              <w:t>조회·검증에 실패한 국가의 초안 생성을 차단하고 실패 국가·출처·재시도 행동을 표시</w:t>
             </w:r>
           </w:p>
         </w:tc>
@@ -9394,7 +9544,7 @@
                 <w:color w:val="16243A"/>
                 <w:sz w:val="18"/>
               </w:rPr>
-              <w:t>사실·규칙 변경</w:t>
+              <w:t>사실·법률 근거 변경</w:t>
             </w:r>
           </w:p>
         </w:tc>
@@ -9450,7 +9600,7 @@
                 <w:color w:val="16243A"/>
                 <w:sz w:val="18"/>
               </w:rPr>
-              <w:t>현재 발행본을 보존한 채 새 초안·버전·변경 이유를 생성</w:t>
+              <w:t>현재 발행본을 보존한 채 새 초안·버전·변경 이유·사용 출처를 생성</w:t>
             </w:r>
           </w:p>
         </w:tc>
@@ -9655,7 +9805,7 @@
         <w:color w:val="5E6878"/>
         <w:sz w:val="17"/>
       </w:rPr>
-      <w:t>핵심 기능정의서   ·   FDS-2026-08-v2.2</w:t>
+      <w:t>핵심 기능정의서   ·   FDS-2026-08-v2.3</w:t>
     </w:r>
   </w:p>
 </w:hdr>

</xml_diff>

<commit_message>
docs(spec): support pre-incorporation draft flow
</commit_message>
<xml_diff>
--- a/docs/기능정의서.docx
+++ b/docs/기능정의서.docx
@@ -9,7 +9,7 @@
       </w:pPr>
       <w:r>
         <w:rPr>
-          <w:rFonts w:ascii="Arial Unicode MS" w:hAnsi="Arial Unicode MS" w:eastAsia="Arial Unicode MS"/>
+          <w:rFonts w:ascii="Apple SD Gothic Neo" w:hAnsi="Apple SD Gothic Neo" w:eastAsia="Apple SD Gothic Neo"/>
           <w:b/>
           <w:color w:val="2454DB"/>
           <w:sz w:val="18"/>
@@ -25,7 +25,7 @@
       </w:pPr>
       <w:r>
         <w:rPr>
-          <w:rFonts w:ascii="Arial Unicode MS" w:hAnsi="Arial Unicode MS" w:eastAsia="Arial Unicode MS"/>
+          <w:rFonts w:ascii="Apple SD Gothic Neo" w:hAnsi="Apple SD Gothic Neo" w:eastAsia="Apple SD Gothic Neo"/>
           <w:b/>
           <w:color w:val="16243A"/>
           <w:sz w:val="50"/>
@@ -42,7 +42,7 @@
       </w:pPr>
       <w:r>
         <w:rPr>
-          <w:rFonts w:ascii="Arial Unicode MS" w:hAnsi="Arial Unicode MS" w:eastAsia="Arial Unicode MS"/>
+          <w:rFonts w:ascii="Apple SD Gothic Neo" w:hAnsi="Apple SD Gothic Neo" w:eastAsia="Apple SD Gothic Neo"/>
           <w:color w:val="17356F"/>
           <w:sz w:val="27"/>
         </w:rPr>
@@ -88,7 +88,7 @@
             <w:r/>
             <w:r>
               <w:rPr>
-                <w:rFonts w:ascii="Arial Unicode MS" w:hAnsi="Arial Unicode MS" w:eastAsia="Arial Unicode MS"/>
+                <w:rFonts w:ascii="Apple SD Gothic Neo" w:hAnsi="Apple SD Gothic Neo" w:eastAsia="Apple SD Gothic Neo"/>
                 <w:b/>
                 <w:color w:val="16243A"/>
                 <w:sz w:val="19"/>
@@ -118,7 +118,7 @@
             <w:r/>
             <w:r>
               <w:rPr>
-                <w:rFonts w:ascii="Arial Unicode MS" w:hAnsi="Arial Unicode MS" w:eastAsia="Arial Unicode MS"/>
+                <w:rFonts w:ascii="Apple SD Gothic Neo" w:hAnsi="Apple SD Gothic Neo" w:eastAsia="Apple SD Gothic Neo"/>
                 <w:b/>
                 <w:color w:val="16243A"/>
                 <w:sz w:val="19"/>
@@ -151,7 +151,7 @@
             <w:r/>
             <w:r>
               <w:rPr>
-                <w:rFonts w:ascii="Arial Unicode MS" w:hAnsi="Arial Unicode MS" w:eastAsia="Arial Unicode MS"/>
+                <w:rFonts w:ascii="Apple SD Gothic Neo" w:hAnsi="Apple SD Gothic Neo" w:eastAsia="Apple SD Gothic Neo"/>
                 <w:b w:val="0"/>
                 <w:color w:val="16243A"/>
                 <w:sz w:val="19"/>
@@ -179,7 +179,7 @@
             <w:r/>
             <w:r>
               <w:rPr>
-                <w:rFonts w:ascii="Arial Unicode MS" w:hAnsi="Arial Unicode MS" w:eastAsia="Arial Unicode MS"/>
+                <w:rFonts w:ascii="Apple SD Gothic Neo" w:hAnsi="Apple SD Gothic Neo" w:eastAsia="Apple SD Gothic Neo"/>
                 <w:b w:val="0"/>
                 <w:color w:val="16243A"/>
                 <w:sz w:val="19"/>
@@ -212,7 +212,7 @@
             <w:r/>
             <w:r>
               <w:rPr>
-                <w:rFonts w:ascii="Arial Unicode MS" w:hAnsi="Arial Unicode MS" w:eastAsia="Arial Unicode MS"/>
+                <w:rFonts w:ascii="Apple SD Gothic Neo" w:hAnsi="Apple SD Gothic Neo" w:eastAsia="Apple SD Gothic Neo"/>
                 <w:b w:val="0"/>
                 <w:color w:val="16243A"/>
                 <w:sz w:val="19"/>
@@ -240,12 +240,12 @@
             <w:r/>
             <w:r>
               <w:rPr>
-                <w:rFonts w:ascii="Arial Unicode MS" w:hAnsi="Arial Unicode MS" w:eastAsia="Arial Unicode MS"/>
+                <w:rFonts w:ascii="Apple SD Gothic Neo" w:hAnsi="Apple SD Gothic Neo" w:eastAsia="Apple SD Gothic Neo"/>
                 <w:b w:val="0"/>
                 <w:color w:val="16243A"/>
                 <w:sz w:val="19"/>
               </w:rPr>
-              <w:t>법무팀 없이 해외 출시를 준비하는 국내 소프트웨어 창업자·초기기업</w:t>
+              <w:t>법무팀 없이 해외 출시를 준비하는 개인 예비창업자·국내 소프트웨어 초기기업</w:t>
             </w:r>
           </w:p>
         </w:tc>
@@ -273,7 +273,7 @@
             <w:r/>
             <w:r>
               <w:rPr>
-                <w:rFonts w:ascii="Arial Unicode MS" w:hAnsi="Arial Unicode MS" w:eastAsia="Arial Unicode MS"/>
+                <w:rFonts w:ascii="Apple SD Gothic Neo" w:hAnsi="Apple SD Gothic Neo" w:eastAsia="Apple SD Gothic Neo"/>
                 <w:b w:val="0"/>
                 <w:color w:val="16243A"/>
                 <w:sz w:val="19"/>
@@ -301,7 +301,7 @@
             <w:r/>
             <w:r>
               <w:rPr>
-                <w:rFonts w:ascii="Arial Unicode MS" w:hAnsi="Arial Unicode MS" w:eastAsia="Arial Unicode MS"/>
+                <w:rFonts w:ascii="Apple SD Gothic Neo" w:hAnsi="Apple SD Gothic Neo" w:eastAsia="Apple SD Gothic Neo"/>
                 <w:b w:val="0"/>
                 <w:color w:val="16243A"/>
                 <w:sz w:val="19"/>
@@ -334,7 +334,7 @@
             <w:r/>
             <w:r>
               <w:rPr>
-                <w:rFonts w:ascii="Arial Unicode MS" w:hAnsi="Arial Unicode MS" w:eastAsia="Arial Unicode MS"/>
+                <w:rFonts w:ascii="Apple SD Gothic Neo" w:hAnsi="Apple SD Gothic Neo" w:eastAsia="Apple SD Gothic Neo"/>
                 <w:b w:val="0"/>
                 <w:color w:val="16243A"/>
                 <w:sz w:val="19"/>
@@ -362,7 +362,7 @@
             <w:r/>
             <w:r>
               <w:rPr>
-                <w:rFonts w:ascii="Arial Unicode MS" w:hAnsi="Arial Unicode MS" w:eastAsia="Arial Unicode MS"/>
+                <w:rFonts w:ascii="Apple SD Gothic Neo" w:hAnsi="Apple SD Gothic Neo" w:eastAsia="Apple SD Gothic Neo"/>
                 <w:b w:val="0"/>
                 <w:color w:val="16243A"/>
                 <w:sz w:val="19"/>
@@ -395,7 +395,7 @@
             <w:r/>
             <w:r>
               <w:rPr>
-                <w:rFonts w:ascii="Arial Unicode MS" w:hAnsi="Arial Unicode MS" w:eastAsia="Arial Unicode MS"/>
+                <w:rFonts w:ascii="Apple SD Gothic Neo" w:hAnsi="Apple SD Gothic Neo" w:eastAsia="Apple SD Gothic Neo"/>
                 <w:b w:val="0"/>
                 <w:color w:val="16243A"/>
                 <w:sz w:val="19"/>
@@ -423,7 +423,7 @@
             <w:r/>
             <w:r>
               <w:rPr>
-                <w:rFonts w:ascii="Arial Unicode MS" w:hAnsi="Arial Unicode MS" w:eastAsia="Arial Unicode MS"/>
+                <w:rFonts w:ascii="Apple SD Gothic Neo" w:hAnsi="Apple SD Gothic Neo" w:eastAsia="Apple SD Gothic Neo"/>
                 <w:b w:val="0"/>
                 <w:color w:val="16243A"/>
                 <w:sz w:val="19"/>
@@ -456,7 +456,7 @@
             <w:r/>
             <w:r>
               <w:rPr>
-                <w:rFonts w:ascii="Arial Unicode MS" w:hAnsi="Arial Unicode MS" w:eastAsia="Arial Unicode MS"/>
+                <w:rFonts w:ascii="Apple SD Gothic Neo" w:hAnsi="Apple SD Gothic Neo" w:eastAsia="Apple SD Gothic Neo"/>
                 <w:b w:val="0"/>
                 <w:color w:val="16243A"/>
                 <w:sz w:val="19"/>
@@ -484,7 +484,7 @@
             <w:r/>
             <w:r>
               <w:rPr>
-                <w:rFonts w:ascii="Arial Unicode MS" w:hAnsi="Arial Unicode MS" w:eastAsia="Arial Unicode MS"/>
+                <w:rFonts w:ascii="Apple SD Gothic Neo" w:hAnsi="Apple SD Gothic Neo" w:eastAsia="Apple SD Gothic Neo"/>
                 <w:b w:val="0"/>
                 <w:color w:val="16243A"/>
                 <w:sz w:val="19"/>
@@ -534,7 +534,7 @@
             <w:r/>
             <w:r>
               <w:rPr>
-                <w:rFonts w:ascii="Arial Unicode MS" w:hAnsi="Arial Unicode MS" w:eastAsia="Arial Unicode MS"/>
+                <w:rFonts w:ascii="Apple SD Gothic Neo" w:hAnsi="Apple SD Gothic Neo" w:eastAsia="Apple SD Gothic Neo"/>
                 <w:b/>
                 <w:color w:val="A13D2D"/>
                 <w:sz w:val="20"/>
@@ -543,7 +543,7 @@
             </w:r>
             <w:r>
               <w:rPr>
-                <w:rFonts w:ascii="Arial Unicode MS" w:hAnsi="Arial Unicode MS" w:eastAsia="Arial Unicode MS"/>
+                <w:rFonts w:ascii="Apple SD Gothic Neo" w:hAnsi="Apple SD Gothic Neo" w:eastAsia="Apple SD Gothic Neo"/>
                 <w:color w:val="16243A"/>
                 <w:sz w:val="20"/>
               </w:rPr>
@@ -600,7 +600,7 @@
             <w:r/>
             <w:r>
               <w:rPr>
-                <w:rFonts w:ascii="Arial Unicode MS" w:hAnsi="Arial Unicode MS" w:eastAsia="Arial Unicode MS"/>
+                <w:rFonts w:ascii="Apple SD Gothic Neo" w:hAnsi="Apple SD Gothic Neo" w:eastAsia="Apple SD Gothic Neo"/>
                 <w:b/>
                 <w:color w:val="2454DB"/>
                 <w:sz w:val="20"/>
@@ -609,7 +609,7 @@
             </w:r>
             <w:r>
               <w:rPr>
-                <w:rFonts w:ascii="Arial Unicode MS" w:hAnsi="Arial Unicode MS" w:eastAsia="Arial Unicode MS"/>
+                <w:rFonts w:ascii="Apple SD Gothic Neo" w:hAnsi="Apple SD Gothic Neo" w:eastAsia="Apple SD Gothic Neo"/>
                 <w:color w:val="16243A"/>
                 <w:sz w:val="20"/>
               </w:rPr>
@@ -665,7 +665,7 @@
             <w:r/>
             <w:r>
               <w:rPr>
-                <w:rFonts w:ascii="Arial Unicode MS" w:hAnsi="Arial Unicode MS" w:eastAsia="Arial Unicode MS"/>
+                <w:rFonts w:ascii="Apple SD Gothic Neo" w:hAnsi="Apple SD Gothic Neo" w:eastAsia="Apple SD Gothic Neo"/>
                 <w:b/>
                 <w:color w:val="16243A"/>
                 <w:sz w:val="17"/>
@@ -695,7 +695,7 @@
             <w:r/>
             <w:r>
               <w:rPr>
-                <w:rFonts w:ascii="Arial Unicode MS" w:hAnsi="Arial Unicode MS" w:eastAsia="Arial Unicode MS"/>
+                <w:rFonts w:ascii="Apple SD Gothic Neo" w:hAnsi="Apple SD Gothic Neo" w:eastAsia="Apple SD Gothic Neo"/>
                 <w:b/>
                 <w:color w:val="16243A"/>
                 <w:sz w:val="17"/>
@@ -725,7 +725,7 @@
             <w:r/>
             <w:r>
               <w:rPr>
-                <w:rFonts w:ascii="Arial Unicode MS" w:hAnsi="Arial Unicode MS" w:eastAsia="Arial Unicode MS"/>
+                <w:rFonts w:ascii="Apple SD Gothic Neo" w:hAnsi="Apple SD Gothic Neo" w:eastAsia="Apple SD Gothic Neo"/>
                 <w:b/>
                 <w:color w:val="16243A"/>
                 <w:sz w:val="17"/>
@@ -755,7 +755,7 @@
             <w:r/>
             <w:r>
               <w:rPr>
-                <w:rFonts w:ascii="Arial Unicode MS" w:hAnsi="Arial Unicode MS" w:eastAsia="Arial Unicode MS"/>
+                <w:rFonts w:ascii="Apple SD Gothic Neo" w:hAnsi="Apple SD Gothic Neo" w:eastAsia="Apple SD Gothic Neo"/>
                 <w:b/>
                 <w:color w:val="16243A"/>
                 <w:sz w:val="17"/>
@@ -788,7 +788,7 @@
             <w:r/>
             <w:r>
               <w:rPr>
-                <w:rFonts w:ascii="Arial Unicode MS" w:hAnsi="Arial Unicode MS" w:eastAsia="Arial Unicode MS"/>
+                <w:rFonts w:ascii="Apple SD Gothic Neo" w:hAnsi="Apple SD Gothic Neo" w:eastAsia="Apple SD Gothic Neo"/>
                 <w:b/>
                 <w:color w:val="16243A"/>
                 <w:sz w:val="17"/>
@@ -816,12 +816,12 @@
             <w:r/>
             <w:r>
               <w:rPr>
-                <w:rFonts w:ascii="Arial Unicode MS" w:hAnsi="Arial Unicode MS" w:eastAsia="Arial Unicode MS"/>
+                <w:rFonts w:ascii="Apple SD Gothic Neo" w:hAnsi="Apple SD Gothic Neo" w:eastAsia="Apple SD Gothic Neo"/>
                 <w:b w:val="0"/>
                 <w:color w:val="16243A"/>
                 <w:sz w:val="17"/>
               </w:rPr>
-              <w:t>회사·서비스·목표 국가 설정</w:t>
+              <w:t>표시 주체·서비스·목표 국가 설정</w:t>
             </w:r>
           </w:p>
         </w:tc>
@@ -844,7 +844,7 @@
             <w:r/>
             <w:r>
               <w:rPr>
-                <w:rFonts w:ascii="Arial Unicode MS" w:hAnsi="Arial Unicode MS" w:eastAsia="Arial Unicode MS"/>
+                <w:rFonts w:ascii="Apple SD Gothic Neo" w:hAnsi="Apple SD Gothic Neo" w:eastAsia="Apple SD Gothic Neo"/>
                 <w:b w:val="0"/>
                 <w:color w:val="16243A"/>
                 <w:sz w:val="17"/>
@@ -872,7 +872,7 @@
             <w:r/>
             <w:r>
               <w:rPr>
-                <w:rFonts w:ascii="Arial Unicode MS" w:hAnsi="Arial Unicode MS" w:eastAsia="Arial Unicode MS"/>
+                <w:rFonts w:ascii="Apple SD Gothic Neo" w:hAnsi="Apple SD Gothic Neo" w:eastAsia="Apple SD Gothic Neo"/>
                 <w:b w:val="0"/>
                 <w:color w:val="16243A"/>
                 <w:sz w:val="17"/>
@@ -905,7 +905,7 @@
             <w:r/>
             <w:r>
               <w:rPr>
-                <w:rFonts w:ascii="Arial Unicode MS" w:hAnsi="Arial Unicode MS" w:eastAsia="Arial Unicode MS"/>
+                <w:rFonts w:ascii="Apple SD Gothic Neo" w:hAnsi="Apple SD Gothic Neo" w:eastAsia="Apple SD Gothic Neo"/>
                 <w:b/>
                 <w:color w:val="16243A"/>
                 <w:sz w:val="17"/>
@@ -933,7 +933,7 @@
             <w:r/>
             <w:r>
               <w:rPr>
-                <w:rFonts w:ascii="Arial Unicode MS" w:hAnsi="Arial Unicode MS" w:eastAsia="Arial Unicode MS"/>
+                <w:rFonts w:ascii="Apple SD Gothic Neo" w:hAnsi="Apple SD Gothic Neo" w:eastAsia="Apple SD Gothic Neo"/>
                 <w:b w:val="0"/>
                 <w:color w:val="16243A"/>
                 <w:sz w:val="17"/>
@@ -961,7 +961,7 @@
             <w:r/>
             <w:r>
               <w:rPr>
-                <w:rFonts w:ascii="Arial Unicode MS" w:hAnsi="Arial Unicode MS" w:eastAsia="Arial Unicode MS"/>
+                <w:rFonts w:ascii="Apple SD Gothic Neo" w:hAnsi="Apple SD Gothic Neo" w:eastAsia="Apple SD Gothic Neo"/>
                 <w:b w:val="0"/>
                 <w:color w:val="16243A"/>
                 <w:sz w:val="17"/>
@@ -989,7 +989,7 @@
             <w:r/>
             <w:r>
               <w:rPr>
-                <w:rFonts w:ascii="Arial Unicode MS" w:hAnsi="Arial Unicode MS" w:eastAsia="Arial Unicode MS"/>
+                <w:rFonts w:ascii="Apple SD Gothic Neo" w:hAnsi="Apple SD Gothic Neo" w:eastAsia="Apple SD Gothic Neo"/>
                 <w:b w:val="0"/>
                 <w:color w:val="16243A"/>
                 <w:sz w:val="17"/>
@@ -1022,7 +1022,7 @@
             <w:r/>
             <w:r>
               <w:rPr>
-                <w:rFonts w:ascii="Arial Unicode MS" w:hAnsi="Arial Unicode MS" w:eastAsia="Arial Unicode MS"/>
+                <w:rFonts w:ascii="Apple SD Gothic Neo" w:hAnsi="Apple SD Gothic Neo" w:eastAsia="Apple SD Gothic Neo"/>
                 <w:b/>
                 <w:color w:val="16243A"/>
                 <w:sz w:val="17"/>
@@ -1050,7 +1050,7 @@
             <w:r/>
             <w:r>
               <w:rPr>
-                <w:rFonts w:ascii="Arial Unicode MS" w:hAnsi="Arial Unicode MS" w:eastAsia="Arial Unicode MS"/>
+                <w:rFonts w:ascii="Apple SD Gothic Neo" w:hAnsi="Apple SD Gothic Neo" w:eastAsia="Apple SD Gothic Neo"/>
                 <w:b w:val="0"/>
                 <w:color w:val="16243A"/>
                 <w:sz w:val="17"/>
@@ -1078,7 +1078,7 @@
             <w:r/>
             <w:r>
               <w:rPr>
-                <w:rFonts w:ascii="Arial Unicode MS" w:hAnsi="Arial Unicode MS" w:eastAsia="Arial Unicode MS"/>
+                <w:rFonts w:ascii="Apple SD Gothic Neo" w:hAnsi="Apple SD Gothic Neo" w:eastAsia="Apple SD Gothic Neo"/>
                 <w:b w:val="0"/>
                 <w:color w:val="16243A"/>
                 <w:sz w:val="17"/>
@@ -1106,7 +1106,7 @@
             <w:r/>
             <w:r>
               <w:rPr>
-                <w:rFonts w:ascii="Arial Unicode MS" w:hAnsi="Arial Unicode MS" w:eastAsia="Arial Unicode MS"/>
+                <w:rFonts w:ascii="Apple SD Gothic Neo" w:hAnsi="Apple SD Gothic Neo" w:eastAsia="Apple SD Gothic Neo"/>
                 <w:b w:val="0"/>
                 <w:color w:val="16243A"/>
                 <w:sz w:val="17"/>
@@ -1139,7 +1139,7 @@
             <w:r/>
             <w:r>
               <w:rPr>
-                <w:rFonts w:ascii="Arial Unicode MS" w:hAnsi="Arial Unicode MS" w:eastAsia="Arial Unicode MS"/>
+                <w:rFonts w:ascii="Apple SD Gothic Neo" w:hAnsi="Apple SD Gothic Neo" w:eastAsia="Apple SD Gothic Neo"/>
                 <w:b/>
                 <w:color w:val="16243A"/>
                 <w:sz w:val="17"/>
@@ -1167,7 +1167,7 @@
             <w:r/>
             <w:r>
               <w:rPr>
-                <w:rFonts w:ascii="Arial Unicode MS" w:hAnsi="Arial Unicode MS" w:eastAsia="Arial Unicode MS"/>
+                <w:rFonts w:ascii="Apple SD Gothic Neo" w:hAnsi="Apple SD Gothic Neo" w:eastAsia="Apple SD Gothic Neo"/>
                 <w:b w:val="0"/>
                 <w:color w:val="16243A"/>
                 <w:sz w:val="17"/>
@@ -1195,7 +1195,7 @@
             <w:r/>
             <w:r>
               <w:rPr>
-                <w:rFonts w:ascii="Arial Unicode MS" w:hAnsi="Arial Unicode MS" w:eastAsia="Arial Unicode MS"/>
+                <w:rFonts w:ascii="Apple SD Gothic Neo" w:hAnsi="Apple SD Gothic Neo" w:eastAsia="Apple SD Gothic Neo"/>
                 <w:b w:val="0"/>
                 <w:color w:val="16243A"/>
                 <w:sz w:val="17"/>
@@ -1223,7 +1223,7 @@
             <w:r/>
             <w:r>
               <w:rPr>
-                <w:rFonts w:ascii="Arial Unicode MS" w:hAnsi="Arial Unicode MS" w:eastAsia="Arial Unicode MS"/>
+                <w:rFonts w:ascii="Apple SD Gothic Neo" w:hAnsi="Apple SD Gothic Neo" w:eastAsia="Apple SD Gothic Neo"/>
                 <w:b w:val="0"/>
                 <w:color w:val="16243A"/>
                 <w:sz w:val="17"/>
@@ -1256,7 +1256,7 @@
             <w:r/>
             <w:r>
               <w:rPr>
-                <w:rFonts w:ascii="Arial Unicode MS" w:hAnsi="Arial Unicode MS" w:eastAsia="Arial Unicode MS"/>
+                <w:rFonts w:ascii="Apple SD Gothic Neo" w:hAnsi="Apple SD Gothic Neo" w:eastAsia="Apple SD Gothic Neo"/>
                 <w:b/>
                 <w:color w:val="16243A"/>
                 <w:sz w:val="17"/>
@@ -1284,7 +1284,7 @@
             <w:r/>
             <w:r>
               <w:rPr>
-                <w:rFonts w:ascii="Arial Unicode MS" w:hAnsi="Arial Unicode MS" w:eastAsia="Arial Unicode MS"/>
+                <w:rFonts w:ascii="Apple SD Gothic Neo" w:hAnsi="Apple SD Gothic Neo" w:eastAsia="Apple SD Gothic Neo"/>
                 <w:b w:val="0"/>
                 <w:color w:val="16243A"/>
                 <w:sz w:val="17"/>
@@ -1312,7 +1312,7 @@
             <w:r/>
             <w:r>
               <w:rPr>
-                <w:rFonts w:ascii="Arial Unicode MS" w:hAnsi="Arial Unicode MS" w:eastAsia="Arial Unicode MS"/>
+                <w:rFonts w:ascii="Apple SD Gothic Neo" w:hAnsi="Apple SD Gothic Neo" w:eastAsia="Apple SD Gothic Neo"/>
                 <w:b w:val="0"/>
                 <w:color w:val="16243A"/>
                 <w:sz w:val="17"/>
@@ -1340,7 +1340,7 @@
             <w:r/>
             <w:r>
               <w:rPr>
-                <w:rFonts w:ascii="Arial Unicode MS" w:hAnsi="Arial Unicode MS" w:eastAsia="Arial Unicode MS"/>
+                <w:rFonts w:ascii="Apple SD Gothic Neo" w:hAnsi="Apple SD Gothic Neo" w:eastAsia="Apple SD Gothic Neo"/>
                 <w:b w:val="0"/>
                 <w:color w:val="16243A"/>
                 <w:sz w:val="17"/>
@@ -1373,7 +1373,7 @@
             <w:r/>
             <w:r>
               <w:rPr>
-                <w:rFonts w:ascii="Arial Unicode MS" w:hAnsi="Arial Unicode MS" w:eastAsia="Arial Unicode MS"/>
+                <w:rFonts w:ascii="Apple SD Gothic Neo" w:hAnsi="Apple SD Gothic Neo" w:eastAsia="Apple SD Gothic Neo"/>
                 <w:b/>
                 <w:color w:val="16243A"/>
                 <w:sz w:val="17"/>
@@ -1401,7 +1401,7 @@
             <w:r/>
             <w:r>
               <w:rPr>
-                <w:rFonts w:ascii="Arial Unicode MS" w:hAnsi="Arial Unicode MS" w:eastAsia="Arial Unicode MS"/>
+                <w:rFonts w:ascii="Apple SD Gothic Neo" w:hAnsi="Apple SD Gothic Neo" w:eastAsia="Apple SD Gothic Neo"/>
                 <w:b w:val="0"/>
                 <w:color w:val="16243A"/>
                 <w:sz w:val="17"/>
@@ -1429,7 +1429,7 @@
             <w:r/>
             <w:r>
               <w:rPr>
-                <w:rFonts w:ascii="Arial Unicode MS" w:hAnsi="Arial Unicode MS" w:eastAsia="Arial Unicode MS"/>
+                <w:rFonts w:ascii="Apple SD Gothic Neo" w:hAnsi="Apple SD Gothic Neo" w:eastAsia="Apple SD Gothic Neo"/>
                 <w:b w:val="0"/>
                 <w:color w:val="16243A"/>
                 <w:sz w:val="17"/>
@@ -1457,7 +1457,7 @@
             <w:r/>
             <w:r>
               <w:rPr>
-                <w:rFonts w:ascii="Arial Unicode MS" w:hAnsi="Arial Unicode MS" w:eastAsia="Arial Unicode MS"/>
+                <w:rFonts w:ascii="Apple SD Gothic Neo" w:hAnsi="Apple SD Gothic Neo" w:eastAsia="Apple SD Gothic Neo"/>
                 <w:b w:val="0"/>
                 <w:color w:val="16243A"/>
                 <w:sz w:val="17"/>
@@ -1490,7 +1490,7 @@
             <w:r/>
             <w:r>
               <w:rPr>
-                <w:rFonts w:ascii="Arial Unicode MS" w:hAnsi="Arial Unicode MS" w:eastAsia="Arial Unicode MS"/>
+                <w:rFonts w:ascii="Apple SD Gothic Neo" w:hAnsi="Apple SD Gothic Neo" w:eastAsia="Apple SD Gothic Neo"/>
                 <w:b/>
                 <w:color w:val="16243A"/>
                 <w:sz w:val="17"/>
@@ -1518,7 +1518,7 @@
             <w:r/>
             <w:r>
               <w:rPr>
-                <w:rFonts w:ascii="Arial Unicode MS" w:hAnsi="Arial Unicode MS" w:eastAsia="Arial Unicode MS"/>
+                <w:rFonts w:ascii="Apple SD Gothic Neo" w:hAnsi="Apple SD Gothic Neo" w:eastAsia="Apple SD Gothic Neo"/>
                 <w:b w:val="0"/>
                 <w:color w:val="16243A"/>
                 <w:sz w:val="17"/>
@@ -1546,7 +1546,7 @@
             <w:r/>
             <w:r>
               <w:rPr>
-                <w:rFonts w:ascii="Arial Unicode MS" w:hAnsi="Arial Unicode MS" w:eastAsia="Arial Unicode MS"/>
+                <w:rFonts w:ascii="Apple SD Gothic Neo" w:hAnsi="Apple SD Gothic Neo" w:eastAsia="Apple SD Gothic Neo"/>
                 <w:b w:val="0"/>
                 <w:color w:val="16243A"/>
                 <w:sz w:val="17"/>
@@ -1574,7 +1574,7 @@
             <w:r/>
             <w:r>
               <w:rPr>
-                <w:rFonts w:ascii="Arial Unicode MS" w:hAnsi="Arial Unicode MS" w:eastAsia="Arial Unicode MS"/>
+                <w:rFonts w:ascii="Apple SD Gothic Neo" w:hAnsi="Apple SD Gothic Neo" w:eastAsia="Apple SD Gothic Neo"/>
                 <w:b w:val="0"/>
                 <w:color w:val="16243A"/>
                 <w:sz w:val="17"/>
@@ -1637,7 +1637,7 @@
             <w:r/>
             <w:r>
               <w:rPr>
-                <w:rFonts w:ascii="Arial Unicode MS" w:hAnsi="Arial Unicode MS" w:eastAsia="Arial Unicode MS"/>
+                <w:rFonts w:ascii="Apple SD Gothic Neo" w:hAnsi="Apple SD Gothic Neo" w:eastAsia="Apple SD Gothic Neo"/>
                 <w:b/>
                 <w:color w:val="16243A"/>
                 <w:sz w:val="18"/>
@@ -1667,7 +1667,7 @@
             <w:r/>
             <w:r>
               <w:rPr>
-                <w:rFonts w:ascii="Arial Unicode MS" w:hAnsi="Arial Unicode MS" w:eastAsia="Arial Unicode MS"/>
+                <w:rFonts w:ascii="Apple SD Gothic Neo" w:hAnsi="Apple SD Gothic Neo" w:eastAsia="Apple SD Gothic Neo"/>
                 <w:b/>
                 <w:color w:val="16243A"/>
                 <w:sz w:val="18"/>
@@ -1700,7 +1700,7 @@
             <w:r/>
             <w:r>
               <w:rPr>
-                <w:rFonts w:ascii="Arial Unicode MS" w:hAnsi="Arial Unicode MS" w:eastAsia="Arial Unicode MS"/>
+                <w:rFonts w:ascii="Apple SD Gothic Neo" w:hAnsi="Apple SD Gothic Neo" w:eastAsia="Apple SD Gothic Neo"/>
                 <w:b w:val="0"/>
                 <w:color w:val="16243A"/>
                 <w:sz w:val="18"/>
@@ -1728,7 +1728,7 @@
             <w:r/>
             <w:r>
               <w:rPr>
-                <w:rFonts w:ascii="Arial Unicode MS" w:hAnsi="Arial Unicode MS" w:eastAsia="Arial Unicode MS"/>
+                <w:rFonts w:ascii="Apple SD Gothic Neo" w:hAnsi="Apple SD Gothic Neo" w:eastAsia="Apple SD Gothic Neo"/>
                 <w:b w:val="0"/>
                 <w:color w:val="16243A"/>
                 <w:sz w:val="18"/>
@@ -1761,7 +1761,7 @@
             <w:r/>
             <w:r>
               <w:rPr>
-                <w:rFonts w:ascii="Arial Unicode MS" w:hAnsi="Arial Unicode MS" w:eastAsia="Arial Unicode MS"/>
+                <w:rFonts w:ascii="Apple SD Gothic Neo" w:hAnsi="Apple SD Gothic Neo" w:eastAsia="Apple SD Gothic Neo"/>
                 <w:b w:val="0"/>
                 <w:color w:val="16243A"/>
                 <w:sz w:val="18"/>
@@ -1789,7 +1789,7 @@
             <w:r/>
             <w:r>
               <w:rPr>
-                <w:rFonts w:ascii="Arial Unicode MS" w:hAnsi="Arial Unicode MS" w:eastAsia="Arial Unicode MS"/>
+                <w:rFonts w:ascii="Apple SD Gothic Neo" w:hAnsi="Apple SD Gothic Neo" w:eastAsia="Apple SD Gothic Neo"/>
                 <w:b w:val="0"/>
                 <w:color w:val="16243A"/>
                 <w:sz w:val="18"/>
@@ -1822,7 +1822,7 @@
             <w:r/>
             <w:r>
               <w:rPr>
-                <w:rFonts w:ascii="Arial Unicode MS" w:hAnsi="Arial Unicode MS" w:eastAsia="Arial Unicode MS"/>
+                <w:rFonts w:ascii="Apple SD Gothic Neo" w:hAnsi="Apple SD Gothic Neo" w:eastAsia="Apple SD Gothic Neo"/>
                 <w:b w:val="0"/>
                 <w:color w:val="16243A"/>
                 <w:sz w:val="18"/>
@@ -1850,7 +1850,7 @@
             <w:r/>
             <w:r>
               <w:rPr>
-                <w:rFonts w:ascii="Arial Unicode MS" w:hAnsi="Arial Unicode MS" w:eastAsia="Arial Unicode MS"/>
+                <w:rFonts w:ascii="Apple SD Gothic Neo" w:hAnsi="Apple SD Gothic Neo" w:eastAsia="Apple SD Gothic Neo"/>
                 <w:b w:val="0"/>
                 <w:color w:val="16243A"/>
                 <w:sz w:val="18"/>
@@ -1883,7 +1883,7 @@
             <w:r/>
             <w:r>
               <w:rPr>
-                <w:rFonts w:ascii="Arial Unicode MS" w:hAnsi="Arial Unicode MS" w:eastAsia="Arial Unicode MS"/>
+                <w:rFonts w:ascii="Apple SD Gothic Neo" w:hAnsi="Apple SD Gothic Neo" w:eastAsia="Apple SD Gothic Neo"/>
                 <w:b w:val="0"/>
                 <w:color w:val="16243A"/>
                 <w:sz w:val="18"/>
@@ -1911,7 +1911,7 @@
             <w:r/>
             <w:r>
               <w:rPr>
-                <w:rFonts w:ascii="Arial Unicode MS" w:hAnsi="Arial Unicode MS" w:eastAsia="Arial Unicode MS"/>
+                <w:rFonts w:ascii="Apple SD Gothic Neo" w:hAnsi="Apple SD Gothic Neo" w:eastAsia="Apple SD Gothic Neo"/>
                 <w:b w:val="0"/>
                 <w:color w:val="16243A"/>
                 <w:sz w:val="18"/>
@@ -1944,7 +1944,7 @@
             <w:r/>
             <w:r>
               <w:rPr>
-                <w:rFonts w:ascii="Arial Unicode MS" w:hAnsi="Arial Unicode MS" w:eastAsia="Arial Unicode MS"/>
+                <w:rFonts w:ascii="Apple SD Gothic Neo" w:hAnsi="Apple SD Gothic Neo" w:eastAsia="Apple SD Gothic Neo"/>
                 <w:b w:val="0"/>
                 <w:color w:val="16243A"/>
                 <w:sz w:val="18"/>
@@ -1972,7 +1972,7 @@
             <w:r/>
             <w:r>
               <w:rPr>
-                <w:rFonts w:ascii="Arial Unicode MS" w:hAnsi="Arial Unicode MS" w:eastAsia="Arial Unicode MS"/>
+                <w:rFonts w:ascii="Apple SD Gothic Neo" w:hAnsi="Apple SD Gothic Neo" w:eastAsia="Apple SD Gothic Neo"/>
                 <w:b w:val="0"/>
                 <w:color w:val="16243A"/>
                 <w:sz w:val="18"/>
@@ -1999,7 +1999,7 @@
     <w:p>
       <w:r>
         <w:rPr>
-          <w:rFonts w:ascii="Arial Unicode MS" w:hAnsi="Arial Unicode MS" w:eastAsia="Arial Unicode MS"/>
+          <w:rFonts w:ascii="Apple SD Gothic Neo" w:hAnsi="Apple SD Gothic Neo" w:eastAsia="Apple SD Gothic Neo"/>
           <w:color w:val="16243A"/>
           <w:sz w:val="22"/>
         </w:rPr>
@@ -2055,7 +2055,7 @@
             <w:r/>
             <w:r>
               <w:rPr>
-                <w:rFonts w:ascii="Arial Unicode MS" w:hAnsi="Arial Unicode MS" w:eastAsia="Arial Unicode MS"/>
+                <w:rFonts w:ascii="Apple SD Gothic Neo" w:hAnsi="Apple SD Gothic Neo" w:eastAsia="Apple SD Gothic Neo"/>
                 <w:b/>
                 <w:color w:val="16243A"/>
                 <w:sz w:val="17"/>
@@ -2085,7 +2085,7 @@
             <w:r/>
             <w:r>
               <w:rPr>
-                <w:rFonts w:ascii="Arial Unicode MS" w:hAnsi="Arial Unicode MS" w:eastAsia="Arial Unicode MS"/>
+                <w:rFonts w:ascii="Apple SD Gothic Neo" w:hAnsi="Apple SD Gothic Neo" w:eastAsia="Apple SD Gothic Neo"/>
                 <w:b/>
                 <w:color w:val="16243A"/>
                 <w:sz w:val="17"/>
@@ -2115,7 +2115,7 @@
             <w:r/>
             <w:r>
               <w:rPr>
-                <w:rFonts w:ascii="Arial Unicode MS" w:hAnsi="Arial Unicode MS" w:eastAsia="Arial Unicode MS"/>
+                <w:rFonts w:ascii="Apple SD Gothic Neo" w:hAnsi="Apple SD Gothic Neo" w:eastAsia="Apple SD Gothic Neo"/>
                 <w:b/>
                 <w:color w:val="16243A"/>
                 <w:sz w:val="17"/>
@@ -2145,7 +2145,7 @@
             <w:r/>
             <w:r>
               <w:rPr>
-                <w:rFonts w:ascii="Arial Unicode MS" w:hAnsi="Arial Unicode MS" w:eastAsia="Arial Unicode MS"/>
+                <w:rFonts w:ascii="Apple SD Gothic Neo" w:hAnsi="Apple SD Gothic Neo" w:eastAsia="Apple SD Gothic Neo"/>
                 <w:b/>
                 <w:color w:val="16243A"/>
                 <w:sz w:val="17"/>
@@ -2178,7 +2178,7 @@
             <w:r/>
             <w:r>
               <w:rPr>
-                <w:rFonts w:ascii="Arial Unicode MS" w:hAnsi="Arial Unicode MS" w:eastAsia="Arial Unicode MS"/>
+                <w:rFonts w:ascii="Apple SD Gothic Neo" w:hAnsi="Apple SD Gothic Neo" w:eastAsia="Apple SD Gothic Neo"/>
                 <w:b/>
                 <w:color w:val="16243A"/>
                 <w:sz w:val="17"/>
@@ -2206,7 +2206,7 @@
             <w:r/>
             <w:r>
               <w:rPr>
-                <w:rFonts w:ascii="Arial Unicode MS" w:hAnsi="Arial Unicode MS" w:eastAsia="Arial Unicode MS"/>
+                <w:rFonts w:ascii="Apple SD Gothic Neo" w:hAnsi="Apple SD Gothic Neo" w:eastAsia="Apple SD Gothic Neo"/>
                 <w:b w:val="0"/>
                 <w:color w:val="16243A"/>
                 <w:sz w:val="17"/>
@@ -2234,7 +2234,7 @@
             <w:r/>
             <w:r>
               <w:rPr>
-                <w:rFonts w:ascii="Arial Unicode MS" w:hAnsi="Arial Unicode MS" w:eastAsia="Arial Unicode MS"/>
+                <w:rFonts w:ascii="Apple SD Gothic Neo" w:hAnsi="Apple SD Gothic Neo" w:eastAsia="Apple SD Gothic Neo"/>
                 <w:b w:val="0"/>
                 <w:color w:val="16243A"/>
                 <w:sz w:val="17"/>
@@ -2262,7 +2262,7 @@
             <w:r/>
             <w:r>
               <w:rPr>
-                <w:rFonts w:ascii="Arial Unicode MS" w:hAnsi="Arial Unicode MS" w:eastAsia="Arial Unicode MS"/>
+                <w:rFonts w:ascii="Apple SD Gothic Neo" w:hAnsi="Apple SD Gothic Neo" w:eastAsia="Apple SD Gothic Neo"/>
                 <w:b w:val="0"/>
                 <w:color w:val="16243A"/>
                 <w:sz w:val="17"/>
@@ -2295,7 +2295,7 @@
             <w:r/>
             <w:r>
               <w:rPr>
-                <w:rFonts w:ascii="Arial Unicode MS" w:hAnsi="Arial Unicode MS" w:eastAsia="Arial Unicode MS"/>
+                <w:rFonts w:ascii="Apple SD Gothic Neo" w:hAnsi="Apple SD Gothic Neo" w:eastAsia="Apple SD Gothic Neo"/>
                 <w:b/>
                 <w:color w:val="16243A"/>
                 <w:sz w:val="17"/>
@@ -2323,12 +2323,12 @@
             <w:r/>
             <w:r>
               <w:rPr>
-                <w:rFonts w:ascii="Arial Unicode MS" w:hAnsi="Arial Unicode MS" w:eastAsia="Arial Unicode MS"/>
+                <w:rFonts w:ascii="Apple SD Gothic Neo" w:hAnsi="Apple SD Gothic Neo" w:eastAsia="Apple SD Gothic Neo"/>
                 <w:b w:val="0"/>
                 <w:color w:val="16243A"/>
                 <w:sz w:val="17"/>
               </w:rPr>
-              <w:t>회사 기본정보 등록·수정</w:t>
+              <w:t>표시 주체 정보 등록·수정</w:t>
             </w:r>
           </w:p>
         </w:tc>
@@ -2351,12 +2351,12 @@
             <w:r/>
             <w:r>
               <w:rPr>
-                <w:rFonts w:ascii="Arial Unicode MS" w:hAnsi="Arial Unicode MS" w:eastAsia="Arial Unicode MS"/>
+                <w:rFonts w:ascii="Apple SD Gothic Neo" w:hAnsi="Apple SD Gothic Neo" w:eastAsia="Apple SD Gothic Neo"/>
                 <w:b w:val="0"/>
                 <w:color w:val="16243A"/>
                 <w:sz w:val="17"/>
               </w:rPr>
-              <w:t>회사명·사업장 주소·문의 연락처·개인정보 보호 담당 정보를 입력·수정하고 국가별 문서에서 공통으로 사용한다.</w:t>
+              <w:t>법인·사업자 또는 개인 예비창업자 유형을 선택하고 문서에 표시할 명칭·주소·문의 연락처·개인정보 보호 담당 정보를 입력·수정한다. 예비창업자는 미확정 표시정보를 보류한 채 초안 생성을 진행할 수 있다.</w:t>
             </w:r>
           </w:p>
         </w:tc>
@@ -2379,12 +2379,12 @@
             <w:r/>
             <w:r>
               <w:rPr>
-                <w:rFonts w:ascii="Arial Unicode MS" w:hAnsi="Arial Unicode MS" w:eastAsia="Arial Unicode MS"/>
+                <w:rFonts w:ascii="Apple SD Gothic Neo" w:hAnsi="Apple SD Gothic Neo" w:eastAsia="Apple SD Gothic Neo"/>
                 <w:b w:val="0"/>
                 <w:color w:val="16243A"/>
                 <w:sz w:val="17"/>
               </w:rPr>
-              <w:t>필수 기본정보를 저장하고, 수정 시 영향을 받는 국가별 초안을 재검토 상태로 바꾼다.</w:t>
+              <w:t>유형과 입력 상태를 저장하고, 표시 주체 명칭·주소·연락처가 확정되지 않으면 공개 발행만 차단한다. 수정 시 영향을 받는 국가별 초안을 재검토 상태로 바꾼다.</w:t>
             </w:r>
           </w:p>
         </w:tc>
@@ -2412,7 +2412,7 @@
             <w:r/>
             <w:r>
               <w:rPr>
-                <w:rFonts w:ascii="Arial Unicode MS" w:hAnsi="Arial Unicode MS" w:eastAsia="Arial Unicode MS"/>
+                <w:rFonts w:ascii="Apple SD Gothic Neo" w:hAnsi="Apple SD Gothic Neo" w:eastAsia="Apple SD Gothic Neo"/>
                 <w:b/>
                 <w:color w:val="16243A"/>
                 <w:sz w:val="17"/>
@@ -2440,7 +2440,7 @@
             <w:r/>
             <w:r>
               <w:rPr>
-                <w:rFonts w:ascii="Arial Unicode MS" w:hAnsi="Arial Unicode MS" w:eastAsia="Arial Unicode MS"/>
+                <w:rFonts w:ascii="Apple SD Gothic Neo" w:hAnsi="Apple SD Gothic Neo" w:eastAsia="Apple SD Gothic Neo"/>
                 <w:b w:val="0"/>
                 <w:color w:val="16243A"/>
                 <w:sz w:val="17"/>
@@ -2468,7 +2468,7 @@
             <w:r/>
             <w:r>
               <w:rPr>
-                <w:rFonts w:ascii="Arial Unicode MS" w:hAnsi="Arial Unicode MS" w:eastAsia="Arial Unicode MS"/>
+                <w:rFonts w:ascii="Apple SD Gothic Neo" w:hAnsi="Apple SD Gothic Neo" w:eastAsia="Apple SD Gothic Neo"/>
                 <w:b w:val="0"/>
                 <w:color w:val="16243A"/>
                 <w:sz w:val="17"/>
@@ -2496,7 +2496,7 @@
             <w:r/>
             <w:r>
               <w:rPr>
-                <w:rFonts w:ascii="Arial Unicode MS" w:hAnsi="Arial Unicode MS" w:eastAsia="Arial Unicode MS"/>
+                <w:rFonts w:ascii="Apple SD Gothic Neo" w:hAnsi="Apple SD Gothic Neo" w:eastAsia="Apple SD Gothic Neo"/>
                 <w:b w:val="0"/>
                 <w:color w:val="16243A"/>
                 <w:sz w:val="17"/>
@@ -2529,7 +2529,7 @@
             <w:r/>
             <w:r>
               <w:rPr>
-                <w:rFonts w:ascii="Arial Unicode MS" w:hAnsi="Arial Unicode MS" w:eastAsia="Arial Unicode MS"/>
+                <w:rFonts w:ascii="Apple SD Gothic Neo" w:hAnsi="Apple SD Gothic Neo" w:eastAsia="Apple SD Gothic Neo"/>
                 <w:b/>
                 <w:color w:val="16243A"/>
                 <w:sz w:val="17"/>
@@ -2557,7 +2557,7 @@
             <w:r/>
             <w:r>
               <w:rPr>
-                <w:rFonts w:ascii="Arial Unicode MS" w:hAnsi="Arial Unicode MS" w:eastAsia="Arial Unicode MS"/>
+                <w:rFonts w:ascii="Apple SD Gothic Neo" w:hAnsi="Apple SD Gothic Neo" w:eastAsia="Apple SD Gothic Neo"/>
                 <w:b w:val="0"/>
                 <w:color w:val="16243A"/>
                 <w:sz w:val="17"/>
@@ -2585,7 +2585,7 @@
             <w:r/>
             <w:r>
               <w:rPr>
-                <w:rFonts w:ascii="Arial Unicode MS" w:hAnsi="Arial Unicode MS" w:eastAsia="Arial Unicode MS"/>
+                <w:rFonts w:ascii="Apple SD Gothic Neo" w:hAnsi="Apple SD Gothic Neo" w:eastAsia="Apple SD Gothic Neo"/>
                 <w:b w:val="0"/>
                 <w:color w:val="16243A"/>
                 <w:sz w:val="17"/>
@@ -2613,7 +2613,7 @@
             <w:r/>
             <w:r>
               <w:rPr>
-                <w:rFonts w:ascii="Arial Unicode MS" w:hAnsi="Arial Unicode MS" w:eastAsia="Arial Unicode MS"/>
+                <w:rFonts w:ascii="Apple SD Gothic Neo" w:hAnsi="Apple SD Gothic Neo" w:eastAsia="Apple SD Gothic Neo"/>
                 <w:b w:val="0"/>
                 <w:color w:val="16243A"/>
                 <w:sz w:val="17"/>
@@ -2645,7 +2645,7 @@
     <w:p>
       <w:r>
         <w:rPr>
-          <w:rFonts w:ascii="Arial Unicode MS" w:hAnsi="Arial Unicode MS" w:eastAsia="Arial Unicode MS"/>
+          <w:rFonts w:ascii="Apple SD Gothic Neo" w:hAnsi="Apple SD Gothic Neo" w:eastAsia="Apple SD Gothic Neo"/>
           <w:color w:val="16243A"/>
           <w:sz w:val="22"/>
         </w:rPr>
@@ -2692,7 +2692,7 @@
             <w:r/>
             <w:r>
               <w:rPr>
-                <w:rFonts w:ascii="Arial Unicode MS" w:hAnsi="Arial Unicode MS" w:eastAsia="Arial Unicode MS"/>
+                <w:rFonts w:ascii="Apple SD Gothic Neo" w:hAnsi="Apple SD Gothic Neo" w:eastAsia="Apple SD Gothic Neo"/>
                 <w:b/>
                 <w:color w:val="16243A"/>
                 <w:sz w:val="17"/>
@@ -2722,7 +2722,7 @@
             <w:r/>
             <w:r>
               <w:rPr>
-                <w:rFonts w:ascii="Arial Unicode MS" w:hAnsi="Arial Unicode MS" w:eastAsia="Arial Unicode MS"/>
+                <w:rFonts w:ascii="Apple SD Gothic Neo" w:hAnsi="Apple SD Gothic Neo" w:eastAsia="Apple SD Gothic Neo"/>
                 <w:b/>
                 <w:color w:val="16243A"/>
                 <w:sz w:val="17"/>
@@ -2752,7 +2752,7 @@
             <w:r/>
             <w:r>
               <w:rPr>
-                <w:rFonts w:ascii="Arial Unicode MS" w:hAnsi="Arial Unicode MS" w:eastAsia="Arial Unicode MS"/>
+                <w:rFonts w:ascii="Apple SD Gothic Neo" w:hAnsi="Apple SD Gothic Neo" w:eastAsia="Apple SD Gothic Neo"/>
                 <w:b/>
                 <w:color w:val="16243A"/>
                 <w:sz w:val="17"/>
@@ -2785,7 +2785,7 @@
             <w:r/>
             <w:r>
               <w:rPr>
-                <w:rFonts w:ascii="Arial Unicode MS" w:hAnsi="Arial Unicode MS" w:eastAsia="Arial Unicode MS"/>
+                <w:rFonts w:ascii="Apple SD Gothic Neo" w:hAnsi="Apple SD Gothic Neo" w:eastAsia="Apple SD Gothic Neo"/>
                 <w:b/>
                 <w:color w:val="16243A"/>
                 <w:sz w:val="17"/>
@@ -2813,7 +2813,7 @@
             <w:r/>
             <w:r>
               <w:rPr>
-                <w:rFonts w:ascii="Arial Unicode MS" w:hAnsi="Arial Unicode MS" w:eastAsia="Arial Unicode MS"/>
+                <w:rFonts w:ascii="Apple SD Gothic Neo" w:hAnsi="Apple SD Gothic Neo" w:eastAsia="Apple SD Gothic Neo"/>
                 <w:b w:val="0"/>
                 <w:color w:val="16243A"/>
                 <w:sz w:val="17"/>
@@ -2841,7 +2841,7 @@
             <w:r/>
             <w:r>
               <w:rPr>
-                <w:rFonts w:ascii="Arial Unicode MS" w:hAnsi="Arial Unicode MS" w:eastAsia="Arial Unicode MS"/>
+                <w:rFonts w:ascii="Apple SD Gothic Neo" w:hAnsi="Apple SD Gothic Neo" w:eastAsia="Apple SD Gothic Neo"/>
                 <w:b w:val="0"/>
                 <w:color w:val="16243A"/>
                 <w:sz w:val="17"/>
@@ -2874,7 +2874,7 @@
             <w:r/>
             <w:r>
               <w:rPr>
-                <w:rFonts w:ascii="Arial Unicode MS" w:hAnsi="Arial Unicode MS" w:eastAsia="Arial Unicode MS"/>
+                <w:rFonts w:ascii="Apple SD Gothic Neo" w:hAnsi="Apple SD Gothic Neo" w:eastAsia="Apple SD Gothic Neo"/>
                 <w:b/>
                 <w:color w:val="16243A"/>
                 <w:sz w:val="17"/>
@@ -2902,7 +2902,7 @@
             <w:r/>
             <w:r>
               <w:rPr>
-                <w:rFonts w:ascii="Arial Unicode MS" w:hAnsi="Arial Unicode MS" w:eastAsia="Arial Unicode MS"/>
+                <w:rFonts w:ascii="Apple SD Gothic Neo" w:hAnsi="Apple SD Gothic Neo" w:eastAsia="Apple SD Gothic Neo"/>
                 <w:b w:val="0"/>
                 <w:color w:val="16243A"/>
                 <w:sz w:val="17"/>
@@ -2930,7 +2930,7 @@
             <w:r/>
             <w:r>
               <w:rPr>
-                <w:rFonts w:ascii="Arial Unicode MS" w:hAnsi="Arial Unicode MS" w:eastAsia="Arial Unicode MS"/>
+                <w:rFonts w:ascii="Apple SD Gothic Neo" w:hAnsi="Apple SD Gothic Neo" w:eastAsia="Apple SD Gothic Neo"/>
                 <w:b w:val="0"/>
                 <w:color w:val="16243A"/>
                 <w:sz w:val="17"/>
@@ -2963,7 +2963,7 @@
             <w:r/>
             <w:r>
               <w:rPr>
-                <w:rFonts w:ascii="Arial Unicode MS" w:hAnsi="Arial Unicode MS" w:eastAsia="Arial Unicode MS"/>
+                <w:rFonts w:ascii="Apple SD Gothic Neo" w:hAnsi="Apple SD Gothic Neo" w:eastAsia="Apple SD Gothic Neo"/>
                 <w:b/>
                 <w:color w:val="16243A"/>
                 <w:sz w:val="17"/>
@@ -2991,7 +2991,7 @@
             <w:r/>
             <w:r>
               <w:rPr>
-                <w:rFonts w:ascii="Arial Unicode MS" w:hAnsi="Arial Unicode MS" w:eastAsia="Arial Unicode MS"/>
+                <w:rFonts w:ascii="Apple SD Gothic Neo" w:hAnsi="Apple SD Gothic Neo" w:eastAsia="Apple SD Gothic Neo"/>
                 <w:b w:val="0"/>
                 <w:color w:val="16243A"/>
                 <w:sz w:val="17"/>
@@ -3019,7 +3019,7 @@
             <w:r/>
             <w:r>
               <w:rPr>
-                <w:rFonts w:ascii="Arial Unicode MS" w:hAnsi="Arial Unicode MS" w:eastAsia="Arial Unicode MS"/>
+                <w:rFonts w:ascii="Apple SD Gothic Neo" w:hAnsi="Apple SD Gothic Neo" w:eastAsia="Apple SD Gothic Neo"/>
                 <w:b w:val="0"/>
                 <w:color w:val="16243A"/>
                 <w:sz w:val="17"/>
@@ -3052,7 +3052,7 @@
             <w:r/>
             <w:r>
               <w:rPr>
-                <w:rFonts w:ascii="Arial Unicode MS" w:hAnsi="Arial Unicode MS" w:eastAsia="Arial Unicode MS"/>
+                <w:rFonts w:ascii="Apple SD Gothic Neo" w:hAnsi="Apple SD Gothic Neo" w:eastAsia="Apple SD Gothic Neo"/>
                 <w:b/>
                 <w:color w:val="16243A"/>
                 <w:sz w:val="17"/>
@@ -3080,7 +3080,7 @@
             <w:r/>
             <w:r>
               <w:rPr>
-                <w:rFonts w:ascii="Arial Unicode MS" w:hAnsi="Arial Unicode MS" w:eastAsia="Arial Unicode MS"/>
+                <w:rFonts w:ascii="Apple SD Gothic Neo" w:hAnsi="Apple SD Gothic Neo" w:eastAsia="Apple SD Gothic Neo"/>
                 <w:b w:val="0"/>
                 <w:color w:val="16243A"/>
                 <w:sz w:val="17"/>
@@ -3108,7 +3108,7 @@
             <w:r/>
             <w:r>
               <w:rPr>
-                <w:rFonts w:ascii="Arial Unicode MS" w:hAnsi="Arial Unicode MS" w:eastAsia="Arial Unicode MS"/>
+                <w:rFonts w:ascii="Apple SD Gothic Neo" w:hAnsi="Apple SD Gothic Neo" w:eastAsia="Apple SD Gothic Neo"/>
                 <w:b w:val="0"/>
                 <w:color w:val="16243A"/>
                 <w:sz w:val="17"/>
@@ -3141,7 +3141,7 @@
             <w:r/>
             <w:r>
               <w:rPr>
-                <w:rFonts w:ascii="Arial Unicode MS" w:hAnsi="Arial Unicode MS" w:eastAsia="Arial Unicode MS"/>
+                <w:rFonts w:ascii="Apple SD Gothic Neo" w:hAnsi="Apple SD Gothic Neo" w:eastAsia="Apple SD Gothic Neo"/>
                 <w:b/>
                 <w:color w:val="16243A"/>
                 <w:sz w:val="17"/>
@@ -3169,7 +3169,7 @@
             <w:r/>
             <w:r>
               <w:rPr>
-                <w:rFonts w:ascii="Arial Unicode MS" w:hAnsi="Arial Unicode MS" w:eastAsia="Arial Unicode MS"/>
+                <w:rFonts w:ascii="Apple SD Gothic Neo" w:hAnsi="Apple SD Gothic Neo" w:eastAsia="Apple SD Gothic Neo"/>
                 <w:b w:val="0"/>
                 <w:color w:val="16243A"/>
                 <w:sz w:val="17"/>
@@ -3197,7 +3197,7 @@
             <w:r/>
             <w:r>
               <w:rPr>
-                <w:rFonts w:ascii="Arial Unicode MS" w:hAnsi="Arial Unicode MS" w:eastAsia="Arial Unicode MS"/>
+                <w:rFonts w:ascii="Apple SD Gothic Neo" w:hAnsi="Apple SD Gothic Neo" w:eastAsia="Apple SD Gothic Neo"/>
                 <w:b w:val="0"/>
                 <w:color w:val="16243A"/>
                 <w:sz w:val="17"/>
@@ -3262,7 +3262,7 @@
             <w:r/>
             <w:r>
               <w:rPr>
-                <w:rFonts w:ascii="Arial Unicode MS" w:hAnsi="Arial Unicode MS" w:eastAsia="Arial Unicode MS"/>
+                <w:rFonts w:ascii="Apple SD Gothic Neo" w:hAnsi="Apple SD Gothic Neo" w:eastAsia="Apple SD Gothic Neo"/>
                 <w:b/>
                 <w:color w:val="16243A"/>
                 <w:sz w:val="17"/>
@@ -3292,7 +3292,7 @@
             <w:r/>
             <w:r>
               <w:rPr>
-                <w:rFonts w:ascii="Arial Unicode MS" w:hAnsi="Arial Unicode MS" w:eastAsia="Arial Unicode MS"/>
+                <w:rFonts w:ascii="Apple SD Gothic Neo" w:hAnsi="Apple SD Gothic Neo" w:eastAsia="Apple SD Gothic Neo"/>
                 <w:b/>
                 <w:color w:val="16243A"/>
                 <w:sz w:val="17"/>
@@ -3322,7 +3322,7 @@
             <w:r/>
             <w:r>
               <w:rPr>
-                <w:rFonts w:ascii="Arial Unicode MS" w:hAnsi="Arial Unicode MS" w:eastAsia="Arial Unicode MS"/>
+                <w:rFonts w:ascii="Apple SD Gothic Neo" w:hAnsi="Apple SD Gothic Neo" w:eastAsia="Apple SD Gothic Neo"/>
                 <w:b/>
                 <w:color w:val="16243A"/>
                 <w:sz w:val="17"/>
@@ -3352,7 +3352,7 @@
             <w:r/>
             <w:r>
               <w:rPr>
-                <w:rFonts w:ascii="Arial Unicode MS" w:hAnsi="Arial Unicode MS" w:eastAsia="Arial Unicode MS"/>
+                <w:rFonts w:ascii="Apple SD Gothic Neo" w:hAnsi="Apple SD Gothic Neo" w:eastAsia="Apple SD Gothic Neo"/>
                 <w:b/>
                 <w:color w:val="16243A"/>
                 <w:sz w:val="17"/>
@@ -3385,7 +3385,7 @@
             <w:r/>
             <w:r>
               <w:rPr>
-                <w:rFonts w:ascii="Arial Unicode MS" w:hAnsi="Arial Unicode MS" w:eastAsia="Arial Unicode MS"/>
+                <w:rFonts w:ascii="Apple SD Gothic Neo" w:hAnsi="Apple SD Gothic Neo" w:eastAsia="Apple SD Gothic Neo"/>
                 <w:b/>
                 <w:color w:val="16243A"/>
                 <w:sz w:val="17"/>
@@ -3413,7 +3413,7 @@
             <w:r/>
             <w:r>
               <w:rPr>
-                <w:rFonts w:ascii="Arial Unicode MS" w:hAnsi="Arial Unicode MS" w:eastAsia="Arial Unicode MS"/>
+                <w:rFonts w:ascii="Apple SD Gothic Neo" w:hAnsi="Apple SD Gothic Neo" w:eastAsia="Apple SD Gothic Neo"/>
                 <w:b w:val="0"/>
                 <w:color w:val="16243A"/>
                 <w:sz w:val="17"/>
@@ -3441,7 +3441,7 @@
             <w:r/>
             <w:r>
               <w:rPr>
-                <w:rFonts w:ascii="Arial Unicode MS" w:hAnsi="Arial Unicode MS" w:eastAsia="Arial Unicode MS"/>
+                <w:rFonts w:ascii="Apple SD Gothic Neo" w:hAnsi="Apple SD Gothic Neo" w:eastAsia="Apple SD Gothic Neo"/>
                 <w:b w:val="0"/>
                 <w:color w:val="16243A"/>
                 <w:sz w:val="17"/>
@@ -3469,7 +3469,7 @@
             <w:r/>
             <w:r>
               <w:rPr>
-                <w:rFonts w:ascii="Arial Unicode MS" w:hAnsi="Arial Unicode MS" w:eastAsia="Arial Unicode MS"/>
+                <w:rFonts w:ascii="Apple SD Gothic Neo" w:hAnsi="Apple SD Gothic Neo" w:eastAsia="Apple SD Gothic Neo"/>
                 <w:b w:val="0"/>
                 <w:color w:val="16243A"/>
                 <w:sz w:val="17"/>
@@ -3502,7 +3502,7 @@
             <w:r/>
             <w:r>
               <w:rPr>
-                <w:rFonts w:ascii="Arial Unicode MS" w:hAnsi="Arial Unicode MS" w:eastAsia="Arial Unicode MS"/>
+                <w:rFonts w:ascii="Apple SD Gothic Neo" w:hAnsi="Apple SD Gothic Neo" w:eastAsia="Apple SD Gothic Neo"/>
                 <w:b/>
                 <w:color w:val="16243A"/>
                 <w:sz w:val="17"/>
@@ -3530,7 +3530,7 @@
             <w:r/>
             <w:r>
               <w:rPr>
-                <w:rFonts w:ascii="Arial Unicode MS" w:hAnsi="Arial Unicode MS" w:eastAsia="Arial Unicode MS"/>
+                <w:rFonts w:ascii="Apple SD Gothic Neo" w:hAnsi="Apple SD Gothic Neo" w:eastAsia="Apple SD Gothic Neo"/>
                 <w:b w:val="0"/>
                 <w:color w:val="16243A"/>
                 <w:sz w:val="17"/>
@@ -3558,7 +3558,7 @@
             <w:r/>
             <w:r>
               <w:rPr>
-                <w:rFonts w:ascii="Arial Unicode MS" w:hAnsi="Arial Unicode MS" w:eastAsia="Arial Unicode MS"/>
+                <w:rFonts w:ascii="Apple SD Gothic Neo" w:hAnsi="Apple SD Gothic Neo" w:eastAsia="Apple SD Gothic Neo"/>
                 <w:b w:val="0"/>
                 <w:color w:val="16243A"/>
                 <w:sz w:val="17"/>
@@ -3586,7 +3586,7 @@
             <w:r/>
             <w:r>
               <w:rPr>
-                <w:rFonts w:ascii="Arial Unicode MS" w:hAnsi="Arial Unicode MS" w:eastAsia="Arial Unicode MS"/>
+                <w:rFonts w:ascii="Apple SD Gothic Neo" w:hAnsi="Apple SD Gothic Neo" w:eastAsia="Apple SD Gothic Neo"/>
                 <w:b w:val="0"/>
                 <w:color w:val="16243A"/>
                 <w:sz w:val="17"/>
@@ -3619,7 +3619,7 @@
             <w:r/>
             <w:r>
               <w:rPr>
-                <w:rFonts w:ascii="Arial Unicode MS" w:hAnsi="Arial Unicode MS" w:eastAsia="Arial Unicode MS"/>
+                <w:rFonts w:ascii="Apple SD Gothic Neo" w:hAnsi="Apple SD Gothic Neo" w:eastAsia="Apple SD Gothic Neo"/>
                 <w:b/>
                 <w:color w:val="16243A"/>
                 <w:sz w:val="17"/>
@@ -3647,7 +3647,7 @@
             <w:r/>
             <w:r>
               <w:rPr>
-                <w:rFonts w:ascii="Arial Unicode MS" w:hAnsi="Arial Unicode MS" w:eastAsia="Arial Unicode MS"/>
+                <w:rFonts w:ascii="Apple SD Gothic Neo" w:hAnsi="Apple SD Gothic Neo" w:eastAsia="Apple SD Gothic Neo"/>
                 <w:b w:val="0"/>
                 <w:color w:val="16243A"/>
                 <w:sz w:val="17"/>
@@ -3675,7 +3675,7 @@
             <w:r/>
             <w:r>
               <w:rPr>
-                <w:rFonts w:ascii="Arial Unicode MS" w:hAnsi="Arial Unicode MS" w:eastAsia="Arial Unicode MS"/>
+                <w:rFonts w:ascii="Apple SD Gothic Neo" w:hAnsi="Apple SD Gothic Neo" w:eastAsia="Apple SD Gothic Neo"/>
                 <w:b w:val="0"/>
                 <w:color w:val="16243A"/>
                 <w:sz w:val="17"/>
@@ -3703,7 +3703,7 @@
             <w:r/>
             <w:r>
               <w:rPr>
-                <w:rFonts w:ascii="Arial Unicode MS" w:hAnsi="Arial Unicode MS" w:eastAsia="Arial Unicode MS"/>
+                <w:rFonts w:ascii="Apple SD Gothic Neo" w:hAnsi="Apple SD Gothic Neo" w:eastAsia="Apple SD Gothic Neo"/>
                 <w:b w:val="0"/>
                 <w:color w:val="16243A"/>
                 <w:sz w:val="17"/>
@@ -3736,7 +3736,7 @@
             <w:r/>
             <w:r>
               <w:rPr>
-                <w:rFonts w:ascii="Arial Unicode MS" w:hAnsi="Arial Unicode MS" w:eastAsia="Arial Unicode MS"/>
+                <w:rFonts w:ascii="Apple SD Gothic Neo" w:hAnsi="Apple SD Gothic Neo" w:eastAsia="Apple SD Gothic Neo"/>
                 <w:b/>
                 <w:color w:val="16243A"/>
                 <w:sz w:val="17"/>
@@ -3764,7 +3764,7 @@
             <w:r/>
             <w:r>
               <w:rPr>
-                <w:rFonts w:ascii="Arial Unicode MS" w:hAnsi="Arial Unicode MS" w:eastAsia="Arial Unicode MS"/>
+                <w:rFonts w:ascii="Apple SD Gothic Neo" w:hAnsi="Apple SD Gothic Neo" w:eastAsia="Apple SD Gothic Neo"/>
                 <w:b w:val="0"/>
                 <w:color w:val="16243A"/>
                 <w:sz w:val="17"/>
@@ -3792,7 +3792,7 @@
             <w:r/>
             <w:r>
               <w:rPr>
-                <w:rFonts w:ascii="Arial Unicode MS" w:hAnsi="Arial Unicode MS" w:eastAsia="Arial Unicode MS"/>
+                <w:rFonts w:ascii="Apple SD Gothic Neo" w:hAnsi="Apple SD Gothic Neo" w:eastAsia="Apple SD Gothic Neo"/>
                 <w:b w:val="0"/>
                 <w:color w:val="16243A"/>
                 <w:sz w:val="17"/>
@@ -3820,7 +3820,7 @@
             <w:r/>
             <w:r>
               <w:rPr>
-                <w:rFonts w:ascii="Arial Unicode MS" w:hAnsi="Arial Unicode MS" w:eastAsia="Arial Unicode MS"/>
+                <w:rFonts w:ascii="Apple SD Gothic Neo" w:hAnsi="Apple SD Gothic Neo" w:eastAsia="Apple SD Gothic Neo"/>
                 <w:b w:val="0"/>
                 <w:color w:val="16243A"/>
                 <w:sz w:val="17"/>
@@ -3847,7 +3847,7 @@
     <w:p>
       <w:r>
         <w:rPr>
-          <w:rFonts w:ascii="Arial Unicode MS" w:hAnsi="Arial Unicode MS" w:eastAsia="Arial Unicode MS"/>
+          <w:rFonts w:ascii="Apple SD Gothic Neo" w:hAnsi="Apple SD Gothic Neo" w:eastAsia="Apple SD Gothic Neo"/>
           <w:color w:val="16243A"/>
           <w:sz w:val="22"/>
         </w:rPr>
@@ -3896,7 +3896,7 @@
             <w:r/>
             <w:r>
               <w:rPr>
-                <w:rFonts w:ascii="Arial Unicode MS" w:hAnsi="Arial Unicode MS" w:eastAsia="Arial Unicode MS"/>
+                <w:rFonts w:ascii="Apple SD Gothic Neo" w:hAnsi="Apple SD Gothic Neo" w:eastAsia="Apple SD Gothic Neo"/>
                 <w:b/>
                 <w:color w:val="16243A"/>
                 <w:sz w:val="16"/>
@@ -3928,7 +3928,7 @@
             <w:r/>
             <w:r>
               <w:rPr>
-                <w:rFonts w:ascii="Arial Unicode MS" w:hAnsi="Arial Unicode MS" w:eastAsia="Arial Unicode MS"/>
+                <w:rFonts w:ascii="Apple SD Gothic Neo" w:hAnsi="Apple SD Gothic Neo" w:eastAsia="Apple SD Gothic Neo"/>
                 <w:b/>
                 <w:color w:val="16243A"/>
                 <w:sz w:val="16"/>
@@ -3958,7 +3958,7 @@
             <w:r/>
             <w:r>
               <w:rPr>
-                <w:rFonts w:ascii="Arial Unicode MS" w:hAnsi="Arial Unicode MS" w:eastAsia="Arial Unicode MS"/>
+                <w:rFonts w:ascii="Apple SD Gothic Neo" w:hAnsi="Apple SD Gothic Neo" w:eastAsia="Apple SD Gothic Neo"/>
                 <w:b/>
                 <w:color w:val="16243A"/>
                 <w:sz w:val="16"/>
@@ -3988,7 +3988,7 @@
             <w:r/>
             <w:r>
               <w:rPr>
-                <w:rFonts w:ascii="Arial Unicode MS" w:hAnsi="Arial Unicode MS" w:eastAsia="Arial Unicode MS"/>
+                <w:rFonts w:ascii="Apple SD Gothic Neo" w:hAnsi="Apple SD Gothic Neo" w:eastAsia="Apple SD Gothic Neo"/>
                 <w:b/>
                 <w:color w:val="16243A"/>
                 <w:sz w:val="16"/>
@@ -4018,7 +4018,7 @@
             <w:r/>
             <w:r>
               <w:rPr>
-                <w:rFonts w:ascii="Arial Unicode MS" w:hAnsi="Arial Unicode MS" w:eastAsia="Arial Unicode MS"/>
+                <w:rFonts w:ascii="Apple SD Gothic Neo" w:hAnsi="Apple SD Gothic Neo" w:eastAsia="Apple SD Gothic Neo"/>
                 <w:b/>
                 <w:color w:val="16243A"/>
                 <w:sz w:val="16"/>
@@ -4051,7 +4051,7 @@
             <w:r/>
             <w:r>
               <w:rPr>
-                <w:rFonts w:ascii="Arial Unicode MS" w:hAnsi="Arial Unicode MS" w:eastAsia="Arial Unicode MS"/>
+                <w:rFonts w:ascii="Apple SD Gothic Neo" w:hAnsi="Apple SD Gothic Neo" w:eastAsia="Apple SD Gothic Neo"/>
                 <w:b/>
                 <w:color w:val="16243A"/>
                 <w:sz w:val="16"/>
@@ -4081,7 +4081,7 @@
             <w:r/>
             <w:r>
               <w:rPr>
-                <w:rFonts w:ascii="Arial Unicode MS" w:hAnsi="Arial Unicode MS" w:eastAsia="Arial Unicode MS"/>
+                <w:rFonts w:ascii="Apple SD Gothic Neo" w:hAnsi="Apple SD Gothic Neo" w:eastAsia="Apple SD Gothic Neo"/>
                 <w:b w:val="0"/>
                 <w:color w:val="16243A"/>
                 <w:sz w:val="16"/>
@@ -4109,7 +4109,7 @@
             <w:r/>
             <w:r>
               <w:rPr>
-                <w:rFonts w:ascii="Arial Unicode MS" w:hAnsi="Arial Unicode MS" w:eastAsia="Arial Unicode MS"/>
+                <w:rFonts w:ascii="Apple SD Gothic Neo" w:hAnsi="Apple SD Gothic Neo" w:eastAsia="Apple SD Gothic Neo"/>
                 <w:b w:val="0"/>
                 <w:color w:val="16243A"/>
                 <w:sz w:val="16"/>
@@ -4137,7 +4137,7 @@
             <w:r/>
             <w:r>
               <w:rPr>
-                <w:rFonts w:ascii="Arial Unicode MS" w:hAnsi="Arial Unicode MS" w:eastAsia="Arial Unicode MS"/>
+                <w:rFonts w:ascii="Apple SD Gothic Neo" w:hAnsi="Apple SD Gothic Neo" w:eastAsia="Apple SD Gothic Neo"/>
                 <w:b w:val="0"/>
                 <w:color w:val="16243A"/>
                 <w:sz w:val="16"/>
@@ -4165,7 +4165,7 @@
             <w:r/>
             <w:r>
               <w:rPr>
-                <w:rFonts w:ascii="Arial Unicode MS" w:hAnsi="Arial Unicode MS" w:eastAsia="Arial Unicode MS"/>
+                <w:rFonts w:ascii="Apple SD Gothic Neo" w:hAnsi="Apple SD Gothic Neo" w:eastAsia="Apple SD Gothic Neo"/>
                 <w:b w:val="0"/>
                 <w:color w:val="16243A"/>
                 <w:sz w:val="16"/>
@@ -4198,7 +4198,7 @@
             <w:r/>
             <w:r>
               <w:rPr>
-                <w:rFonts w:ascii="Arial Unicode MS" w:hAnsi="Arial Unicode MS" w:eastAsia="Arial Unicode MS"/>
+                <w:rFonts w:ascii="Apple SD Gothic Neo" w:hAnsi="Apple SD Gothic Neo" w:eastAsia="Apple SD Gothic Neo"/>
                 <w:b/>
                 <w:color w:val="16243A"/>
                 <w:sz w:val="16"/>
@@ -4228,7 +4228,7 @@
             <w:r/>
             <w:r>
               <w:rPr>
-                <w:rFonts w:ascii="Arial Unicode MS" w:hAnsi="Arial Unicode MS" w:eastAsia="Arial Unicode MS"/>
+                <w:rFonts w:ascii="Apple SD Gothic Neo" w:hAnsi="Apple SD Gothic Neo" w:eastAsia="Apple SD Gothic Neo"/>
                 <w:b w:val="0"/>
                 <w:color w:val="16243A"/>
                 <w:sz w:val="16"/>
@@ -4256,7 +4256,7 @@
             <w:r/>
             <w:r>
               <w:rPr>
-                <w:rFonts w:ascii="Arial Unicode MS" w:hAnsi="Arial Unicode MS" w:eastAsia="Arial Unicode MS"/>
+                <w:rFonts w:ascii="Apple SD Gothic Neo" w:hAnsi="Apple SD Gothic Neo" w:eastAsia="Apple SD Gothic Neo"/>
                 <w:b w:val="0"/>
                 <w:color w:val="16243A"/>
                 <w:sz w:val="16"/>
@@ -4284,7 +4284,7 @@
             <w:r/>
             <w:r>
               <w:rPr>
-                <w:rFonts w:ascii="Arial Unicode MS" w:hAnsi="Arial Unicode MS" w:eastAsia="Arial Unicode MS"/>
+                <w:rFonts w:ascii="Apple SD Gothic Neo" w:hAnsi="Apple SD Gothic Neo" w:eastAsia="Apple SD Gothic Neo"/>
                 <w:b w:val="0"/>
                 <w:color w:val="16243A"/>
                 <w:sz w:val="16"/>
@@ -4312,7 +4312,7 @@
             <w:r/>
             <w:r>
               <w:rPr>
-                <w:rFonts w:ascii="Arial Unicode MS" w:hAnsi="Arial Unicode MS" w:eastAsia="Arial Unicode MS"/>
+                <w:rFonts w:ascii="Apple SD Gothic Neo" w:hAnsi="Apple SD Gothic Neo" w:eastAsia="Apple SD Gothic Neo"/>
                 <w:b w:val="0"/>
                 <w:color w:val="16243A"/>
                 <w:sz w:val="16"/>
@@ -4345,7 +4345,7 @@
             <w:r/>
             <w:r>
               <w:rPr>
-                <w:rFonts w:ascii="Arial Unicode MS" w:hAnsi="Arial Unicode MS" w:eastAsia="Arial Unicode MS"/>
+                <w:rFonts w:ascii="Apple SD Gothic Neo" w:hAnsi="Apple SD Gothic Neo" w:eastAsia="Apple SD Gothic Neo"/>
                 <w:b/>
                 <w:color w:val="16243A"/>
                 <w:sz w:val="16"/>
@@ -4375,7 +4375,7 @@
             <w:r/>
             <w:r>
               <w:rPr>
-                <w:rFonts w:ascii="Arial Unicode MS" w:hAnsi="Arial Unicode MS" w:eastAsia="Arial Unicode MS"/>
+                <w:rFonts w:ascii="Apple SD Gothic Neo" w:hAnsi="Apple SD Gothic Neo" w:eastAsia="Apple SD Gothic Neo"/>
                 <w:b w:val="0"/>
                 <w:color w:val="16243A"/>
                 <w:sz w:val="16"/>
@@ -4403,7 +4403,7 @@
             <w:r/>
             <w:r>
               <w:rPr>
-                <w:rFonts w:ascii="Arial Unicode MS" w:hAnsi="Arial Unicode MS" w:eastAsia="Arial Unicode MS"/>
+                <w:rFonts w:ascii="Apple SD Gothic Neo" w:hAnsi="Apple SD Gothic Neo" w:eastAsia="Apple SD Gothic Neo"/>
                 <w:b w:val="0"/>
                 <w:color w:val="16243A"/>
                 <w:sz w:val="16"/>
@@ -4431,7 +4431,7 @@
             <w:r/>
             <w:r>
               <w:rPr>
-                <w:rFonts w:ascii="Arial Unicode MS" w:hAnsi="Arial Unicode MS" w:eastAsia="Arial Unicode MS"/>
+                <w:rFonts w:ascii="Apple SD Gothic Neo" w:hAnsi="Apple SD Gothic Neo" w:eastAsia="Apple SD Gothic Neo"/>
                 <w:b w:val="0"/>
                 <w:color w:val="16243A"/>
                 <w:sz w:val="16"/>
@@ -4459,7 +4459,7 @@
             <w:r/>
             <w:r>
               <w:rPr>
-                <w:rFonts w:ascii="Arial Unicode MS" w:hAnsi="Arial Unicode MS" w:eastAsia="Arial Unicode MS"/>
+                <w:rFonts w:ascii="Apple SD Gothic Neo" w:hAnsi="Apple SD Gothic Neo" w:eastAsia="Apple SD Gothic Neo"/>
                 <w:b w:val="0"/>
                 <w:color w:val="16243A"/>
                 <w:sz w:val="16"/>
@@ -4492,7 +4492,7 @@
             <w:r/>
             <w:r>
               <w:rPr>
-                <w:rFonts w:ascii="Arial Unicode MS" w:hAnsi="Arial Unicode MS" w:eastAsia="Arial Unicode MS"/>
+                <w:rFonts w:ascii="Apple SD Gothic Neo" w:hAnsi="Apple SD Gothic Neo" w:eastAsia="Apple SD Gothic Neo"/>
                 <w:b/>
                 <w:color w:val="16243A"/>
                 <w:sz w:val="16"/>
@@ -4522,7 +4522,7 @@
             <w:r/>
             <w:r>
               <w:rPr>
-                <w:rFonts w:ascii="Arial Unicode MS" w:hAnsi="Arial Unicode MS" w:eastAsia="Arial Unicode MS"/>
+                <w:rFonts w:ascii="Apple SD Gothic Neo" w:hAnsi="Apple SD Gothic Neo" w:eastAsia="Apple SD Gothic Neo"/>
                 <w:b w:val="0"/>
                 <w:color w:val="16243A"/>
                 <w:sz w:val="16"/>
@@ -4550,7 +4550,7 @@
             <w:r/>
             <w:r>
               <w:rPr>
-                <w:rFonts w:ascii="Arial Unicode MS" w:hAnsi="Arial Unicode MS" w:eastAsia="Arial Unicode MS"/>
+                <w:rFonts w:ascii="Apple SD Gothic Neo" w:hAnsi="Apple SD Gothic Neo" w:eastAsia="Apple SD Gothic Neo"/>
                 <w:b w:val="0"/>
                 <w:color w:val="16243A"/>
                 <w:sz w:val="16"/>
@@ -4578,7 +4578,7 @@
             <w:r/>
             <w:r>
               <w:rPr>
-                <w:rFonts w:ascii="Arial Unicode MS" w:hAnsi="Arial Unicode MS" w:eastAsia="Arial Unicode MS"/>
+                <w:rFonts w:ascii="Apple SD Gothic Neo" w:hAnsi="Apple SD Gothic Neo" w:eastAsia="Apple SD Gothic Neo"/>
                 <w:b w:val="0"/>
                 <w:color w:val="16243A"/>
                 <w:sz w:val="16"/>
@@ -4606,7 +4606,7 @@
             <w:r/>
             <w:r>
               <w:rPr>
-                <w:rFonts w:ascii="Arial Unicode MS" w:hAnsi="Arial Unicode MS" w:eastAsia="Arial Unicode MS"/>
+                <w:rFonts w:ascii="Apple SD Gothic Neo" w:hAnsi="Apple SD Gothic Neo" w:eastAsia="Apple SD Gothic Neo"/>
                 <w:b w:val="0"/>
                 <w:color w:val="16243A"/>
                 <w:sz w:val="16"/>
@@ -4639,7 +4639,7 @@
             <w:r/>
             <w:r>
               <w:rPr>
-                <w:rFonts w:ascii="Arial Unicode MS" w:hAnsi="Arial Unicode MS" w:eastAsia="Arial Unicode MS"/>
+                <w:rFonts w:ascii="Apple SD Gothic Neo" w:hAnsi="Apple SD Gothic Neo" w:eastAsia="Apple SD Gothic Neo"/>
                 <w:b/>
                 <w:color w:val="16243A"/>
                 <w:sz w:val="16"/>
@@ -4669,7 +4669,7 @@
             <w:r/>
             <w:r>
               <w:rPr>
-                <w:rFonts w:ascii="Arial Unicode MS" w:hAnsi="Arial Unicode MS" w:eastAsia="Arial Unicode MS"/>
+                <w:rFonts w:ascii="Apple SD Gothic Neo" w:hAnsi="Apple SD Gothic Neo" w:eastAsia="Apple SD Gothic Neo"/>
                 <w:b w:val="0"/>
                 <w:color w:val="16243A"/>
                 <w:sz w:val="16"/>
@@ -4697,7 +4697,7 @@
             <w:r/>
             <w:r>
               <w:rPr>
-                <w:rFonts w:ascii="Arial Unicode MS" w:hAnsi="Arial Unicode MS" w:eastAsia="Arial Unicode MS"/>
+                <w:rFonts w:ascii="Apple SD Gothic Neo" w:hAnsi="Apple SD Gothic Neo" w:eastAsia="Apple SD Gothic Neo"/>
                 <w:b w:val="0"/>
                 <w:color w:val="16243A"/>
                 <w:sz w:val="16"/>
@@ -4725,7 +4725,7 @@
             <w:r/>
             <w:r>
               <w:rPr>
-                <w:rFonts w:ascii="Arial Unicode MS" w:hAnsi="Arial Unicode MS" w:eastAsia="Arial Unicode MS"/>
+                <w:rFonts w:ascii="Apple SD Gothic Neo" w:hAnsi="Apple SD Gothic Neo" w:eastAsia="Apple SD Gothic Neo"/>
                 <w:b w:val="0"/>
                 <w:color w:val="16243A"/>
                 <w:sz w:val="16"/>
@@ -4753,7 +4753,7 @@
             <w:r/>
             <w:r>
               <w:rPr>
-                <w:rFonts w:ascii="Arial Unicode MS" w:hAnsi="Arial Unicode MS" w:eastAsia="Arial Unicode MS"/>
+                <w:rFonts w:ascii="Apple SD Gothic Neo" w:hAnsi="Apple SD Gothic Neo" w:eastAsia="Apple SD Gothic Neo"/>
                 <w:b w:val="0"/>
                 <w:color w:val="16243A"/>
                 <w:sz w:val="16"/>
@@ -4818,7 +4818,7 @@
             <w:r/>
             <w:r>
               <w:rPr>
-                <w:rFonts w:ascii="Arial Unicode MS" w:hAnsi="Arial Unicode MS" w:eastAsia="Arial Unicode MS"/>
+                <w:rFonts w:ascii="Apple SD Gothic Neo" w:hAnsi="Apple SD Gothic Neo" w:eastAsia="Apple SD Gothic Neo"/>
                 <w:b/>
                 <w:color w:val="16243A"/>
                 <w:sz w:val="17"/>
@@ -4848,7 +4848,7 @@
             <w:r/>
             <w:r>
               <w:rPr>
-                <w:rFonts w:ascii="Arial Unicode MS" w:hAnsi="Arial Unicode MS" w:eastAsia="Arial Unicode MS"/>
+                <w:rFonts w:ascii="Apple SD Gothic Neo" w:hAnsi="Apple SD Gothic Neo" w:eastAsia="Apple SD Gothic Neo"/>
                 <w:b/>
                 <w:color w:val="16243A"/>
                 <w:sz w:val="17"/>
@@ -4878,7 +4878,7 @@
             <w:r/>
             <w:r>
               <w:rPr>
-                <w:rFonts w:ascii="Arial Unicode MS" w:hAnsi="Arial Unicode MS" w:eastAsia="Arial Unicode MS"/>
+                <w:rFonts w:ascii="Apple SD Gothic Neo" w:hAnsi="Apple SD Gothic Neo" w:eastAsia="Apple SD Gothic Neo"/>
                 <w:b/>
                 <w:color w:val="16243A"/>
                 <w:sz w:val="17"/>
@@ -4908,7 +4908,7 @@
             <w:r/>
             <w:r>
               <w:rPr>
-                <w:rFonts w:ascii="Arial Unicode MS" w:hAnsi="Arial Unicode MS" w:eastAsia="Arial Unicode MS"/>
+                <w:rFonts w:ascii="Apple SD Gothic Neo" w:hAnsi="Apple SD Gothic Neo" w:eastAsia="Apple SD Gothic Neo"/>
                 <w:b/>
                 <w:color w:val="16243A"/>
                 <w:sz w:val="17"/>
@@ -4941,7 +4941,7 @@
             <w:r/>
             <w:r>
               <w:rPr>
-                <w:rFonts w:ascii="Arial Unicode MS" w:hAnsi="Arial Unicode MS" w:eastAsia="Arial Unicode MS"/>
+                <w:rFonts w:ascii="Apple SD Gothic Neo" w:hAnsi="Apple SD Gothic Neo" w:eastAsia="Apple SD Gothic Neo"/>
                 <w:b/>
                 <w:color w:val="16243A"/>
                 <w:sz w:val="17"/>
@@ -4969,7 +4969,7 @@
             <w:r/>
             <w:r>
               <w:rPr>
-                <w:rFonts w:ascii="Arial Unicode MS" w:hAnsi="Arial Unicode MS" w:eastAsia="Arial Unicode MS"/>
+                <w:rFonts w:ascii="Apple SD Gothic Neo" w:hAnsi="Apple SD Gothic Neo" w:eastAsia="Apple SD Gothic Neo"/>
                 <w:b w:val="0"/>
                 <w:color w:val="16243A"/>
                 <w:sz w:val="17"/>
@@ -4997,7 +4997,7 @@
             <w:r/>
             <w:r>
               <w:rPr>
-                <w:rFonts w:ascii="Arial Unicode MS" w:hAnsi="Arial Unicode MS" w:eastAsia="Arial Unicode MS"/>
+                <w:rFonts w:ascii="Apple SD Gothic Neo" w:hAnsi="Apple SD Gothic Neo" w:eastAsia="Apple SD Gothic Neo"/>
                 <w:b w:val="0"/>
                 <w:color w:val="16243A"/>
                 <w:sz w:val="17"/>
@@ -5025,7 +5025,7 @@
             <w:r/>
             <w:r>
               <w:rPr>
-                <w:rFonts w:ascii="Arial Unicode MS" w:hAnsi="Arial Unicode MS" w:eastAsia="Arial Unicode MS"/>
+                <w:rFonts w:ascii="Apple SD Gothic Neo" w:hAnsi="Apple SD Gothic Neo" w:eastAsia="Apple SD Gothic Neo"/>
                 <w:b w:val="0"/>
                 <w:color w:val="16243A"/>
                 <w:sz w:val="17"/>
@@ -5058,7 +5058,7 @@
             <w:r/>
             <w:r>
               <w:rPr>
-                <w:rFonts w:ascii="Arial Unicode MS" w:hAnsi="Arial Unicode MS" w:eastAsia="Arial Unicode MS"/>
+                <w:rFonts w:ascii="Apple SD Gothic Neo" w:hAnsi="Apple SD Gothic Neo" w:eastAsia="Apple SD Gothic Neo"/>
                 <w:b/>
                 <w:color w:val="16243A"/>
                 <w:sz w:val="17"/>
@@ -5086,7 +5086,7 @@
             <w:r/>
             <w:r>
               <w:rPr>
-                <w:rFonts w:ascii="Arial Unicode MS" w:hAnsi="Arial Unicode MS" w:eastAsia="Arial Unicode MS"/>
+                <w:rFonts w:ascii="Apple SD Gothic Neo" w:hAnsi="Apple SD Gothic Neo" w:eastAsia="Apple SD Gothic Neo"/>
                 <w:b w:val="0"/>
                 <w:color w:val="16243A"/>
                 <w:sz w:val="17"/>
@@ -5114,7 +5114,7 @@
             <w:r/>
             <w:r>
               <w:rPr>
-                <w:rFonts w:ascii="Arial Unicode MS" w:hAnsi="Arial Unicode MS" w:eastAsia="Arial Unicode MS"/>
+                <w:rFonts w:ascii="Apple SD Gothic Neo" w:hAnsi="Apple SD Gothic Neo" w:eastAsia="Apple SD Gothic Neo"/>
                 <w:b w:val="0"/>
                 <w:color w:val="16243A"/>
                 <w:sz w:val="17"/>
@@ -5142,7 +5142,7 @@
             <w:r/>
             <w:r>
               <w:rPr>
-                <w:rFonts w:ascii="Arial Unicode MS" w:hAnsi="Arial Unicode MS" w:eastAsia="Arial Unicode MS"/>
+                <w:rFonts w:ascii="Apple SD Gothic Neo" w:hAnsi="Apple SD Gothic Neo" w:eastAsia="Apple SD Gothic Neo"/>
                 <w:b w:val="0"/>
                 <w:color w:val="16243A"/>
                 <w:sz w:val="17"/>
@@ -5175,7 +5175,7 @@
             <w:r/>
             <w:r>
               <w:rPr>
-                <w:rFonts w:ascii="Arial Unicode MS" w:hAnsi="Arial Unicode MS" w:eastAsia="Arial Unicode MS"/>
+                <w:rFonts w:ascii="Apple SD Gothic Neo" w:hAnsi="Apple SD Gothic Neo" w:eastAsia="Apple SD Gothic Neo"/>
                 <w:b/>
                 <w:color w:val="16243A"/>
                 <w:sz w:val="17"/>
@@ -5203,7 +5203,7 @@
             <w:r/>
             <w:r>
               <w:rPr>
-                <w:rFonts w:ascii="Arial Unicode MS" w:hAnsi="Arial Unicode MS" w:eastAsia="Arial Unicode MS"/>
+                <w:rFonts w:ascii="Apple SD Gothic Neo" w:hAnsi="Apple SD Gothic Neo" w:eastAsia="Apple SD Gothic Neo"/>
                 <w:b w:val="0"/>
                 <w:color w:val="16243A"/>
                 <w:sz w:val="17"/>
@@ -5231,7 +5231,7 @@
             <w:r/>
             <w:r>
               <w:rPr>
-                <w:rFonts w:ascii="Arial Unicode MS" w:hAnsi="Arial Unicode MS" w:eastAsia="Arial Unicode MS"/>
+                <w:rFonts w:ascii="Apple SD Gothic Neo" w:hAnsi="Apple SD Gothic Neo" w:eastAsia="Apple SD Gothic Neo"/>
                 <w:b w:val="0"/>
                 <w:color w:val="16243A"/>
                 <w:sz w:val="17"/>
@@ -5259,7 +5259,7 @@
             <w:r/>
             <w:r>
               <w:rPr>
-                <w:rFonts w:ascii="Arial Unicode MS" w:hAnsi="Arial Unicode MS" w:eastAsia="Arial Unicode MS"/>
+                <w:rFonts w:ascii="Apple SD Gothic Neo" w:hAnsi="Apple SD Gothic Neo" w:eastAsia="Apple SD Gothic Neo"/>
                 <w:b w:val="0"/>
                 <w:color w:val="16243A"/>
                 <w:sz w:val="17"/>
@@ -5292,7 +5292,7 @@
             <w:r/>
             <w:r>
               <w:rPr>
-                <w:rFonts w:ascii="Arial Unicode MS" w:hAnsi="Arial Unicode MS" w:eastAsia="Arial Unicode MS"/>
+                <w:rFonts w:ascii="Apple SD Gothic Neo" w:hAnsi="Apple SD Gothic Neo" w:eastAsia="Apple SD Gothic Neo"/>
                 <w:b/>
                 <w:color w:val="16243A"/>
                 <w:sz w:val="17"/>
@@ -5320,7 +5320,7 @@
             <w:r/>
             <w:r>
               <w:rPr>
-                <w:rFonts w:ascii="Arial Unicode MS" w:hAnsi="Arial Unicode MS" w:eastAsia="Arial Unicode MS"/>
+                <w:rFonts w:ascii="Apple SD Gothic Neo" w:hAnsi="Apple SD Gothic Neo" w:eastAsia="Apple SD Gothic Neo"/>
                 <w:b w:val="0"/>
                 <w:color w:val="16243A"/>
                 <w:sz w:val="17"/>
@@ -5348,7 +5348,7 @@
             <w:r/>
             <w:r>
               <w:rPr>
-                <w:rFonts w:ascii="Arial Unicode MS" w:hAnsi="Arial Unicode MS" w:eastAsia="Arial Unicode MS"/>
+                <w:rFonts w:ascii="Apple SD Gothic Neo" w:hAnsi="Apple SD Gothic Neo" w:eastAsia="Apple SD Gothic Neo"/>
                 <w:b w:val="0"/>
                 <w:color w:val="16243A"/>
                 <w:sz w:val="17"/>
@@ -5376,7 +5376,7 @@
             <w:r/>
             <w:r>
               <w:rPr>
-                <w:rFonts w:ascii="Arial Unicode MS" w:hAnsi="Arial Unicode MS" w:eastAsia="Arial Unicode MS"/>
+                <w:rFonts w:ascii="Apple SD Gothic Neo" w:hAnsi="Apple SD Gothic Neo" w:eastAsia="Apple SD Gothic Neo"/>
                 <w:b w:val="0"/>
                 <w:color w:val="16243A"/>
                 <w:sz w:val="17"/>
@@ -5409,7 +5409,7 @@
             <w:r/>
             <w:r>
               <w:rPr>
-                <w:rFonts w:ascii="Arial Unicode MS" w:hAnsi="Arial Unicode MS" w:eastAsia="Arial Unicode MS"/>
+                <w:rFonts w:ascii="Apple SD Gothic Neo" w:hAnsi="Apple SD Gothic Neo" w:eastAsia="Apple SD Gothic Neo"/>
                 <w:b/>
                 <w:color w:val="16243A"/>
                 <w:sz w:val="17"/>
@@ -5437,7 +5437,7 @@
             <w:r/>
             <w:r>
               <w:rPr>
-                <w:rFonts w:ascii="Arial Unicode MS" w:hAnsi="Arial Unicode MS" w:eastAsia="Arial Unicode MS"/>
+                <w:rFonts w:ascii="Apple SD Gothic Neo" w:hAnsi="Apple SD Gothic Neo" w:eastAsia="Apple SD Gothic Neo"/>
                 <w:b w:val="0"/>
                 <w:color w:val="16243A"/>
                 <w:sz w:val="17"/>
@@ -5465,7 +5465,7 @@
             <w:r/>
             <w:r>
               <w:rPr>
-                <w:rFonts w:ascii="Arial Unicode MS" w:hAnsi="Arial Unicode MS" w:eastAsia="Arial Unicode MS"/>
+                <w:rFonts w:ascii="Apple SD Gothic Neo" w:hAnsi="Apple SD Gothic Neo" w:eastAsia="Apple SD Gothic Neo"/>
                 <w:b w:val="0"/>
                 <w:color w:val="16243A"/>
                 <w:sz w:val="17"/>
@@ -5493,7 +5493,7 @@
             <w:r/>
             <w:r>
               <w:rPr>
-                <w:rFonts w:ascii="Arial Unicode MS" w:hAnsi="Arial Unicode MS" w:eastAsia="Arial Unicode MS"/>
+                <w:rFonts w:ascii="Apple SD Gothic Neo" w:hAnsi="Apple SD Gothic Neo" w:eastAsia="Apple SD Gothic Neo"/>
                 <w:b w:val="0"/>
                 <w:color w:val="16243A"/>
                 <w:sz w:val="17"/>
@@ -5558,7 +5558,7 @@
             <w:r/>
             <w:r>
               <w:rPr>
-                <w:rFonts w:ascii="Arial Unicode MS" w:hAnsi="Arial Unicode MS" w:eastAsia="Arial Unicode MS"/>
+                <w:rFonts w:ascii="Apple SD Gothic Neo" w:hAnsi="Apple SD Gothic Neo" w:eastAsia="Apple SD Gothic Neo"/>
                 <w:b/>
                 <w:color w:val="16243A"/>
                 <w:sz w:val="17"/>
@@ -5588,7 +5588,7 @@
             <w:r/>
             <w:r>
               <w:rPr>
-                <w:rFonts w:ascii="Arial Unicode MS" w:hAnsi="Arial Unicode MS" w:eastAsia="Arial Unicode MS"/>
+                <w:rFonts w:ascii="Apple SD Gothic Neo" w:hAnsi="Apple SD Gothic Neo" w:eastAsia="Apple SD Gothic Neo"/>
                 <w:b/>
                 <w:color w:val="16243A"/>
                 <w:sz w:val="17"/>
@@ -5618,7 +5618,7 @@
             <w:r/>
             <w:r>
               <w:rPr>
-                <w:rFonts w:ascii="Arial Unicode MS" w:hAnsi="Arial Unicode MS" w:eastAsia="Arial Unicode MS"/>
+                <w:rFonts w:ascii="Apple SD Gothic Neo" w:hAnsi="Apple SD Gothic Neo" w:eastAsia="Apple SD Gothic Neo"/>
                 <w:b/>
                 <w:color w:val="16243A"/>
                 <w:sz w:val="17"/>
@@ -5648,7 +5648,7 @@
             <w:r/>
             <w:r>
               <w:rPr>
-                <w:rFonts w:ascii="Arial Unicode MS" w:hAnsi="Arial Unicode MS" w:eastAsia="Arial Unicode MS"/>
+                <w:rFonts w:ascii="Apple SD Gothic Neo" w:hAnsi="Apple SD Gothic Neo" w:eastAsia="Apple SD Gothic Neo"/>
                 <w:b/>
                 <w:color w:val="16243A"/>
                 <w:sz w:val="17"/>
@@ -5681,7 +5681,7 @@
             <w:r/>
             <w:r>
               <w:rPr>
-                <w:rFonts w:ascii="Arial Unicode MS" w:hAnsi="Arial Unicode MS" w:eastAsia="Arial Unicode MS"/>
+                <w:rFonts w:ascii="Apple SD Gothic Neo" w:hAnsi="Apple SD Gothic Neo" w:eastAsia="Apple SD Gothic Neo"/>
                 <w:b/>
                 <w:color w:val="16243A"/>
                 <w:sz w:val="17"/>
@@ -5709,7 +5709,7 @@
             <w:r/>
             <w:r>
               <w:rPr>
-                <w:rFonts w:ascii="Arial Unicode MS" w:hAnsi="Arial Unicode MS" w:eastAsia="Arial Unicode MS"/>
+                <w:rFonts w:ascii="Apple SD Gothic Neo" w:hAnsi="Apple SD Gothic Neo" w:eastAsia="Apple SD Gothic Neo"/>
                 <w:b w:val="0"/>
                 <w:color w:val="16243A"/>
                 <w:sz w:val="17"/>
@@ -5737,7 +5737,7 @@
             <w:r/>
             <w:r>
               <w:rPr>
-                <w:rFonts w:ascii="Arial Unicode MS" w:hAnsi="Arial Unicode MS" w:eastAsia="Arial Unicode MS"/>
+                <w:rFonts w:ascii="Apple SD Gothic Neo" w:hAnsi="Apple SD Gothic Neo" w:eastAsia="Apple SD Gothic Neo"/>
                 <w:b w:val="0"/>
                 <w:color w:val="16243A"/>
                 <w:sz w:val="17"/>
@@ -5765,7 +5765,7 @@
             <w:r/>
             <w:r>
               <w:rPr>
-                <w:rFonts w:ascii="Arial Unicode MS" w:hAnsi="Arial Unicode MS" w:eastAsia="Arial Unicode MS"/>
+                <w:rFonts w:ascii="Apple SD Gothic Neo" w:hAnsi="Apple SD Gothic Neo" w:eastAsia="Apple SD Gothic Neo"/>
                 <w:b w:val="0"/>
                 <w:color w:val="16243A"/>
                 <w:sz w:val="17"/>
@@ -5798,7 +5798,7 @@
             <w:r/>
             <w:r>
               <w:rPr>
-                <w:rFonts w:ascii="Arial Unicode MS" w:hAnsi="Arial Unicode MS" w:eastAsia="Arial Unicode MS"/>
+                <w:rFonts w:ascii="Apple SD Gothic Neo" w:hAnsi="Apple SD Gothic Neo" w:eastAsia="Apple SD Gothic Neo"/>
                 <w:b/>
                 <w:color w:val="16243A"/>
                 <w:sz w:val="17"/>
@@ -5826,7 +5826,7 @@
             <w:r/>
             <w:r>
               <w:rPr>
-                <w:rFonts w:ascii="Arial Unicode MS" w:hAnsi="Arial Unicode MS" w:eastAsia="Arial Unicode MS"/>
+                <w:rFonts w:ascii="Apple SD Gothic Neo" w:hAnsi="Apple SD Gothic Neo" w:eastAsia="Apple SD Gothic Neo"/>
                 <w:b w:val="0"/>
                 <w:color w:val="16243A"/>
                 <w:sz w:val="17"/>
@@ -5854,7 +5854,7 @@
             <w:r/>
             <w:r>
               <w:rPr>
-                <w:rFonts w:ascii="Arial Unicode MS" w:hAnsi="Arial Unicode MS" w:eastAsia="Arial Unicode MS"/>
+                <w:rFonts w:ascii="Apple SD Gothic Neo" w:hAnsi="Apple SD Gothic Neo" w:eastAsia="Apple SD Gothic Neo"/>
                 <w:b w:val="0"/>
                 <w:color w:val="16243A"/>
                 <w:sz w:val="17"/>
@@ -5882,7 +5882,7 @@
             <w:r/>
             <w:r>
               <w:rPr>
-                <w:rFonts w:ascii="Arial Unicode MS" w:hAnsi="Arial Unicode MS" w:eastAsia="Arial Unicode MS"/>
+                <w:rFonts w:ascii="Apple SD Gothic Neo" w:hAnsi="Apple SD Gothic Neo" w:eastAsia="Apple SD Gothic Neo"/>
                 <w:b w:val="0"/>
                 <w:color w:val="16243A"/>
                 <w:sz w:val="17"/>
@@ -5915,7 +5915,7 @@
             <w:r/>
             <w:r>
               <w:rPr>
-                <w:rFonts w:ascii="Arial Unicode MS" w:hAnsi="Arial Unicode MS" w:eastAsia="Arial Unicode MS"/>
+                <w:rFonts w:ascii="Apple SD Gothic Neo" w:hAnsi="Apple SD Gothic Neo" w:eastAsia="Apple SD Gothic Neo"/>
                 <w:b/>
                 <w:color w:val="16243A"/>
                 <w:sz w:val="17"/>
@@ -5943,7 +5943,7 @@
             <w:r/>
             <w:r>
               <w:rPr>
-                <w:rFonts w:ascii="Arial Unicode MS" w:hAnsi="Arial Unicode MS" w:eastAsia="Arial Unicode MS"/>
+                <w:rFonts w:ascii="Apple SD Gothic Neo" w:hAnsi="Apple SD Gothic Neo" w:eastAsia="Apple SD Gothic Neo"/>
                 <w:b w:val="0"/>
                 <w:color w:val="16243A"/>
                 <w:sz w:val="17"/>
@@ -5971,7 +5971,7 @@
             <w:r/>
             <w:r>
               <w:rPr>
-                <w:rFonts w:ascii="Arial Unicode MS" w:hAnsi="Arial Unicode MS" w:eastAsia="Arial Unicode MS"/>
+                <w:rFonts w:ascii="Apple SD Gothic Neo" w:hAnsi="Apple SD Gothic Neo" w:eastAsia="Apple SD Gothic Neo"/>
                 <w:b w:val="0"/>
                 <w:color w:val="16243A"/>
                 <w:sz w:val="17"/>
@@ -5999,7 +5999,7 @@
             <w:r/>
             <w:r>
               <w:rPr>
-                <w:rFonts w:ascii="Arial Unicode MS" w:hAnsi="Arial Unicode MS" w:eastAsia="Arial Unicode MS"/>
+                <w:rFonts w:ascii="Apple SD Gothic Neo" w:hAnsi="Apple SD Gothic Neo" w:eastAsia="Apple SD Gothic Neo"/>
                 <w:b w:val="0"/>
                 <w:color w:val="16243A"/>
                 <w:sz w:val="17"/>
@@ -6032,7 +6032,7 @@
             <w:r/>
             <w:r>
               <w:rPr>
-                <w:rFonts w:ascii="Arial Unicode MS" w:hAnsi="Arial Unicode MS" w:eastAsia="Arial Unicode MS"/>
+                <w:rFonts w:ascii="Apple SD Gothic Neo" w:hAnsi="Apple SD Gothic Neo" w:eastAsia="Apple SD Gothic Neo"/>
                 <w:b/>
                 <w:color w:val="16243A"/>
                 <w:sz w:val="17"/>
@@ -6060,7 +6060,7 @@
             <w:r/>
             <w:r>
               <w:rPr>
-                <w:rFonts w:ascii="Arial Unicode MS" w:hAnsi="Arial Unicode MS" w:eastAsia="Arial Unicode MS"/>
+                <w:rFonts w:ascii="Apple SD Gothic Neo" w:hAnsi="Apple SD Gothic Neo" w:eastAsia="Apple SD Gothic Neo"/>
                 <w:b w:val="0"/>
                 <w:color w:val="16243A"/>
                 <w:sz w:val="17"/>
@@ -6088,7 +6088,7 @@
             <w:r/>
             <w:r>
               <w:rPr>
-                <w:rFonts w:ascii="Arial Unicode MS" w:hAnsi="Arial Unicode MS" w:eastAsia="Arial Unicode MS"/>
+                <w:rFonts w:ascii="Apple SD Gothic Neo" w:hAnsi="Apple SD Gothic Neo" w:eastAsia="Apple SD Gothic Neo"/>
                 <w:b w:val="0"/>
                 <w:color w:val="16243A"/>
                 <w:sz w:val="17"/>
@@ -6116,7 +6116,7 @@
             <w:r/>
             <w:r>
               <w:rPr>
-                <w:rFonts w:ascii="Arial Unicode MS" w:hAnsi="Arial Unicode MS" w:eastAsia="Arial Unicode MS"/>
+                <w:rFonts w:ascii="Apple SD Gothic Neo" w:hAnsi="Apple SD Gothic Neo" w:eastAsia="Apple SD Gothic Neo"/>
                 <w:b w:val="0"/>
                 <w:color w:val="16243A"/>
                 <w:sz w:val="17"/>
@@ -6149,7 +6149,7 @@
             <w:r/>
             <w:r>
               <w:rPr>
-                <w:rFonts w:ascii="Arial Unicode MS" w:hAnsi="Arial Unicode MS" w:eastAsia="Arial Unicode MS"/>
+                <w:rFonts w:ascii="Apple SD Gothic Neo" w:hAnsi="Apple SD Gothic Neo" w:eastAsia="Apple SD Gothic Neo"/>
                 <w:b/>
                 <w:color w:val="16243A"/>
                 <w:sz w:val="17"/>
@@ -6177,7 +6177,7 @@
             <w:r/>
             <w:r>
               <w:rPr>
-                <w:rFonts w:ascii="Arial Unicode MS" w:hAnsi="Arial Unicode MS" w:eastAsia="Arial Unicode MS"/>
+                <w:rFonts w:ascii="Apple SD Gothic Neo" w:hAnsi="Apple SD Gothic Neo" w:eastAsia="Apple SD Gothic Neo"/>
                 <w:b w:val="0"/>
                 <w:color w:val="16243A"/>
                 <w:sz w:val="17"/>
@@ -6205,7 +6205,7 @@
             <w:r/>
             <w:r>
               <w:rPr>
-                <w:rFonts w:ascii="Arial Unicode MS" w:hAnsi="Arial Unicode MS" w:eastAsia="Arial Unicode MS"/>
+                <w:rFonts w:ascii="Apple SD Gothic Neo" w:hAnsi="Apple SD Gothic Neo" w:eastAsia="Apple SD Gothic Neo"/>
                 <w:b w:val="0"/>
                 <w:color w:val="16243A"/>
                 <w:sz w:val="17"/>
@@ -6233,7 +6233,7 @@
             <w:r/>
             <w:r>
               <w:rPr>
-                <w:rFonts w:ascii="Arial Unicode MS" w:hAnsi="Arial Unicode MS" w:eastAsia="Arial Unicode MS"/>
+                <w:rFonts w:ascii="Apple SD Gothic Neo" w:hAnsi="Apple SD Gothic Neo" w:eastAsia="Apple SD Gothic Neo"/>
                 <w:b w:val="0"/>
                 <w:color w:val="16243A"/>
                 <w:sz w:val="17"/>
@@ -6266,7 +6266,7 @@
             <w:r/>
             <w:r>
               <w:rPr>
-                <w:rFonts w:ascii="Arial Unicode MS" w:hAnsi="Arial Unicode MS" w:eastAsia="Arial Unicode MS"/>
+                <w:rFonts w:ascii="Apple SD Gothic Neo" w:hAnsi="Apple SD Gothic Neo" w:eastAsia="Apple SD Gothic Neo"/>
                 <w:b/>
                 <w:color w:val="16243A"/>
                 <w:sz w:val="17"/>
@@ -6294,7 +6294,7 @@
             <w:r/>
             <w:r>
               <w:rPr>
-                <w:rFonts w:ascii="Arial Unicode MS" w:hAnsi="Arial Unicode MS" w:eastAsia="Arial Unicode MS"/>
+                <w:rFonts w:ascii="Apple SD Gothic Neo" w:hAnsi="Apple SD Gothic Neo" w:eastAsia="Apple SD Gothic Neo"/>
                 <w:b w:val="0"/>
                 <w:color w:val="16243A"/>
                 <w:sz w:val="17"/>
@@ -6322,7 +6322,7 @@
             <w:r/>
             <w:r>
               <w:rPr>
-                <w:rFonts w:ascii="Arial Unicode MS" w:hAnsi="Arial Unicode MS" w:eastAsia="Arial Unicode MS"/>
+                <w:rFonts w:ascii="Apple SD Gothic Neo" w:hAnsi="Apple SD Gothic Neo" w:eastAsia="Apple SD Gothic Neo"/>
                 <w:b w:val="0"/>
                 <w:color w:val="16243A"/>
                 <w:sz w:val="17"/>
@@ -6350,7 +6350,7 @@
             <w:r/>
             <w:r>
               <w:rPr>
-                <w:rFonts w:ascii="Arial Unicode MS" w:hAnsi="Arial Unicode MS" w:eastAsia="Arial Unicode MS"/>
+                <w:rFonts w:ascii="Apple SD Gothic Neo" w:hAnsi="Apple SD Gothic Neo" w:eastAsia="Apple SD Gothic Neo"/>
                 <w:b w:val="0"/>
                 <w:color w:val="16243A"/>
                 <w:sz w:val="17"/>
@@ -6415,7 +6415,7 @@
             <w:r/>
             <w:r>
               <w:rPr>
-                <w:rFonts w:ascii="Arial Unicode MS" w:hAnsi="Arial Unicode MS" w:eastAsia="Arial Unicode MS"/>
+                <w:rFonts w:ascii="Apple SD Gothic Neo" w:hAnsi="Apple SD Gothic Neo" w:eastAsia="Apple SD Gothic Neo"/>
                 <w:b/>
                 <w:color w:val="16243A"/>
                 <w:sz w:val="17"/>
@@ -6445,7 +6445,7 @@
             <w:r/>
             <w:r>
               <w:rPr>
-                <w:rFonts w:ascii="Arial Unicode MS" w:hAnsi="Arial Unicode MS" w:eastAsia="Arial Unicode MS"/>
+                <w:rFonts w:ascii="Apple SD Gothic Neo" w:hAnsi="Apple SD Gothic Neo" w:eastAsia="Apple SD Gothic Neo"/>
                 <w:b/>
                 <w:color w:val="16243A"/>
                 <w:sz w:val="17"/>
@@ -6475,7 +6475,7 @@
             <w:r/>
             <w:r>
               <w:rPr>
-                <w:rFonts w:ascii="Arial Unicode MS" w:hAnsi="Arial Unicode MS" w:eastAsia="Arial Unicode MS"/>
+                <w:rFonts w:ascii="Apple SD Gothic Neo" w:hAnsi="Apple SD Gothic Neo" w:eastAsia="Apple SD Gothic Neo"/>
                 <w:b/>
                 <w:color w:val="16243A"/>
                 <w:sz w:val="17"/>
@@ -6505,7 +6505,7 @@
             <w:r/>
             <w:r>
               <w:rPr>
-                <w:rFonts w:ascii="Arial Unicode MS" w:hAnsi="Arial Unicode MS" w:eastAsia="Arial Unicode MS"/>
+                <w:rFonts w:ascii="Apple SD Gothic Neo" w:hAnsi="Apple SD Gothic Neo" w:eastAsia="Apple SD Gothic Neo"/>
                 <w:b/>
                 <w:color w:val="16243A"/>
                 <w:sz w:val="17"/>
@@ -6538,7 +6538,7 @@
             <w:r/>
             <w:r>
               <w:rPr>
-                <w:rFonts w:ascii="Arial Unicode MS" w:hAnsi="Arial Unicode MS" w:eastAsia="Arial Unicode MS"/>
+                <w:rFonts w:ascii="Apple SD Gothic Neo" w:hAnsi="Apple SD Gothic Neo" w:eastAsia="Apple SD Gothic Neo"/>
                 <w:b/>
                 <w:color w:val="16243A"/>
                 <w:sz w:val="17"/>
@@ -6566,7 +6566,7 @@
             <w:r/>
             <w:r>
               <w:rPr>
-                <w:rFonts w:ascii="Arial Unicode MS" w:hAnsi="Arial Unicode MS" w:eastAsia="Arial Unicode MS"/>
+                <w:rFonts w:ascii="Apple SD Gothic Neo" w:hAnsi="Apple SD Gothic Neo" w:eastAsia="Apple SD Gothic Neo"/>
                 <w:b w:val="0"/>
                 <w:color w:val="16243A"/>
                 <w:sz w:val="17"/>
@@ -6594,7 +6594,7 @@
             <w:r/>
             <w:r>
               <w:rPr>
-                <w:rFonts w:ascii="Arial Unicode MS" w:hAnsi="Arial Unicode MS" w:eastAsia="Arial Unicode MS"/>
+                <w:rFonts w:ascii="Apple SD Gothic Neo" w:hAnsi="Apple SD Gothic Neo" w:eastAsia="Apple SD Gothic Neo"/>
                 <w:b w:val="0"/>
                 <w:color w:val="16243A"/>
                 <w:sz w:val="17"/>
@@ -6622,7 +6622,7 @@
             <w:r/>
             <w:r>
               <w:rPr>
-                <w:rFonts w:ascii="Arial Unicode MS" w:hAnsi="Arial Unicode MS" w:eastAsia="Arial Unicode MS"/>
+                <w:rFonts w:ascii="Apple SD Gothic Neo" w:hAnsi="Apple SD Gothic Neo" w:eastAsia="Apple SD Gothic Neo"/>
                 <w:b w:val="0"/>
                 <w:color w:val="16243A"/>
                 <w:sz w:val="17"/>
@@ -6655,7 +6655,7 @@
             <w:r/>
             <w:r>
               <w:rPr>
-                <w:rFonts w:ascii="Arial Unicode MS" w:hAnsi="Arial Unicode MS" w:eastAsia="Arial Unicode MS"/>
+                <w:rFonts w:ascii="Apple SD Gothic Neo" w:hAnsi="Apple SD Gothic Neo" w:eastAsia="Apple SD Gothic Neo"/>
                 <w:b/>
                 <w:color w:val="16243A"/>
                 <w:sz w:val="17"/>
@@ -6683,7 +6683,7 @@
             <w:r/>
             <w:r>
               <w:rPr>
-                <w:rFonts w:ascii="Arial Unicode MS" w:hAnsi="Arial Unicode MS" w:eastAsia="Arial Unicode MS"/>
+                <w:rFonts w:ascii="Apple SD Gothic Neo" w:hAnsi="Apple SD Gothic Neo" w:eastAsia="Apple SD Gothic Neo"/>
                 <w:b w:val="0"/>
                 <w:color w:val="16243A"/>
                 <w:sz w:val="17"/>
@@ -6711,7 +6711,7 @@
             <w:r/>
             <w:r>
               <w:rPr>
-                <w:rFonts w:ascii="Arial Unicode MS" w:hAnsi="Arial Unicode MS" w:eastAsia="Arial Unicode MS"/>
+                <w:rFonts w:ascii="Apple SD Gothic Neo" w:hAnsi="Apple SD Gothic Neo" w:eastAsia="Apple SD Gothic Neo"/>
                 <w:b w:val="0"/>
                 <w:color w:val="16243A"/>
                 <w:sz w:val="17"/>
@@ -6739,7 +6739,7 @@
             <w:r/>
             <w:r>
               <w:rPr>
-                <w:rFonts w:ascii="Arial Unicode MS" w:hAnsi="Arial Unicode MS" w:eastAsia="Arial Unicode MS"/>
+                <w:rFonts w:ascii="Apple SD Gothic Neo" w:hAnsi="Apple SD Gothic Neo" w:eastAsia="Apple SD Gothic Neo"/>
                 <w:b w:val="0"/>
                 <w:color w:val="16243A"/>
                 <w:sz w:val="17"/>
@@ -6772,7 +6772,7 @@
             <w:r/>
             <w:r>
               <w:rPr>
-                <w:rFonts w:ascii="Arial Unicode MS" w:hAnsi="Arial Unicode MS" w:eastAsia="Arial Unicode MS"/>
+                <w:rFonts w:ascii="Apple SD Gothic Neo" w:hAnsi="Apple SD Gothic Neo" w:eastAsia="Apple SD Gothic Neo"/>
                 <w:b/>
                 <w:color w:val="16243A"/>
                 <w:sz w:val="17"/>
@@ -6800,7 +6800,7 @@
             <w:r/>
             <w:r>
               <w:rPr>
-                <w:rFonts w:ascii="Arial Unicode MS" w:hAnsi="Arial Unicode MS" w:eastAsia="Arial Unicode MS"/>
+                <w:rFonts w:ascii="Apple SD Gothic Neo" w:hAnsi="Apple SD Gothic Neo" w:eastAsia="Apple SD Gothic Neo"/>
                 <w:b w:val="0"/>
                 <w:color w:val="16243A"/>
                 <w:sz w:val="17"/>
@@ -6828,7 +6828,7 @@
             <w:r/>
             <w:r>
               <w:rPr>
-                <w:rFonts w:ascii="Arial Unicode MS" w:hAnsi="Arial Unicode MS" w:eastAsia="Arial Unicode MS"/>
+                <w:rFonts w:ascii="Apple SD Gothic Neo" w:hAnsi="Apple SD Gothic Neo" w:eastAsia="Apple SD Gothic Neo"/>
                 <w:b w:val="0"/>
                 <w:color w:val="16243A"/>
                 <w:sz w:val="17"/>
@@ -6856,7 +6856,7 @@
             <w:r/>
             <w:r>
               <w:rPr>
-                <w:rFonts w:ascii="Arial Unicode MS" w:hAnsi="Arial Unicode MS" w:eastAsia="Arial Unicode MS"/>
+                <w:rFonts w:ascii="Apple SD Gothic Neo" w:hAnsi="Apple SD Gothic Neo" w:eastAsia="Apple SD Gothic Neo"/>
                 <w:b w:val="0"/>
                 <w:color w:val="16243A"/>
                 <w:sz w:val="17"/>
@@ -6889,7 +6889,7 @@
             <w:r/>
             <w:r>
               <w:rPr>
-                <w:rFonts w:ascii="Arial Unicode MS" w:hAnsi="Arial Unicode MS" w:eastAsia="Arial Unicode MS"/>
+                <w:rFonts w:ascii="Apple SD Gothic Neo" w:hAnsi="Apple SD Gothic Neo" w:eastAsia="Apple SD Gothic Neo"/>
                 <w:b/>
                 <w:color w:val="16243A"/>
                 <w:sz w:val="17"/>
@@ -6917,7 +6917,7 @@
             <w:r/>
             <w:r>
               <w:rPr>
-                <w:rFonts w:ascii="Arial Unicode MS" w:hAnsi="Arial Unicode MS" w:eastAsia="Arial Unicode MS"/>
+                <w:rFonts w:ascii="Apple SD Gothic Neo" w:hAnsi="Apple SD Gothic Neo" w:eastAsia="Apple SD Gothic Neo"/>
                 <w:b w:val="0"/>
                 <w:color w:val="16243A"/>
                 <w:sz w:val="17"/>
@@ -6945,7 +6945,7 @@
             <w:r/>
             <w:r>
               <w:rPr>
-                <w:rFonts w:ascii="Arial Unicode MS" w:hAnsi="Arial Unicode MS" w:eastAsia="Arial Unicode MS"/>
+                <w:rFonts w:ascii="Apple SD Gothic Neo" w:hAnsi="Apple SD Gothic Neo" w:eastAsia="Apple SD Gothic Neo"/>
                 <w:b w:val="0"/>
                 <w:color w:val="16243A"/>
                 <w:sz w:val="17"/>
@@ -6973,7 +6973,7 @@
             <w:r/>
             <w:r>
               <w:rPr>
-                <w:rFonts w:ascii="Arial Unicode MS" w:hAnsi="Arial Unicode MS" w:eastAsia="Arial Unicode MS"/>
+                <w:rFonts w:ascii="Apple SD Gothic Neo" w:hAnsi="Apple SD Gothic Neo" w:eastAsia="Apple SD Gothic Neo"/>
                 <w:b w:val="0"/>
                 <w:color w:val="16243A"/>
                 <w:sz w:val="17"/>
@@ -7005,7 +7005,7 @@
     <w:p>
       <w:r>
         <w:rPr>
-          <w:rFonts w:ascii="Arial Unicode MS" w:hAnsi="Arial Unicode MS" w:eastAsia="Arial Unicode MS"/>
+          <w:rFonts w:ascii="Apple SD Gothic Neo" w:hAnsi="Apple SD Gothic Neo" w:eastAsia="Apple SD Gothic Neo"/>
           <w:color w:val="16243A"/>
           <w:sz w:val="22"/>
         </w:rPr>
@@ -7052,7 +7052,7 @@
             <w:r/>
             <w:r>
               <w:rPr>
-                <w:rFonts w:ascii="Arial Unicode MS" w:hAnsi="Arial Unicode MS" w:eastAsia="Arial Unicode MS"/>
+                <w:rFonts w:ascii="Apple SD Gothic Neo" w:hAnsi="Apple SD Gothic Neo" w:eastAsia="Apple SD Gothic Neo"/>
                 <w:b/>
                 <w:color w:val="16243A"/>
                 <w:sz w:val="18"/>
@@ -7082,7 +7082,7 @@
             <w:r/>
             <w:r>
               <w:rPr>
-                <w:rFonts w:ascii="Arial Unicode MS" w:hAnsi="Arial Unicode MS" w:eastAsia="Arial Unicode MS"/>
+                <w:rFonts w:ascii="Apple SD Gothic Neo" w:hAnsi="Apple SD Gothic Neo" w:eastAsia="Apple SD Gothic Neo"/>
                 <w:b/>
                 <w:color w:val="16243A"/>
                 <w:sz w:val="18"/>
@@ -7112,7 +7112,7 @@
             <w:r/>
             <w:r>
               <w:rPr>
-                <w:rFonts w:ascii="Arial Unicode MS" w:hAnsi="Arial Unicode MS" w:eastAsia="Arial Unicode MS"/>
+                <w:rFonts w:ascii="Apple SD Gothic Neo" w:hAnsi="Apple SD Gothic Neo" w:eastAsia="Apple SD Gothic Neo"/>
                 <w:b/>
                 <w:color w:val="16243A"/>
                 <w:sz w:val="18"/>
@@ -7145,7 +7145,7 @@
             <w:r/>
             <w:r>
               <w:rPr>
-                <w:rFonts w:ascii="Arial Unicode MS" w:hAnsi="Arial Unicode MS" w:eastAsia="Arial Unicode MS"/>
+                <w:rFonts w:ascii="Apple SD Gothic Neo" w:hAnsi="Apple SD Gothic Neo" w:eastAsia="Apple SD Gothic Neo"/>
                 <w:b/>
                 <w:color w:val="16243A"/>
                 <w:sz w:val="18"/>
@@ -7173,7 +7173,7 @@
             <w:r/>
             <w:r>
               <w:rPr>
-                <w:rFonts w:ascii="Arial Unicode MS" w:hAnsi="Arial Unicode MS" w:eastAsia="Arial Unicode MS"/>
+                <w:rFonts w:ascii="Apple SD Gothic Neo" w:hAnsi="Apple SD Gothic Neo" w:eastAsia="Apple SD Gothic Neo"/>
                 <w:b w:val="0"/>
                 <w:color w:val="16243A"/>
                 <w:sz w:val="18"/>
@@ -7201,7 +7201,7 @@
             <w:r/>
             <w:r>
               <w:rPr>
-                <w:rFonts w:ascii="Arial Unicode MS" w:hAnsi="Arial Unicode MS" w:eastAsia="Arial Unicode MS"/>
+                <w:rFonts w:ascii="Apple SD Gothic Neo" w:hAnsi="Apple SD Gothic Neo" w:eastAsia="Apple SD Gothic Neo"/>
                 <w:b w:val="0"/>
                 <w:color w:val="16243A"/>
                 <w:sz w:val="18"/>
@@ -7234,7 +7234,7 @@
             <w:r/>
             <w:r>
               <w:rPr>
-                <w:rFonts w:ascii="Arial Unicode MS" w:hAnsi="Arial Unicode MS" w:eastAsia="Arial Unicode MS"/>
+                <w:rFonts w:ascii="Apple SD Gothic Neo" w:hAnsi="Apple SD Gothic Neo" w:eastAsia="Apple SD Gothic Neo"/>
                 <w:b/>
                 <w:color w:val="16243A"/>
                 <w:sz w:val="18"/>
@@ -7262,12 +7262,12 @@
             <w:r/>
             <w:r>
               <w:rPr>
-                <w:rFonts w:ascii="Arial Unicode MS" w:hAnsi="Arial Unicode MS" w:eastAsia="Arial Unicode MS"/>
+                <w:rFonts w:ascii="Apple SD Gothic Neo" w:hAnsi="Apple SD Gothic Neo" w:eastAsia="Apple SD Gothic Neo"/>
                 <w:b w:val="0"/>
                 <w:color w:val="16243A"/>
                 <w:sz w:val="18"/>
               </w:rPr>
-              <w:t>회사·관할 필수 표시정보 누락</w:t>
+              <w:t>표시 주체·관할 필수 표시정보 누락</w:t>
             </w:r>
           </w:p>
         </w:tc>
@@ -7290,12 +7290,12 @@
             <w:r/>
             <w:r>
               <w:rPr>
-                <w:rFonts w:ascii="Arial Unicode MS" w:hAnsi="Arial Unicode MS" w:eastAsia="Arial Unicode MS"/>
+                <w:rFonts w:ascii="Apple SD Gothic Neo" w:hAnsi="Apple SD Gothic Neo" w:eastAsia="Apple SD Gothic Neo"/>
                 <w:b w:val="0"/>
                 <w:color w:val="16243A"/>
                 <w:sz w:val="18"/>
               </w:rPr>
-              <w:t>미리보기 가능 여부와 무관하게 공개 발행 차단</w:t>
+              <w:t>초안 생성·미리보기 허용, 공개 발행 차단</w:t>
             </w:r>
           </w:p>
         </w:tc>
@@ -7323,7 +7323,7 @@
             <w:r/>
             <w:r>
               <w:rPr>
-                <w:rFonts w:ascii="Arial Unicode MS" w:hAnsi="Arial Unicode MS" w:eastAsia="Arial Unicode MS"/>
+                <w:rFonts w:ascii="Apple SD Gothic Neo" w:hAnsi="Apple SD Gothic Neo" w:eastAsia="Apple SD Gothic Neo"/>
                 <w:b/>
                 <w:color w:val="16243A"/>
                 <w:sz w:val="18"/>
@@ -7351,7 +7351,7 @@
             <w:r/>
             <w:r>
               <w:rPr>
-                <w:rFonts w:ascii="Arial Unicode MS" w:hAnsi="Arial Unicode MS" w:eastAsia="Arial Unicode MS"/>
+                <w:rFonts w:ascii="Apple SD Gothic Neo" w:hAnsi="Apple SD Gothic Neo" w:eastAsia="Apple SD Gothic Neo"/>
                 <w:b w:val="0"/>
                 <w:color w:val="16243A"/>
                 <w:sz w:val="18"/>
@@ -7379,7 +7379,7 @@
             <w:r/>
             <w:r>
               <w:rPr>
-                <w:rFonts w:ascii="Arial Unicode MS" w:hAnsi="Arial Unicode MS" w:eastAsia="Arial Unicode MS"/>
+                <w:rFonts w:ascii="Apple SD Gothic Neo" w:hAnsi="Apple SD Gothic Neo" w:eastAsia="Apple SD Gothic Neo"/>
                 <w:b w:val="0"/>
                 <w:color w:val="16243A"/>
                 <w:sz w:val="18"/>
@@ -7412,7 +7412,7 @@
             <w:r/>
             <w:r>
               <w:rPr>
-                <w:rFonts w:ascii="Arial Unicode MS" w:hAnsi="Arial Unicode MS" w:eastAsia="Arial Unicode MS"/>
+                <w:rFonts w:ascii="Apple SD Gothic Neo" w:hAnsi="Apple SD Gothic Neo" w:eastAsia="Apple SD Gothic Neo"/>
                 <w:b/>
                 <w:color w:val="16243A"/>
                 <w:sz w:val="18"/>
@@ -7440,7 +7440,7 @@
             <w:r/>
             <w:r>
               <w:rPr>
-                <w:rFonts w:ascii="Arial Unicode MS" w:hAnsi="Arial Unicode MS" w:eastAsia="Arial Unicode MS"/>
+                <w:rFonts w:ascii="Apple SD Gothic Neo" w:hAnsi="Apple SD Gothic Neo" w:eastAsia="Apple SD Gothic Neo"/>
                 <w:b w:val="0"/>
                 <w:color w:val="16243A"/>
                 <w:sz w:val="18"/>
@@ -7468,7 +7468,7 @@
             <w:r/>
             <w:r>
               <w:rPr>
-                <w:rFonts w:ascii="Arial Unicode MS" w:hAnsi="Arial Unicode MS" w:eastAsia="Arial Unicode MS"/>
+                <w:rFonts w:ascii="Apple SD Gothic Neo" w:hAnsi="Apple SD Gothic Neo" w:eastAsia="Apple SD Gothic Neo"/>
                 <w:b w:val="0"/>
                 <w:color w:val="16243A"/>
                 <w:sz w:val="18"/>
@@ -7501,7 +7501,7 @@
             <w:r/>
             <w:r>
               <w:rPr>
-                <w:rFonts w:ascii="Arial Unicode MS" w:hAnsi="Arial Unicode MS" w:eastAsia="Arial Unicode MS"/>
+                <w:rFonts w:ascii="Apple SD Gothic Neo" w:hAnsi="Apple SD Gothic Neo" w:eastAsia="Apple SD Gothic Neo"/>
                 <w:b/>
                 <w:color w:val="16243A"/>
                 <w:sz w:val="18"/>
@@ -7529,7 +7529,7 @@
             <w:r/>
             <w:r>
               <w:rPr>
-                <w:rFonts w:ascii="Arial Unicode MS" w:hAnsi="Arial Unicode MS" w:eastAsia="Arial Unicode MS"/>
+                <w:rFonts w:ascii="Apple SD Gothic Neo" w:hAnsi="Apple SD Gothic Neo" w:eastAsia="Apple SD Gothic Neo"/>
                 <w:b w:val="0"/>
                 <w:color w:val="16243A"/>
                 <w:sz w:val="18"/>
@@ -7557,7 +7557,7 @@
             <w:r/>
             <w:r>
               <w:rPr>
-                <w:rFonts w:ascii="Arial Unicode MS" w:hAnsi="Arial Unicode MS" w:eastAsia="Arial Unicode MS"/>
+                <w:rFonts w:ascii="Apple SD Gothic Neo" w:hAnsi="Apple SD Gothic Neo" w:eastAsia="Apple SD Gothic Neo"/>
                 <w:b w:val="0"/>
                 <w:color w:val="16243A"/>
                 <w:sz w:val="18"/>
@@ -7590,7 +7590,7 @@
             <w:r/>
             <w:r>
               <w:rPr>
-                <w:rFonts w:ascii="Arial Unicode MS" w:hAnsi="Arial Unicode MS" w:eastAsia="Arial Unicode MS"/>
+                <w:rFonts w:ascii="Apple SD Gothic Neo" w:hAnsi="Apple SD Gothic Neo" w:eastAsia="Apple SD Gothic Neo"/>
                 <w:b/>
                 <w:color w:val="16243A"/>
                 <w:sz w:val="18"/>
@@ -7618,7 +7618,7 @@
             <w:r/>
             <w:r>
               <w:rPr>
-                <w:rFonts w:ascii="Arial Unicode MS" w:hAnsi="Arial Unicode MS" w:eastAsia="Arial Unicode MS"/>
+                <w:rFonts w:ascii="Apple SD Gothic Neo" w:hAnsi="Apple SD Gothic Neo" w:eastAsia="Apple SD Gothic Neo"/>
                 <w:b w:val="0"/>
                 <w:color w:val="16243A"/>
                 <w:sz w:val="18"/>
@@ -7646,7 +7646,7 @@
             <w:r/>
             <w:r>
               <w:rPr>
-                <w:rFonts w:ascii="Arial Unicode MS" w:hAnsi="Arial Unicode MS" w:eastAsia="Arial Unicode MS"/>
+                <w:rFonts w:ascii="Apple SD Gothic Neo" w:hAnsi="Apple SD Gothic Neo" w:eastAsia="Apple SD Gothic Neo"/>
                 <w:b w:val="0"/>
                 <w:color w:val="16243A"/>
                 <w:sz w:val="18"/>
@@ -7679,7 +7679,7 @@
             <w:r/>
             <w:r>
               <w:rPr>
-                <w:rFonts w:ascii="Arial Unicode MS" w:hAnsi="Arial Unicode MS" w:eastAsia="Arial Unicode MS"/>
+                <w:rFonts w:ascii="Apple SD Gothic Neo" w:hAnsi="Apple SD Gothic Neo" w:eastAsia="Apple SD Gothic Neo"/>
                 <w:b/>
                 <w:color w:val="16243A"/>
                 <w:sz w:val="18"/>
@@ -7707,7 +7707,7 @@
             <w:r/>
             <w:r>
               <w:rPr>
-                <w:rFonts w:ascii="Arial Unicode MS" w:hAnsi="Arial Unicode MS" w:eastAsia="Arial Unicode MS"/>
+                <w:rFonts w:ascii="Apple SD Gothic Neo" w:hAnsi="Apple SD Gothic Neo" w:eastAsia="Apple SD Gothic Neo"/>
                 <w:b w:val="0"/>
                 <w:color w:val="16243A"/>
                 <w:sz w:val="18"/>
@@ -7735,7 +7735,7 @@
             <w:r/>
             <w:r>
               <w:rPr>
-                <w:rFonts w:ascii="Arial Unicode MS" w:hAnsi="Arial Unicode MS" w:eastAsia="Arial Unicode MS"/>
+                <w:rFonts w:ascii="Apple SD Gothic Neo" w:hAnsi="Apple SD Gothic Neo" w:eastAsia="Apple SD Gothic Neo"/>
                 <w:b w:val="0"/>
                 <w:color w:val="16243A"/>
                 <w:sz w:val="18"/>
@@ -7768,7 +7768,7 @@
             <w:r/>
             <w:r>
               <w:rPr>
-                <w:rFonts w:ascii="Arial Unicode MS" w:hAnsi="Arial Unicode MS" w:eastAsia="Arial Unicode MS"/>
+                <w:rFonts w:ascii="Apple SD Gothic Neo" w:hAnsi="Apple SD Gothic Neo" w:eastAsia="Apple SD Gothic Neo"/>
                 <w:b/>
                 <w:color w:val="16243A"/>
                 <w:sz w:val="18"/>
@@ -7796,7 +7796,7 @@
             <w:r/>
             <w:r>
               <w:rPr>
-                <w:rFonts w:ascii="Arial Unicode MS" w:hAnsi="Arial Unicode MS" w:eastAsia="Arial Unicode MS"/>
+                <w:rFonts w:ascii="Apple SD Gothic Neo" w:hAnsi="Apple SD Gothic Neo" w:eastAsia="Apple SD Gothic Neo"/>
                 <w:b w:val="0"/>
                 <w:color w:val="16243A"/>
                 <w:sz w:val="18"/>
@@ -7824,7 +7824,7 @@
             <w:r/>
             <w:r>
               <w:rPr>
-                <w:rFonts w:ascii="Arial Unicode MS" w:hAnsi="Arial Unicode MS" w:eastAsia="Arial Unicode MS"/>
+                <w:rFonts w:ascii="Apple SD Gothic Neo" w:hAnsi="Apple SD Gothic Neo" w:eastAsia="Apple SD Gothic Neo"/>
                 <w:b w:val="0"/>
                 <w:color w:val="16243A"/>
                 <w:sz w:val="18"/>
@@ -7857,7 +7857,7 @@
             <w:r/>
             <w:r>
               <w:rPr>
-                <w:rFonts w:ascii="Arial Unicode MS" w:hAnsi="Arial Unicode MS" w:eastAsia="Arial Unicode MS"/>
+                <w:rFonts w:ascii="Apple SD Gothic Neo" w:hAnsi="Apple SD Gothic Neo" w:eastAsia="Apple SD Gothic Neo"/>
                 <w:b/>
                 <w:color w:val="16243A"/>
                 <w:sz w:val="18"/>
@@ -7885,7 +7885,7 @@
             <w:r/>
             <w:r>
               <w:rPr>
-                <w:rFonts w:ascii="Arial Unicode MS" w:hAnsi="Arial Unicode MS" w:eastAsia="Arial Unicode MS"/>
+                <w:rFonts w:ascii="Apple SD Gothic Neo" w:hAnsi="Apple SD Gothic Neo" w:eastAsia="Apple SD Gothic Neo"/>
                 <w:b w:val="0"/>
                 <w:color w:val="16243A"/>
                 <w:sz w:val="18"/>
@@ -7913,7 +7913,7 @@
             <w:r/>
             <w:r>
               <w:rPr>
-                <w:rFonts w:ascii="Arial Unicode MS" w:hAnsi="Arial Unicode MS" w:eastAsia="Arial Unicode MS"/>
+                <w:rFonts w:ascii="Apple SD Gothic Neo" w:hAnsi="Apple SD Gothic Neo" w:eastAsia="Apple SD Gothic Neo"/>
                 <w:b w:val="0"/>
                 <w:color w:val="16243A"/>
                 <w:sz w:val="18"/>
@@ -7982,7 +7982,7 @@
             <w:r/>
             <w:r>
               <w:rPr>
-                <w:rFonts w:ascii="Arial Unicode MS" w:hAnsi="Arial Unicode MS" w:eastAsia="Arial Unicode MS"/>
+                <w:rFonts w:ascii="Apple SD Gothic Neo" w:hAnsi="Apple SD Gothic Neo" w:eastAsia="Apple SD Gothic Neo"/>
                 <w:b/>
                 <w:color w:val="16243A"/>
                 <w:sz w:val="17"/>
@@ -8012,7 +8012,7 @@
             <w:r/>
             <w:r>
               <w:rPr>
-                <w:rFonts w:ascii="Arial Unicode MS" w:hAnsi="Arial Unicode MS" w:eastAsia="Arial Unicode MS"/>
+                <w:rFonts w:ascii="Apple SD Gothic Neo" w:hAnsi="Apple SD Gothic Neo" w:eastAsia="Apple SD Gothic Neo"/>
                 <w:b/>
                 <w:color w:val="16243A"/>
                 <w:sz w:val="17"/>
@@ -8042,7 +8042,7 @@
             <w:r/>
             <w:r>
               <w:rPr>
-                <w:rFonts w:ascii="Arial Unicode MS" w:hAnsi="Arial Unicode MS" w:eastAsia="Arial Unicode MS"/>
+                <w:rFonts w:ascii="Apple SD Gothic Neo" w:hAnsi="Apple SD Gothic Neo" w:eastAsia="Apple SD Gothic Neo"/>
                 <w:b/>
                 <w:color w:val="16243A"/>
                 <w:sz w:val="17"/>
@@ -8075,7 +8075,7 @@
             <w:r/>
             <w:r>
               <w:rPr>
-                <w:rFonts w:ascii="Arial Unicode MS" w:hAnsi="Arial Unicode MS" w:eastAsia="Arial Unicode MS"/>
+                <w:rFonts w:ascii="Apple SD Gothic Neo" w:hAnsi="Apple SD Gothic Neo" w:eastAsia="Apple SD Gothic Neo"/>
                 <w:b/>
                 <w:color w:val="16243A"/>
                 <w:sz w:val="17"/>
@@ -8103,7 +8103,7 @@
             <w:r/>
             <w:r>
               <w:rPr>
-                <w:rFonts w:ascii="Arial Unicode MS" w:hAnsi="Arial Unicode MS" w:eastAsia="Arial Unicode MS"/>
+                <w:rFonts w:ascii="Apple SD Gothic Neo" w:hAnsi="Apple SD Gothic Neo" w:eastAsia="Apple SD Gothic Neo"/>
                 <w:b w:val="0"/>
                 <w:color w:val="16243A"/>
                 <w:sz w:val="17"/>
@@ -8131,7 +8131,7 @@
             <w:r/>
             <w:r>
               <w:rPr>
-                <w:rFonts w:ascii="Arial Unicode MS" w:hAnsi="Arial Unicode MS" w:eastAsia="Arial Unicode MS"/>
+                <w:rFonts w:ascii="Apple SD Gothic Neo" w:hAnsi="Apple SD Gothic Neo" w:eastAsia="Apple SD Gothic Neo"/>
                 <w:b w:val="0"/>
                 <w:color w:val="16243A"/>
                 <w:sz w:val="17"/>
@@ -8164,7 +8164,7 @@
             <w:r/>
             <w:r>
               <w:rPr>
-                <w:rFonts w:ascii="Arial Unicode MS" w:hAnsi="Arial Unicode MS" w:eastAsia="Arial Unicode MS"/>
+                <w:rFonts w:ascii="Apple SD Gothic Neo" w:hAnsi="Apple SD Gothic Neo" w:eastAsia="Apple SD Gothic Neo"/>
                 <w:b/>
                 <w:color w:val="16243A"/>
                 <w:sz w:val="17"/>
@@ -8192,7 +8192,7 @@
             <w:r/>
             <w:r>
               <w:rPr>
-                <w:rFonts w:ascii="Arial Unicode MS" w:hAnsi="Arial Unicode MS" w:eastAsia="Arial Unicode MS"/>
+                <w:rFonts w:ascii="Apple SD Gothic Neo" w:hAnsi="Apple SD Gothic Neo" w:eastAsia="Apple SD Gothic Neo"/>
                 <w:b w:val="0"/>
                 <w:color w:val="16243A"/>
                 <w:sz w:val="17"/>
@@ -8220,7 +8220,7 @@
             <w:r/>
             <w:r>
               <w:rPr>
-                <w:rFonts w:ascii="Arial Unicode MS" w:hAnsi="Arial Unicode MS" w:eastAsia="Arial Unicode MS"/>
+                <w:rFonts w:ascii="Apple SD Gothic Neo" w:hAnsi="Apple SD Gothic Neo" w:eastAsia="Apple SD Gothic Neo"/>
                 <w:b w:val="0"/>
                 <w:color w:val="16243A"/>
                 <w:sz w:val="17"/>
@@ -8253,7 +8253,7 @@
             <w:r/>
             <w:r>
               <w:rPr>
-                <w:rFonts w:ascii="Arial Unicode MS" w:hAnsi="Arial Unicode MS" w:eastAsia="Arial Unicode MS"/>
+                <w:rFonts w:ascii="Apple SD Gothic Neo" w:hAnsi="Apple SD Gothic Neo" w:eastAsia="Apple SD Gothic Neo"/>
                 <w:b/>
                 <w:color w:val="16243A"/>
                 <w:sz w:val="17"/>
@@ -8281,7 +8281,7 @@
             <w:r/>
             <w:r>
               <w:rPr>
-                <w:rFonts w:ascii="Arial Unicode MS" w:hAnsi="Arial Unicode MS" w:eastAsia="Arial Unicode MS"/>
+                <w:rFonts w:ascii="Apple SD Gothic Neo" w:hAnsi="Apple SD Gothic Neo" w:eastAsia="Apple SD Gothic Neo"/>
                 <w:b w:val="0"/>
                 <w:color w:val="16243A"/>
                 <w:sz w:val="17"/>
@@ -8309,7 +8309,7 @@
             <w:r/>
             <w:r>
               <w:rPr>
-                <w:rFonts w:ascii="Arial Unicode MS" w:hAnsi="Arial Unicode MS" w:eastAsia="Arial Unicode MS"/>
+                <w:rFonts w:ascii="Apple SD Gothic Neo" w:hAnsi="Apple SD Gothic Neo" w:eastAsia="Apple SD Gothic Neo"/>
                 <w:b w:val="0"/>
                 <w:color w:val="16243A"/>
                 <w:sz w:val="17"/>
@@ -8342,7 +8342,7 @@
             <w:r/>
             <w:r>
               <w:rPr>
-                <w:rFonts w:ascii="Arial Unicode MS" w:hAnsi="Arial Unicode MS" w:eastAsia="Arial Unicode MS"/>
+                <w:rFonts w:ascii="Apple SD Gothic Neo" w:hAnsi="Apple SD Gothic Neo" w:eastAsia="Apple SD Gothic Neo"/>
                 <w:b/>
                 <w:color w:val="16243A"/>
                 <w:sz w:val="17"/>
@@ -8370,7 +8370,7 @@
             <w:r/>
             <w:r>
               <w:rPr>
-                <w:rFonts w:ascii="Arial Unicode MS" w:hAnsi="Arial Unicode MS" w:eastAsia="Arial Unicode MS"/>
+                <w:rFonts w:ascii="Apple SD Gothic Neo" w:hAnsi="Apple SD Gothic Neo" w:eastAsia="Apple SD Gothic Neo"/>
                 <w:b w:val="0"/>
                 <w:color w:val="16243A"/>
                 <w:sz w:val="17"/>
@@ -8398,7 +8398,7 @@
             <w:r/>
             <w:r>
               <w:rPr>
-                <w:rFonts w:ascii="Arial Unicode MS" w:hAnsi="Arial Unicode MS" w:eastAsia="Arial Unicode MS"/>
+                <w:rFonts w:ascii="Apple SD Gothic Neo" w:hAnsi="Apple SD Gothic Neo" w:eastAsia="Apple SD Gothic Neo"/>
                 <w:b w:val="0"/>
                 <w:color w:val="16243A"/>
                 <w:sz w:val="17"/>
@@ -8431,7 +8431,7 @@
             <w:r/>
             <w:r>
               <w:rPr>
-                <w:rFonts w:ascii="Arial Unicode MS" w:hAnsi="Arial Unicode MS" w:eastAsia="Arial Unicode MS"/>
+                <w:rFonts w:ascii="Apple SD Gothic Neo" w:hAnsi="Apple SD Gothic Neo" w:eastAsia="Apple SD Gothic Neo"/>
                 <w:b/>
                 <w:color w:val="16243A"/>
                 <w:sz w:val="17"/>
@@ -8459,7 +8459,7 @@
             <w:r/>
             <w:r>
               <w:rPr>
-                <w:rFonts w:ascii="Arial Unicode MS" w:hAnsi="Arial Unicode MS" w:eastAsia="Arial Unicode MS"/>
+                <w:rFonts w:ascii="Apple SD Gothic Neo" w:hAnsi="Apple SD Gothic Neo" w:eastAsia="Apple SD Gothic Neo"/>
                 <w:b w:val="0"/>
                 <w:color w:val="16243A"/>
                 <w:sz w:val="17"/>
@@ -8487,7 +8487,7 @@
             <w:r/>
             <w:r>
               <w:rPr>
-                <w:rFonts w:ascii="Arial Unicode MS" w:hAnsi="Arial Unicode MS" w:eastAsia="Arial Unicode MS"/>
+                <w:rFonts w:ascii="Apple SD Gothic Neo" w:hAnsi="Apple SD Gothic Neo" w:eastAsia="Apple SD Gothic Neo"/>
                 <w:b w:val="0"/>
                 <w:color w:val="16243A"/>
                 <w:sz w:val="17"/>
@@ -8520,7 +8520,7 @@
             <w:r/>
             <w:r>
               <w:rPr>
-                <w:rFonts w:ascii="Arial Unicode MS" w:hAnsi="Arial Unicode MS" w:eastAsia="Arial Unicode MS"/>
+                <w:rFonts w:ascii="Apple SD Gothic Neo" w:hAnsi="Apple SD Gothic Neo" w:eastAsia="Apple SD Gothic Neo"/>
                 <w:b/>
                 <w:color w:val="16243A"/>
                 <w:sz w:val="17"/>
@@ -8548,7 +8548,7 @@
             <w:r/>
             <w:r>
               <w:rPr>
-                <w:rFonts w:ascii="Arial Unicode MS" w:hAnsi="Arial Unicode MS" w:eastAsia="Arial Unicode MS"/>
+                <w:rFonts w:ascii="Apple SD Gothic Neo" w:hAnsi="Apple SD Gothic Neo" w:eastAsia="Apple SD Gothic Neo"/>
                 <w:b w:val="0"/>
                 <w:color w:val="16243A"/>
                 <w:sz w:val="17"/>
@@ -8576,7 +8576,7 @@
             <w:r/>
             <w:r>
               <w:rPr>
-                <w:rFonts w:ascii="Arial Unicode MS" w:hAnsi="Arial Unicode MS" w:eastAsia="Arial Unicode MS"/>
+                <w:rFonts w:ascii="Apple SD Gothic Neo" w:hAnsi="Apple SD Gothic Neo" w:eastAsia="Apple SD Gothic Neo"/>
                 <w:b w:val="0"/>
                 <w:color w:val="16243A"/>
                 <w:sz w:val="17"/>
@@ -8609,7 +8609,7 @@
             <w:r/>
             <w:r>
               <w:rPr>
-                <w:rFonts w:ascii="Arial Unicode MS" w:hAnsi="Arial Unicode MS" w:eastAsia="Arial Unicode MS"/>
+                <w:rFonts w:ascii="Apple SD Gothic Neo" w:hAnsi="Apple SD Gothic Neo" w:eastAsia="Apple SD Gothic Neo"/>
                 <w:b/>
                 <w:color w:val="16243A"/>
                 <w:sz w:val="17"/>
@@ -8637,7 +8637,7 @@
             <w:r/>
             <w:r>
               <w:rPr>
-                <w:rFonts w:ascii="Arial Unicode MS" w:hAnsi="Arial Unicode MS" w:eastAsia="Arial Unicode MS"/>
+                <w:rFonts w:ascii="Apple SD Gothic Neo" w:hAnsi="Apple SD Gothic Neo" w:eastAsia="Apple SD Gothic Neo"/>
                 <w:b w:val="0"/>
                 <w:color w:val="16243A"/>
                 <w:sz w:val="17"/>
@@ -8665,7 +8665,7 @@
             <w:r/>
             <w:r>
               <w:rPr>
-                <w:rFonts w:ascii="Arial Unicode MS" w:hAnsi="Arial Unicode MS" w:eastAsia="Arial Unicode MS"/>
+                <w:rFonts w:ascii="Apple SD Gothic Neo" w:hAnsi="Apple SD Gothic Neo" w:eastAsia="Apple SD Gothic Neo"/>
                 <w:b w:val="0"/>
                 <w:color w:val="16243A"/>
                 <w:sz w:val="17"/>
@@ -8698,7 +8698,7 @@
             <w:r/>
             <w:r>
               <w:rPr>
-                <w:rFonts w:ascii="Arial Unicode MS" w:hAnsi="Arial Unicode MS" w:eastAsia="Arial Unicode MS"/>
+                <w:rFonts w:ascii="Apple SD Gothic Neo" w:hAnsi="Apple SD Gothic Neo" w:eastAsia="Apple SD Gothic Neo"/>
                 <w:b/>
                 <w:color w:val="16243A"/>
                 <w:sz w:val="17"/>
@@ -8726,7 +8726,7 @@
             <w:r/>
             <w:r>
               <w:rPr>
-                <w:rFonts w:ascii="Arial Unicode MS" w:hAnsi="Arial Unicode MS" w:eastAsia="Arial Unicode MS"/>
+                <w:rFonts w:ascii="Apple SD Gothic Neo" w:hAnsi="Apple SD Gothic Neo" w:eastAsia="Apple SD Gothic Neo"/>
                 <w:b w:val="0"/>
                 <w:color w:val="16243A"/>
                 <w:sz w:val="17"/>
@@ -8754,7 +8754,7 @@
             <w:r/>
             <w:r>
               <w:rPr>
-                <w:rFonts w:ascii="Arial Unicode MS" w:hAnsi="Arial Unicode MS" w:eastAsia="Arial Unicode MS"/>
+                <w:rFonts w:ascii="Apple SD Gothic Neo" w:hAnsi="Apple SD Gothic Neo" w:eastAsia="Apple SD Gothic Neo"/>
                 <w:b w:val="0"/>
                 <w:color w:val="16243A"/>
                 <w:sz w:val="17"/>
@@ -8787,7 +8787,7 @@
             <w:r/>
             <w:r>
               <w:rPr>
-                <w:rFonts w:ascii="Arial Unicode MS" w:hAnsi="Arial Unicode MS" w:eastAsia="Arial Unicode MS"/>
+                <w:rFonts w:ascii="Apple SD Gothic Neo" w:hAnsi="Apple SD Gothic Neo" w:eastAsia="Apple SD Gothic Neo"/>
                 <w:b/>
                 <w:color w:val="16243A"/>
                 <w:sz w:val="17"/>
@@ -8815,7 +8815,7 @@
             <w:r/>
             <w:r>
               <w:rPr>
-                <w:rFonts w:ascii="Arial Unicode MS" w:hAnsi="Arial Unicode MS" w:eastAsia="Arial Unicode MS"/>
+                <w:rFonts w:ascii="Apple SD Gothic Neo" w:hAnsi="Apple SD Gothic Neo" w:eastAsia="Apple SD Gothic Neo"/>
                 <w:b w:val="0"/>
                 <w:color w:val="16243A"/>
                 <w:sz w:val="17"/>
@@ -8843,7 +8843,7 @@
             <w:r/>
             <w:r>
               <w:rPr>
-                <w:rFonts w:ascii="Arial Unicode MS" w:hAnsi="Arial Unicode MS" w:eastAsia="Arial Unicode MS"/>
+                <w:rFonts w:ascii="Apple SD Gothic Neo" w:hAnsi="Apple SD Gothic Neo" w:eastAsia="Apple SD Gothic Neo"/>
                 <w:b w:val="0"/>
                 <w:color w:val="16243A"/>
                 <w:sz w:val="17"/>
@@ -8912,7 +8912,7 @@
             <w:r/>
             <w:r>
               <w:rPr>
-                <w:rFonts w:ascii="Arial Unicode MS" w:hAnsi="Arial Unicode MS" w:eastAsia="Arial Unicode MS"/>
+                <w:rFonts w:ascii="Apple SD Gothic Neo" w:hAnsi="Apple SD Gothic Neo" w:eastAsia="Apple SD Gothic Neo"/>
                 <w:b/>
                 <w:color w:val="16243A"/>
                 <w:sz w:val="18"/>
@@ -8942,7 +8942,7 @@
             <w:r/>
             <w:r>
               <w:rPr>
-                <w:rFonts w:ascii="Arial Unicode MS" w:hAnsi="Arial Unicode MS" w:eastAsia="Arial Unicode MS"/>
+                <w:rFonts w:ascii="Apple SD Gothic Neo" w:hAnsi="Apple SD Gothic Neo" w:eastAsia="Apple SD Gothic Neo"/>
                 <w:b/>
                 <w:color w:val="16243A"/>
                 <w:sz w:val="18"/>
@@ -8972,7 +8972,7 @@
             <w:r/>
             <w:r>
               <w:rPr>
-                <w:rFonts w:ascii="Arial Unicode MS" w:hAnsi="Arial Unicode MS" w:eastAsia="Arial Unicode MS"/>
+                <w:rFonts w:ascii="Apple SD Gothic Neo" w:hAnsi="Apple SD Gothic Neo" w:eastAsia="Apple SD Gothic Neo"/>
                 <w:b/>
                 <w:color w:val="16243A"/>
                 <w:sz w:val="18"/>
@@ -9005,7 +9005,7 @@
             <w:r/>
             <w:r>
               <w:rPr>
-                <w:rFonts w:ascii="Arial Unicode MS" w:hAnsi="Arial Unicode MS" w:eastAsia="Arial Unicode MS"/>
+                <w:rFonts w:ascii="Apple SD Gothic Neo" w:hAnsi="Apple SD Gothic Neo" w:eastAsia="Apple SD Gothic Neo"/>
                 <w:b/>
                 <w:color w:val="16243A"/>
                 <w:sz w:val="18"/>
@@ -9033,7 +9033,7 @@
             <w:r/>
             <w:r>
               <w:rPr>
-                <w:rFonts w:ascii="Arial Unicode MS" w:hAnsi="Arial Unicode MS" w:eastAsia="Arial Unicode MS"/>
+                <w:rFonts w:ascii="Apple SD Gothic Neo" w:hAnsi="Apple SD Gothic Neo" w:eastAsia="Apple SD Gothic Neo"/>
                 <w:b w:val="0"/>
                 <w:color w:val="16243A"/>
                 <w:sz w:val="18"/>
@@ -9061,7 +9061,7 @@
             <w:r/>
             <w:r>
               <w:rPr>
-                <w:rFonts w:ascii="Arial Unicode MS" w:hAnsi="Arial Unicode MS" w:eastAsia="Arial Unicode MS"/>
+                <w:rFonts w:ascii="Apple SD Gothic Neo" w:hAnsi="Apple SD Gothic Neo" w:eastAsia="Apple SD Gothic Neo"/>
                 <w:b w:val="0"/>
                 <w:color w:val="16243A"/>
                 <w:sz w:val="18"/>
@@ -9094,7 +9094,96 @@
             <w:r/>
             <w:r>
               <w:rPr>
-                <w:rFonts w:ascii="Arial Unicode MS" w:hAnsi="Arial Unicode MS" w:eastAsia="Arial Unicode MS"/>
+                <w:rFonts w:ascii="Apple SD Gothic Neo" w:hAnsi="Apple SD Gothic Neo" w:eastAsia="Apple SD Gothic Neo"/>
+                <w:b/>
+                <w:color w:val="16243A"/>
+                <w:sz w:val="18"/>
+              </w:rPr>
+              <w:t>개인 예비창업자</w:t>
+            </w:r>
+          </w:p>
+        </w:tc>
+        <w:tc>
+          <w:tcPr>
+            <w:tcW w:type="dxa" w:w="2350"/>
+            <w:tcMar>
+              <w:top w:w="80" w:type="dxa"/>
+              <w:start w:w="120" w:type="dxa"/>
+              <w:bottom w:w="80" w:type="dxa"/>
+              <w:end w:w="120" w:type="dxa"/>
+            </w:tcMar>
+            <w:vAlign w:val="center"/>
+          </w:tcPr>
+          <w:p>
+            <w:pPr>
+              <w:spacing w:before="0" w:after="0" w:line="276" w:lineRule="auto"/>
+              <w:jc w:val="left"/>
+            </w:pPr>
+            <w:r/>
+            <w:r>
+              <w:rPr>
+                <w:rFonts w:ascii="Apple SD Gothic Neo" w:hAnsi="Apple SD Gothic Neo" w:eastAsia="Apple SD Gothic Neo"/>
+                <w:b w:val="0"/>
+                <w:color w:val="16243A"/>
+                <w:sz w:val="18"/>
+              </w:rPr>
+              <w:t>SET-02 · VAL-02</w:t>
+            </w:r>
+          </w:p>
+        </w:tc>
+        <w:tc>
+          <w:tcPr>
+            <w:tcW w:type="dxa" w:w="4960"/>
+            <w:tcMar>
+              <w:top w:w="80" w:type="dxa"/>
+              <w:start w:w="120" w:type="dxa"/>
+              <w:bottom w:w="80" w:type="dxa"/>
+              <w:end w:w="120" w:type="dxa"/>
+            </w:tcMar>
+            <w:vAlign w:val="center"/>
+          </w:tcPr>
+          <w:p>
+            <w:pPr>
+              <w:spacing w:before="0" w:after="0" w:line="276" w:lineRule="auto"/>
+              <w:jc w:val="left"/>
+            </w:pPr>
+            <w:r/>
+            <w:r>
+              <w:rPr>
+                <w:rFonts w:ascii="Apple SD Gothic Neo" w:hAnsi="Apple SD Gothic Neo" w:eastAsia="Apple SD Gothic Neo"/>
+                <w:b w:val="0"/>
+                <w:color w:val="16243A"/>
+                <w:sz w:val="18"/>
+              </w:rPr>
+              <w:t>회사 정보가 미확정이어도 초안 생성까지 허용하고 표시 주체 명칭·주소·연락처가 확정되기 전에는 공개 발행 차단</w:t>
+            </w:r>
+          </w:p>
+        </w:tc>
+      </w:tr>
+      <w:tr>
+        <w:trPr>
+          <w:cantSplit/>
+        </w:trPr>
+        <w:tc>
+          <w:tcPr>
+            <w:tcW w:type="dxa" w:w="2050"/>
+            <w:tcMar>
+              <w:top w:w="80" w:type="dxa"/>
+              <w:start w:w="120" w:type="dxa"/>
+              <w:bottom w:w="80" w:type="dxa"/>
+              <w:end w:w="120" w:type="dxa"/>
+            </w:tcMar>
+            <w:vAlign w:val="center"/>
+          </w:tcPr>
+          <w:p>
+            <w:pPr>
+              <w:spacing w:before="0" w:after="0" w:line="276" w:lineRule="auto"/>
+              <w:jc w:val="left"/>
+            </w:pPr>
+            <w:r/>
+            <w:r>
+              <w:rPr>
+                <w:rFonts w:ascii="Apple SD Gothic Neo" w:hAnsi="Apple SD Gothic Neo" w:eastAsia="Apple SD Gothic Neo"/>
                 <w:b/>
                 <w:color w:val="16243A"/>
                 <w:sz w:val="18"/>
@@ -9122,7 +9211,7 @@
             <w:r/>
             <w:r>
               <w:rPr>
-                <w:rFonts w:ascii="Arial Unicode MS" w:hAnsi="Arial Unicode MS" w:eastAsia="Arial Unicode MS"/>
+                <w:rFonts w:ascii="Apple SD Gothic Neo" w:hAnsi="Apple SD Gothic Neo" w:eastAsia="Apple SD Gothic Neo"/>
                 <w:b w:val="0"/>
                 <w:color w:val="16243A"/>
                 <w:sz w:val="18"/>
@@ -9150,7 +9239,7 @@
             <w:r/>
             <w:r>
               <w:rPr>
-                <w:rFonts w:ascii="Arial Unicode MS" w:hAnsi="Arial Unicode MS" w:eastAsia="Arial Unicode MS"/>
+                <w:rFonts w:ascii="Apple SD Gothic Neo" w:hAnsi="Apple SD Gothic Neo" w:eastAsia="Apple SD Gothic Neo"/>
                 <w:b w:val="0"/>
                 <w:color w:val="16243A"/>
                 <w:sz w:val="18"/>
@@ -9183,7 +9272,7 @@
             <w:r/>
             <w:r>
               <w:rPr>
-                <w:rFonts w:ascii="Arial Unicode MS" w:hAnsi="Arial Unicode MS" w:eastAsia="Arial Unicode MS"/>
+                <w:rFonts w:ascii="Apple SD Gothic Neo" w:hAnsi="Apple SD Gothic Neo" w:eastAsia="Apple SD Gothic Neo"/>
                 <w:b/>
                 <w:color w:val="16243A"/>
                 <w:sz w:val="18"/>
@@ -9211,7 +9300,7 @@
             <w:r/>
             <w:r>
               <w:rPr>
-                <w:rFonts w:ascii="Arial Unicode MS" w:hAnsi="Arial Unicode MS" w:eastAsia="Arial Unicode MS"/>
+                <w:rFonts w:ascii="Apple SD Gothic Neo" w:hAnsi="Apple SD Gothic Neo" w:eastAsia="Apple SD Gothic Neo"/>
                 <w:b w:val="0"/>
                 <w:color w:val="16243A"/>
                 <w:sz w:val="18"/>
@@ -9239,7 +9328,7 @@
             <w:r/>
             <w:r>
               <w:rPr>
-                <w:rFonts w:ascii="Arial Unicode MS" w:hAnsi="Arial Unicode MS" w:eastAsia="Arial Unicode MS"/>
+                <w:rFonts w:ascii="Apple SD Gothic Neo" w:hAnsi="Apple SD Gothic Neo" w:eastAsia="Apple SD Gothic Neo"/>
                 <w:b w:val="0"/>
                 <w:color w:val="16243A"/>
                 <w:sz w:val="18"/>
@@ -9272,7 +9361,7 @@
             <w:r/>
             <w:r>
               <w:rPr>
-                <w:rFonts w:ascii="Arial Unicode MS" w:hAnsi="Arial Unicode MS" w:eastAsia="Arial Unicode MS"/>
+                <w:rFonts w:ascii="Apple SD Gothic Neo" w:hAnsi="Apple SD Gothic Neo" w:eastAsia="Apple SD Gothic Neo"/>
                 <w:b/>
                 <w:color w:val="16243A"/>
                 <w:sz w:val="18"/>
@@ -9300,7 +9389,7 @@
             <w:r/>
             <w:r>
               <w:rPr>
-                <w:rFonts w:ascii="Arial Unicode MS" w:hAnsi="Arial Unicode MS" w:eastAsia="Arial Unicode MS"/>
+                <w:rFonts w:ascii="Apple SD Gothic Neo" w:hAnsi="Apple SD Gothic Neo" w:eastAsia="Apple SD Gothic Neo"/>
                 <w:b w:val="0"/>
                 <w:color w:val="16243A"/>
                 <w:sz w:val="18"/>
@@ -9328,7 +9417,7 @@
             <w:r/>
             <w:r>
               <w:rPr>
-                <w:rFonts w:ascii="Arial Unicode MS" w:hAnsi="Arial Unicode MS" w:eastAsia="Arial Unicode MS"/>
+                <w:rFonts w:ascii="Apple SD Gothic Neo" w:hAnsi="Apple SD Gothic Neo" w:eastAsia="Apple SD Gothic Neo"/>
                 <w:b w:val="0"/>
                 <w:color w:val="16243A"/>
                 <w:sz w:val="18"/>
@@ -9361,7 +9450,7 @@
             <w:r/>
             <w:r>
               <w:rPr>
-                <w:rFonts w:ascii="Arial Unicode MS" w:hAnsi="Arial Unicode MS" w:eastAsia="Arial Unicode MS"/>
+                <w:rFonts w:ascii="Apple SD Gothic Neo" w:hAnsi="Apple SD Gothic Neo" w:eastAsia="Apple SD Gothic Neo"/>
                 <w:b/>
                 <w:color w:val="16243A"/>
                 <w:sz w:val="18"/>
@@ -9389,7 +9478,7 @@
             <w:r/>
             <w:r>
               <w:rPr>
-                <w:rFonts w:ascii="Arial Unicode MS" w:hAnsi="Arial Unicode MS" w:eastAsia="Arial Unicode MS"/>
+                <w:rFonts w:ascii="Apple SD Gothic Neo" w:hAnsi="Apple SD Gothic Neo" w:eastAsia="Apple SD Gothic Neo"/>
                 <w:b w:val="0"/>
                 <w:color w:val="16243A"/>
                 <w:sz w:val="18"/>
@@ -9417,7 +9506,7 @@
             <w:r/>
             <w:r>
               <w:rPr>
-                <w:rFonts w:ascii="Arial Unicode MS" w:hAnsi="Arial Unicode MS" w:eastAsia="Arial Unicode MS"/>
+                <w:rFonts w:ascii="Apple SD Gothic Neo" w:hAnsi="Apple SD Gothic Neo" w:eastAsia="Apple SD Gothic Neo"/>
                 <w:b w:val="0"/>
                 <w:color w:val="16243A"/>
                 <w:sz w:val="18"/>
@@ -9450,7 +9539,7 @@
             <w:r/>
             <w:r>
               <w:rPr>
-                <w:rFonts w:ascii="Arial Unicode MS" w:hAnsi="Arial Unicode MS" w:eastAsia="Arial Unicode MS"/>
+                <w:rFonts w:ascii="Apple SD Gothic Neo" w:hAnsi="Apple SD Gothic Neo" w:eastAsia="Apple SD Gothic Neo"/>
                 <w:b/>
                 <w:color w:val="16243A"/>
                 <w:sz w:val="18"/>
@@ -9478,7 +9567,7 @@
             <w:r/>
             <w:r>
               <w:rPr>
-                <w:rFonts w:ascii="Arial Unicode MS" w:hAnsi="Arial Unicode MS" w:eastAsia="Arial Unicode MS"/>
+                <w:rFonts w:ascii="Apple SD Gothic Neo" w:hAnsi="Apple SD Gothic Neo" w:eastAsia="Apple SD Gothic Neo"/>
                 <w:b w:val="0"/>
                 <w:color w:val="16243A"/>
                 <w:sz w:val="18"/>
@@ -9506,7 +9595,7 @@
             <w:r/>
             <w:r>
               <w:rPr>
-                <w:rFonts w:ascii="Arial Unicode MS" w:hAnsi="Arial Unicode MS" w:eastAsia="Arial Unicode MS"/>
+                <w:rFonts w:ascii="Apple SD Gothic Neo" w:hAnsi="Apple SD Gothic Neo" w:eastAsia="Apple SD Gothic Neo"/>
                 <w:b w:val="0"/>
                 <w:color w:val="16243A"/>
                 <w:sz w:val="18"/>
@@ -9539,7 +9628,7 @@
             <w:r/>
             <w:r>
               <w:rPr>
-                <w:rFonts w:ascii="Arial Unicode MS" w:hAnsi="Arial Unicode MS" w:eastAsia="Arial Unicode MS"/>
+                <w:rFonts w:ascii="Apple SD Gothic Neo" w:hAnsi="Apple SD Gothic Neo" w:eastAsia="Apple SD Gothic Neo"/>
                 <w:b/>
                 <w:color w:val="16243A"/>
                 <w:sz w:val="18"/>
@@ -9567,7 +9656,7 @@
             <w:r/>
             <w:r>
               <w:rPr>
-                <w:rFonts w:ascii="Arial Unicode MS" w:hAnsi="Arial Unicode MS" w:eastAsia="Arial Unicode MS"/>
+                <w:rFonts w:ascii="Apple SD Gothic Neo" w:hAnsi="Apple SD Gothic Neo" w:eastAsia="Apple SD Gothic Neo"/>
                 <w:b w:val="0"/>
                 <w:color w:val="16243A"/>
                 <w:sz w:val="18"/>
@@ -9595,7 +9684,7 @@
             <w:r/>
             <w:r>
               <w:rPr>
-                <w:rFonts w:ascii="Arial Unicode MS" w:hAnsi="Arial Unicode MS" w:eastAsia="Arial Unicode MS"/>
+                <w:rFonts w:ascii="Apple SD Gothic Neo" w:hAnsi="Apple SD Gothic Neo" w:eastAsia="Apple SD Gothic Neo"/>
                 <w:b w:val="0"/>
                 <w:color w:val="16243A"/>
                 <w:sz w:val="18"/>
@@ -9628,7 +9717,7 @@
             <w:r/>
             <w:r>
               <w:rPr>
-                <w:rFonts w:ascii="Arial Unicode MS" w:hAnsi="Arial Unicode MS" w:eastAsia="Arial Unicode MS"/>
+                <w:rFonts w:ascii="Apple SD Gothic Neo" w:hAnsi="Apple SD Gothic Neo" w:eastAsia="Apple SD Gothic Neo"/>
                 <w:b/>
                 <w:color w:val="16243A"/>
                 <w:sz w:val="18"/>
@@ -9656,7 +9745,7 @@
             <w:r/>
             <w:r>
               <w:rPr>
-                <w:rFonts w:ascii="Arial Unicode MS" w:hAnsi="Arial Unicode MS" w:eastAsia="Arial Unicode MS"/>
+                <w:rFonts w:ascii="Apple SD Gothic Neo" w:hAnsi="Apple SD Gothic Neo" w:eastAsia="Apple SD Gothic Neo"/>
                 <w:b w:val="0"/>
                 <w:color w:val="16243A"/>
                 <w:sz w:val="18"/>
@@ -9684,7 +9773,7 @@
             <w:r/>
             <w:r>
               <w:rPr>
-                <w:rFonts w:ascii="Arial Unicode MS" w:hAnsi="Arial Unicode MS" w:eastAsia="Arial Unicode MS"/>
+                <w:rFonts w:ascii="Apple SD Gothic Neo" w:hAnsi="Apple SD Gothic Neo" w:eastAsia="Apple SD Gothic Neo"/>
                 <w:b w:val="0"/>
                 <w:color w:val="16243A"/>
                 <w:sz w:val="18"/>
@@ -9734,7 +9823,7 @@
             <w:r/>
             <w:r>
               <w:rPr>
-                <w:rFonts w:ascii="Arial Unicode MS" w:hAnsi="Arial Unicode MS" w:eastAsia="Arial Unicode MS"/>
+                <w:rFonts w:ascii="Apple SD Gothic Neo" w:hAnsi="Apple SD Gothic Neo" w:eastAsia="Apple SD Gothic Neo"/>
                 <w:b/>
                 <w:color w:val="8A6511"/>
                 <w:sz w:val="20"/>
@@ -9743,7 +9832,7 @@
             </w:r>
             <w:r>
               <w:rPr>
-                <w:rFonts w:ascii="Arial Unicode MS" w:hAnsi="Arial Unicode MS" w:eastAsia="Arial Unicode MS"/>
+                <w:rFonts w:ascii="Apple SD Gothic Neo" w:hAnsi="Apple SD Gothic Neo" w:eastAsia="Apple SD Gothic Neo"/>
                 <w:color w:val="16243A"/>
                 <w:sz w:val="20"/>
               </w:rPr>
@@ -9776,7 +9865,7 @@
     <w:r/>
     <w:r>
       <w:rPr>
-        <w:rFonts w:ascii="Arial Unicode MS" w:hAnsi="Arial Unicode MS" w:eastAsia="Arial Unicode MS"/>
+        <w:rFonts w:ascii="Apple SD Gothic Neo" w:hAnsi="Apple SD Gothic Neo" w:eastAsia="Apple SD Gothic Neo"/>
         <w:color w:val="5E6878"/>
         <w:sz w:val="17"/>
       </w:rPr>
@@ -9800,12 +9889,12 @@
     <w:r/>
     <w:r>
       <w:rPr>
-        <w:rFonts w:ascii="Arial Unicode MS" w:hAnsi="Arial Unicode MS" w:eastAsia="Arial Unicode MS"/>
+        <w:rFonts w:ascii="Apple SD Gothic Neo" w:hAnsi="Apple SD Gothic Neo" w:eastAsia="Apple SD Gothic Neo"/>
         <w:b/>
         <w:color w:val="5E6878"/>
         <w:sz w:val="17"/>
       </w:rPr>
-      <w:t>핵심 기능정의서   ·   FDS-2026-08-v2.3</w:t>
+      <w:t>핵심 기능정의서   ·   FDS-2026-08-v2.4</w:t>
     </w:r>
   </w:p>
 </w:hdr>
@@ -10216,7 +10305,7 @@
       <w:spacing w:before="0" w:after="120" w:line="300" w:lineRule="auto"/>
     </w:pPr>
     <w:rPr>
-      <w:rFonts w:ascii="Arial Unicode MS" w:hAnsi="Arial Unicode MS" w:eastAsia="Arial Unicode MS"/>
+      <w:rFonts w:ascii="Apple SD Gothic Neo" w:hAnsi="Apple SD Gothic Neo" w:eastAsia="Apple SD Gothic Neo"/>
       <w:color w:val="16243A"/>
       <w:sz w:val="22"/>
     </w:rPr>
@@ -10280,7 +10369,7 @@
       <w:outlineLvl w:val="0"/>
     </w:pPr>
     <w:rPr>
-      <w:rFonts w:asciiTheme="majorHAnsi" w:eastAsiaTheme="majorEastAsia" w:hAnsiTheme="majorHAnsi" w:cstheme="majorBidi" w:ascii="Arial Unicode MS" w:hAnsi="Arial Unicode MS" w:eastAsia="Arial Unicode MS"/>
+      <w:rFonts w:asciiTheme="majorHAnsi" w:eastAsiaTheme="majorEastAsia" w:hAnsiTheme="majorHAnsi" w:cstheme="majorBidi" w:ascii="Apple SD Gothic Neo" w:hAnsi="Apple SD Gothic Neo" w:eastAsia="Apple SD Gothic Neo"/>
       <w:b/>
       <w:bCs/>
       <w:color w:val="2454DB"/>
@@ -10304,7 +10393,7 @@
       <w:outlineLvl w:val="1"/>
     </w:pPr>
     <w:rPr>
-      <w:rFonts w:asciiTheme="majorHAnsi" w:eastAsiaTheme="majorEastAsia" w:hAnsiTheme="majorHAnsi" w:cstheme="majorBidi" w:ascii="Arial Unicode MS" w:hAnsi="Arial Unicode MS" w:eastAsia="Arial Unicode MS"/>
+      <w:rFonts w:asciiTheme="majorHAnsi" w:eastAsiaTheme="majorEastAsia" w:hAnsiTheme="majorHAnsi" w:cstheme="majorBidi" w:ascii="Apple SD Gothic Neo" w:hAnsi="Apple SD Gothic Neo" w:eastAsia="Apple SD Gothic Neo"/>
       <w:b/>
       <w:bCs/>
       <w:color w:val="2454DB"/>
@@ -10328,7 +10417,7 @@
       <w:outlineLvl w:val="2"/>
     </w:pPr>
     <w:rPr>
-      <w:rFonts w:asciiTheme="majorHAnsi" w:eastAsiaTheme="majorEastAsia" w:hAnsiTheme="majorHAnsi" w:cstheme="majorBidi" w:ascii="Arial Unicode MS" w:hAnsi="Arial Unicode MS" w:eastAsia="Arial Unicode MS"/>
+      <w:rFonts w:asciiTheme="majorHAnsi" w:eastAsiaTheme="majorEastAsia" w:hAnsiTheme="majorHAnsi" w:cstheme="majorBidi" w:ascii="Apple SD Gothic Neo" w:hAnsi="Apple SD Gothic Neo" w:eastAsia="Apple SD Gothic Neo"/>
       <w:b/>
       <w:bCs/>
       <w:color w:val="17356F"/>

</xml_diff>

<commit_message>
docs: generate only selected jurisdictions
</commit_message>
<xml_diff>
--- a/docs/기능정의서.docx
+++ b/docs/기능정의서.docx
@@ -613,7 +613,7 @@
                 <w:color w:val="16243A"/>
                 <w:sz w:val="20"/>
               </w:rPr>
-              <w:t>사용자가 안전한 서비스 자료를 입력하고 처리 사실을 확인한 뒤, 4개 관할 문서를 검토·승인·발행하고 국가별 버전과 변경 이유를 확인할 수 있으면 핵심 여정이 완료됩니다.</w:t>
+              <w:t>사용자가 안전한 서비스 자료를 입력하고 처리 사실을 확인한 뒤, 지원하는 4개 관할 중 선택한 목표 국가의 문서를 검토·승인·발행하고 국가별 버전과 변경 이유를 확인할 수 있으면 핵심 여정이 완료됩니다.</w:t>
             </w:r>
           </w:p>
         </w:tc>
@@ -1172,7 +1172,7 @@
                 <w:color w:val="16243A"/>
                 <w:sz w:val="17"/>
               </w:rPr>
-              <w:t>국가별 문서 생성 요청</w:t>
+              <w:t>선택한 국가의 문서 생성 요청</w:t>
             </w:r>
           </w:p>
         </w:tc>
@@ -1200,7 +1200,7 @@
                 <w:color w:val="16243A"/>
                 <w:sz w:val="17"/>
               </w:rPr>
-              <w:t>작성 시점 공식 법령·지침 조회 후 4개 독립 초안 생성</w:t>
+              <w:t>작성 시점 공식 법령·지침 조회 후 선택한 국가별 독립 초안 생성</w:t>
             </w:r>
           </w:p>
         </w:tc>
@@ -1766,7 +1766,7 @@
                 <w:color w:val="16243A"/>
                 <w:sz w:val="18"/>
               </w:rPr>
-              <w:t>공식 출처 스냅샷·4개 관할 문서 생성</w:t>
+              <w:t>공식 출처 스냅샷·선택한 목표 국가 문서 생성</w:t>
             </w:r>
           </w:p>
         </w:tc>
@@ -5119,7 +5119,7 @@
                 <w:color w:val="16243A"/>
                 <w:sz w:val="17"/>
               </w:rPr>
-              <w:t>확정 사실과 작성 시점에 조회한 국가별 법령·공식 지침을 함께 입력으로 사용하고, 승인된 규칙·조항을 적용해 4개 관할 문서를 각각 생성한다.</w:t>
+              <w:t>확정 사실과 작성 시점에 조회한 국가별 법령·공식 지침을 함께 입력으로 사용하고, 승인된 규칙·조항을 적용해 사용자가 선택한 목표 국가의 문서만 각각 생성한다.</w:t>
             </w:r>
           </w:p>
         </w:tc>
@@ -5147,7 +5147,7 @@
                 <w:color w:val="16243A"/>
                 <w:sz w:val="17"/>
               </w:rPr>
-              <w:t>국가마다 독립 문서 ID·상태·버전·법률 기준일·출처 스냅샷 ID를 가진다.</w:t>
+              <w:t>선택한 국가마다 독립 문서 ID·상태·버전·법률 기준일·출처 스냅샷 ID를 가진다.</w:t>
             </w:r>
           </w:p>
         </w:tc>
@@ -9277,7 +9277,7 @@
                 <w:color w:val="16243A"/>
                 <w:sz w:val="18"/>
               </w:rPr>
-              <w:t>4개 국가 초안</w:t>
+              <w:t>선택한 국가 초안</w:t>
             </w:r>
           </w:p>
         </w:tc>
@@ -9305,7 +9305,7 @@
                 <w:color w:val="16243A"/>
                 <w:sz w:val="18"/>
               </w:rPr>
-              <w:t>FAC-01~05 · DOC-01~04</w:t>
+              <w:t>SET-03 · FAC-01~05 · DOC-01~04</w:t>
             </w:r>
           </w:p>
         </w:tc>
@@ -9333,7 +9333,7 @@
                 <w:color w:val="16243A"/>
                 <w:sz w:val="18"/>
               </w:rPr>
-              <w:t>확정 사실과 작성 시점의 국가별 법령·공식 지침으로 4개 독립 초안을 만들고 출처·차이·생성 근거를 확인</w:t>
+              <w:t>확정 사실과 작성 시점의 국가별 법령·공식 지침으로 사용자가 선택한 목표 국가에 대해서만 독립 초안을 만들고 출처·차이·생성 근거를 확인</w:t>
             </w:r>
           </w:p>
         </w:tc>
@@ -9894,7 +9894,7 @@
         <w:color w:val="5E6878"/>
         <w:sz w:val="17"/>
       </w:rPr>
-      <w:t>핵심 기능정의서   ·   FDS-2026-08-v2.4</w:t>
+      <w:t>핵심 기능정의서   ·   FDS-2026-08-v2.5</w:t>
     </w:r>
   </w:p>
 </w:hdr>

</xml_diff>

<commit_message>
docs: remove non-target feature listings
</commit_message>
<xml_diff>
--- a/docs/기능정의서.docx
+++ b/docs/기능정의서.docx
@@ -428,7 +428,7 @@
                 <w:color w:val="16243A"/>
                 <w:sz w:val="19"/>
               </w:rPr>
-              <w:t>MVP · 출시 후 · 결정 필요 · 범위 밖</w:t>
+              <w:t>MVP · 출시 후 · 결정 필요</w:t>
             </w:r>
           </w:p>
         </w:tc>
@@ -938,7 +938,7 @@
                 <w:color w:val="16243A"/>
                 <w:sz w:val="17"/>
               </w:rPr>
-              <w:t>URL·문서·공급업체 정보 제출</w:t>
+              <w:t>개별 URL·문서·공급업체 정보 제출</w:t>
             </w:r>
           </w:p>
         </w:tc>
@@ -1855,7 +1855,7 @@
                 <w:color w:val="16243A"/>
                 <w:sz w:val="18"/>
               </w:rPr>
-              <w:t>임베드·다중 사용자 권한·추가 국가</w:t>
+              <w:t>임베드·다중 사용자 권한</w:t>
             </w:r>
           </w:p>
         </w:tc>
@@ -1888,68 +1888,7 @@
                 <w:color w:val="16243A"/>
                 <w:sz w:val="18"/>
               </w:rPr>
-              <w:t>국가별 독립 버전·변경 이력·규칙·조항 버전</w:t>
-            </w:r>
-          </w:p>
-        </w:tc>
-        <w:tc>
-          <w:tcPr>
-            <w:tcW w:type="dxa" w:w="4680"/>
-            <w:tcMar>
-              <w:top w:w="80" w:type="dxa"/>
-              <w:start w:w="120" w:type="dxa"/>
-              <w:bottom w:w="80" w:type="dxa"/>
-              <w:end w:w="120" w:type="dxa"/>
-            </w:tcMar>
-            <w:vAlign w:val="center"/>
-          </w:tcPr>
-          <w:p>
-            <w:pPr>
-              <w:spacing w:before="0" w:after="0" w:line="276" w:lineRule="auto"/>
-              <w:jc w:val="left"/>
-            </w:pPr>
-            <w:r/>
-            <w:r>
-              <w:rPr>
-                <w:rFonts w:ascii="Apple SD Gothic Neo" w:hAnsi="Apple SD Gothic Neo" w:eastAsia="Apple SD Gothic Neo"/>
-                <w:b w:val="0"/>
-                <w:color w:val="16243A"/>
-                <w:sz w:val="18"/>
-              </w:rPr>
-              <w:t>쿠키 동의·이용약관·계약서·웹 자동 스캔</w:t>
-            </w:r>
-          </w:p>
-        </w:tc>
-      </w:tr>
-      <w:tr>
-        <w:trPr>
-          <w:cantSplit/>
-        </w:trPr>
-        <w:tc>
-          <w:tcPr>
-            <w:tcW w:type="dxa" w:w="4680"/>
-            <w:tcMar>
-              <w:top w:w="80" w:type="dxa"/>
-              <w:start w:w="120" w:type="dxa"/>
-              <w:bottom w:w="80" w:type="dxa"/>
-              <w:end w:w="120" w:type="dxa"/>
-            </w:tcMar>
-            <w:vAlign w:val="center"/>
-          </w:tcPr>
-          <w:p>
-            <w:pPr>
-              <w:spacing w:before="0" w:after="0" w:line="276" w:lineRule="auto"/>
-              <w:jc w:val="left"/>
-            </w:pPr>
-            <w:r/>
-            <w:r>
-              <w:rPr>
-                <w:rFonts w:ascii="Apple SD Gothic Neo" w:hAnsi="Apple SD Gothic Neo" w:eastAsia="Apple SD Gothic Neo"/>
-                <w:b w:val="0"/>
-                <w:color w:val="16243A"/>
-                <w:sz w:val="18"/>
-              </w:rPr>
-              <w:t>고객/운영자 분리·감사·삭제 생애주기</w:t>
+              <w:t>국가별 독립 버전·변경 이력·규칙·조항 버전·고객/운영자 분리·감사·삭제 생애주기</w:t>
             </w:r>
           </w:p>
         </w:tc>
@@ -3202,7 +3141,7 @@
                 <w:color w:val="16243A"/>
                 <w:sz w:val="17"/>
               </w:rPr>
-              <w:t>MVP 범위 밖 → 전용 고지·옵트아웃 설계 후 재검토</w:t>
+              <w:t>자동 생성·발행 제외 → 전용 고지·옵트아웃 설계 검토</w:t>
             </w:r>
           </w:p>
         </w:tc>
@@ -3446,7 +3385,7 @@
                 <w:color w:val="16243A"/>
                 <w:sz w:val="17"/>
               </w:rPr>
-              <w:t>웹사이트 URL, PRD·기능명세, 공급업체 정보를 필요한 범위만 입력한다.</w:t>
+              <w:t>사용자가 분석할 개별 웹페이지 URL, PRD·기능명세, 공급업체 정보를 필요한 범위만 입력한다.</w:t>
             </w:r>
           </w:p>
         </w:tc>
@@ -3474,7 +3413,7 @@
                 <w:color w:val="16243A"/>
                 <w:sz w:val="17"/>
               </w:rPr>
-              <w:t>형식·용량·도메인·악성코드·필수 공급업체 항목을 검사한다.</w:t>
+              <w:t>URL·형식·용량·도메인·악성코드·필수 공급업체 항목을 검사한다.</w:t>
             </w:r>
           </w:p>
         </w:tc>
@@ -4114,7 +4053,7 @@
                 <w:color w:val="16243A"/>
                 <w:sz w:val="16"/>
               </w:rPr>
-              <w:t>안전검사를 통과한 URL·PRD·기능명세·공급업체 자료, 적용할 추출 버전</w:t>
+              <w:t>안전검사를 통과한 사용자 지정 개별 URL·PRD·기능명세·공급업체 자료, 적용할 추출 버전</w:t>
             </w:r>
           </w:p>
         </w:tc>
@@ -7939,7 +7878,7 @@
         <w:pStyle w:val="Heading1"/>
       </w:pPr>
       <w:r>
-        <w:t>4. 출시 후·결정 필요·범위 밖</w:t>
+        <w:t>4. 출시 후·결정 필요</w:t>
       </w:r>
     </w:p>
     <w:tbl>
@@ -8764,95 +8703,6 @@
           </w:p>
         </w:tc>
       </w:tr>
-      <w:tr>
-        <w:trPr>
-          <w:cantSplit/>
-        </w:trPr>
-        <w:tc>
-          <w:tcPr>
-            <w:tcW w:type="dxa" w:w="1300"/>
-            <w:tcMar>
-              <w:top w:w="80" w:type="dxa"/>
-              <w:start w:w="120" w:type="dxa"/>
-              <w:bottom w:w="80" w:type="dxa"/>
-              <w:end w:w="120" w:type="dxa"/>
-            </w:tcMar>
-            <w:vAlign w:val="center"/>
-          </w:tcPr>
-          <w:p>
-            <w:pPr>
-              <w:spacing w:before="0" w:after="0" w:line="276" w:lineRule="auto"/>
-              <w:jc w:val="center"/>
-            </w:pPr>
-            <w:r/>
-            <w:r>
-              <w:rPr>
-                <w:rFonts w:ascii="Apple SD Gothic Neo" w:hAnsi="Apple SD Gothic Neo" w:eastAsia="Apple SD Gothic Neo"/>
-                <w:b/>
-                <w:color w:val="16243A"/>
-                <w:sz w:val="17"/>
-              </w:rPr>
-              <w:t>범위 밖</w:t>
-            </w:r>
-          </w:p>
-        </w:tc>
-        <w:tc>
-          <w:tcPr>
-            <w:tcW w:type="dxa" w:w="3600"/>
-            <w:tcMar>
-              <w:top w:w="80" w:type="dxa"/>
-              <w:start w:w="120" w:type="dxa"/>
-              <w:bottom w:w="80" w:type="dxa"/>
-              <w:end w:w="120" w:type="dxa"/>
-            </w:tcMar>
-            <w:vAlign w:val="center"/>
-          </w:tcPr>
-          <w:p>
-            <w:pPr>
-              <w:spacing w:before="0" w:after="0" w:line="276" w:lineRule="auto"/>
-              <w:jc w:val="left"/>
-            </w:pPr>
-            <w:r/>
-            <w:r>
-              <w:rPr>
-                <w:rFonts w:ascii="Apple SD Gothic Neo" w:hAnsi="Apple SD Gothic Neo" w:eastAsia="Apple SD Gothic Neo"/>
-                <w:b w:val="0"/>
-                <w:color w:val="16243A"/>
-                <w:sz w:val="17"/>
-              </w:rPr>
-              <w:t>웹사이트 자동 스캔·쿠키 동의·이용약관·계약서·추가 국가</w:t>
-            </w:r>
-          </w:p>
-        </w:tc>
-        <w:tc>
-          <w:tcPr>
-            <w:tcW w:type="dxa" w:w="4460"/>
-            <w:tcMar>
-              <w:top w:w="80" w:type="dxa"/>
-              <w:start w:w="120" w:type="dxa"/>
-              <w:bottom w:w="80" w:type="dxa"/>
-              <w:end w:w="120" w:type="dxa"/>
-            </w:tcMar>
-            <w:vAlign w:val="center"/>
-          </w:tcPr>
-          <w:p>
-            <w:pPr>
-              <w:spacing w:before="0" w:after="0" w:line="276" w:lineRule="auto"/>
-              <w:jc w:val="left"/>
-            </w:pPr>
-            <w:r/>
-            <w:r>
-              <w:rPr>
-                <w:rFonts w:ascii="Apple SD Gothic Neo" w:hAnsi="Apple SD Gothic Neo" w:eastAsia="Apple SD Gothic Neo"/>
-                <w:b w:val="0"/>
-                <w:color w:val="16243A"/>
-                <w:sz w:val="17"/>
-              </w:rPr>
-              <w:t>별도 제품 범위와 법률 검토가 필요</w:t>
-            </w:r>
-          </w:p>
-        </w:tc>
-      </w:tr>
     </w:tbl>
     <w:p>
       <w:pPr>
@@ -9216,7 +9066,7 @@
                 <w:color w:val="16243A"/>
                 <w:sz w:val="18"/>
               </w:rPr>
-              <w:t>INP-02~03</w:t>
+              <w:t>INP-01~03</w:t>
             </w:r>
           </w:p>
         </w:tc>
@@ -9244,7 +9094,7 @@
                 <w:color w:val="16243A"/>
                 <w:sz w:val="18"/>
               </w:rPr>
-              <w:t>개인정보 후보가 있으면 외부 AI 전송 없이 차단하고 위치와 수정 방법을 표시</w:t>
+              <w:t>사용자가 지정한 개별 URL·문서를 안전검사하고 개인정보 후보가 있으면 외부 AI 전송 없이 차단해 위치와 수정 방법을 표시</w:t>
             </w:r>
           </w:p>
         </w:tc>
@@ -9894,7 +9744,7 @@
         <w:color w:val="5E6878"/>
         <w:sz w:val="17"/>
       </w:rPr>
-      <w:t>핵심 기능정의서   ·   FDS-2026-08-v2.5</w:t>
+      <w:t>핵심 기능정의서   ·   FDS-2026-08-v2.6</w:t>
     </w:r>
   </w:p>
 </w:hdr>

</xml_diff>

<commit_message>
docs: define implementation categories
</commit_message>
<xml_diff>
--- a/docs/기능정의서.docx
+++ b/docs/기능정의서.docx
@@ -400,7 +400,7 @@
                 <w:color w:val="16243A"/>
                 <w:sz w:val="19"/>
               </w:rPr>
-              <w:t>우선순위</w:t>
+              <w:t>구현 구분</w:t>
             </w:r>
           </w:p>
         </w:tc>
@@ -428,7 +428,7 @@
                 <w:color w:val="16243A"/>
                 <w:sz w:val="19"/>
               </w:rPr>
-              <w:t>MVP · 출시 후 · 결정 필요</w:t>
+              <w:t>필수 구현(MVP) · 재량 구현 · 현재 구현 제외</w:t>
             </w:r>
           </w:p>
         </w:tc>
@@ -1608,8 +1608,8 @@
         <w:tblInd w:w="120" w:type="dxa"/>
       </w:tblPr>
       <w:tblGrid>
-        <w:gridCol w:w="4680"/>
-        <w:gridCol w:w="4680"/>
+        <w:gridCol w:w="1900"/>
+        <w:gridCol w:w="7460"/>
       </w:tblGrid>
       <w:tr>
         <w:trPr>
@@ -1618,7 +1618,7 @@
         </w:trPr>
         <w:tc>
           <w:tcPr>
-            <w:tcW w:type="dxa" w:w="4680"/>
+            <w:tcW w:type="dxa" w:w="1900"/>
             <w:shd w:fill="F3F5F8"/>
             <w:tcMar>
               <w:top w:w="80" w:type="dxa"/>
@@ -1642,13 +1642,13 @@
                 <w:color w:val="16243A"/>
                 <w:sz w:val="18"/>
               </w:rPr>
-              <w:t>MVP에 포함</w:t>
+              <w:t>구현 구분</w:t>
             </w:r>
           </w:p>
         </w:tc>
         <w:tc>
           <w:tcPr>
-            <w:tcW w:type="dxa" w:w="4680"/>
+            <w:tcW w:type="dxa" w:w="7460"/>
             <w:shd w:fill="F3F5F8"/>
             <w:tcMar>
               <w:top w:w="80" w:type="dxa"/>
@@ -1672,7 +1672,7 @@
                 <w:color w:val="16243A"/>
                 <w:sz w:val="18"/>
               </w:rPr>
-              <w:t>출시 후 또는 별도 결정</w:t>
+              <w:t>적용 기준</w:t>
             </w:r>
           </w:p>
         </w:tc>
@@ -1683,7 +1683,7 @@
         </w:trPr>
         <w:tc>
           <w:tcPr>
-            <w:tcW w:type="dxa" w:w="4680"/>
+            <w:tcW w:type="dxa" w:w="1900"/>
             <w:tcMar>
               <w:top w:w="80" w:type="dxa"/>
               <w:start w:w="120" w:type="dxa"/>
@@ -1705,13 +1705,13 @@
                 <w:color w:val="16243A"/>
                 <w:sz w:val="18"/>
               </w:rPr>
-              <w:t>안전한 자료 입력·사실 확인·작성 시점 공식 법령·지침 조회</w:t>
+              <w:t>필수 구현(MVP)</w:t>
             </w:r>
           </w:p>
         </w:tc>
         <w:tc>
           <w:tcPr>
-            <w:tcW w:type="dxa" w:w="4680"/>
+            <w:tcW w:type="dxa" w:w="7460"/>
             <w:tcMar>
               <w:top w:w="80" w:type="dxa"/>
               <w:start w:w="120" w:type="dxa"/>
@@ -1733,7 +1733,7 @@
                 <w:color w:val="16243A"/>
                 <w:sz w:val="18"/>
               </w:rPr>
-              <w:t>정기 자동 법률 출처 모니터링·영향 알림</w:t>
+              <w:t>2장의 28개 기능과 3장의 공통 검증·발행 차단, 5장의 핵심 수용 시나리오</w:t>
             </w:r>
           </w:p>
         </w:tc>
@@ -1744,7 +1744,7 @@
         </w:trPr>
         <w:tc>
           <w:tcPr>
-            <w:tcW w:type="dxa" w:w="4680"/>
+            <w:tcW w:type="dxa" w:w="1900"/>
             <w:tcMar>
               <w:top w:w="80" w:type="dxa"/>
               <w:start w:w="120" w:type="dxa"/>
@@ -1766,13 +1766,13 @@
                 <w:color w:val="16243A"/>
                 <w:sz w:val="18"/>
               </w:rPr>
-              <w:t>공식 출처 스냅샷·선택한 목표 국가 문서 생성</w:t>
+              <w:t>재량 구현</w:t>
             </w:r>
           </w:p>
         </w:tc>
         <w:tc>
           <w:tcPr>
-            <w:tcW w:type="dxa" w:w="4680"/>
+            <w:tcW w:type="dxa" w:w="7460"/>
             <w:tcMar>
               <w:top w:w="80" w:type="dxa"/>
               <w:start w:w="120" w:type="dxa"/>
@@ -1794,7 +1794,7 @@
                 <w:color w:val="16243A"/>
                 <w:sz w:val="18"/>
               </w:rPr>
-              <w:t>외부 변호사 검수 상품·결제·환불</w:t>
+              <w:t>재량 구현은 기존 기능의 의미, 데이터 처리, 외부 계약, 법률 판단 및 발행 결과를 변경하지 않는 범위로 제한한다.</w:t>
             </w:r>
           </w:p>
         </w:tc>
@@ -1805,7 +1805,7 @@
         </w:trPr>
         <w:tc>
           <w:tcPr>
-            <w:tcW w:type="dxa" w:w="4680"/>
+            <w:tcW w:type="dxa" w:w="1900"/>
             <w:tcMar>
               <w:top w:w="80" w:type="dxa"/>
               <w:start w:w="120" w:type="dxa"/>
@@ -1827,13 +1827,13 @@
                 <w:color w:val="16243A"/>
                 <w:sz w:val="18"/>
               </w:rPr>
-              <w:t>발행 차단·고객 승인·공개 URL·HTML·Markdown</w:t>
+              <w:t>현재 구현 제외</w:t>
             </w:r>
           </w:p>
         </w:tc>
         <w:tc>
           <w:tcPr>
-            <w:tcW w:type="dxa" w:w="4680"/>
+            <w:tcW w:type="dxa" w:w="7460"/>
             <w:tcMar>
               <w:top w:w="80" w:type="dxa"/>
               <w:start w:w="120" w:type="dxa"/>
@@ -1855,68 +1855,7 @@
                 <w:color w:val="16243A"/>
                 <w:sz w:val="18"/>
               </w:rPr>
-              <w:t>임베드·다중 사용자 권한</w:t>
-            </w:r>
-          </w:p>
-        </w:tc>
-      </w:tr>
-      <w:tr>
-        <w:trPr>
-          <w:cantSplit/>
-        </w:trPr>
-        <w:tc>
-          <w:tcPr>
-            <w:tcW w:type="dxa" w:w="4680"/>
-            <w:tcMar>
-              <w:top w:w="80" w:type="dxa"/>
-              <w:start w:w="120" w:type="dxa"/>
-              <w:bottom w:w="80" w:type="dxa"/>
-              <w:end w:w="120" w:type="dxa"/>
-            </w:tcMar>
-            <w:vAlign w:val="center"/>
-          </w:tcPr>
-          <w:p>
-            <w:pPr>
-              <w:spacing w:before="0" w:after="0" w:line="276" w:lineRule="auto"/>
-              <w:jc w:val="left"/>
-            </w:pPr>
-            <w:r/>
-            <w:r>
-              <w:rPr>
-                <w:rFonts w:ascii="Apple SD Gothic Neo" w:hAnsi="Apple SD Gothic Neo" w:eastAsia="Apple SD Gothic Neo"/>
-                <w:b w:val="0"/>
-                <w:color w:val="16243A"/>
-                <w:sz w:val="18"/>
-              </w:rPr>
-              <w:t>국가별 독립 버전·변경 이력·규칙·조항 버전·고객/운영자 분리·감사·삭제 생애주기</w:t>
-            </w:r>
-          </w:p>
-        </w:tc>
-        <w:tc>
-          <w:tcPr>
-            <w:tcW w:type="dxa" w:w="4680"/>
-            <w:tcMar>
-              <w:top w:w="80" w:type="dxa"/>
-              <w:start w:w="120" w:type="dxa"/>
-              <w:bottom w:w="80" w:type="dxa"/>
-              <w:end w:w="120" w:type="dxa"/>
-            </w:tcMar>
-            <w:vAlign w:val="center"/>
-          </w:tcPr>
-          <w:p>
-            <w:pPr>
-              <w:spacing w:before="0" w:after="0" w:line="276" w:lineRule="auto"/>
-              <w:jc w:val="left"/>
-            </w:pPr>
-            <w:r/>
-            <w:r>
-              <w:rPr>
-                <w:rFonts w:ascii="Apple SD Gothic Neo" w:hAnsi="Apple SD Gothic Neo" w:eastAsia="Apple SD Gothic Neo"/>
-                <w:b w:val="0"/>
-                <w:color w:val="16243A"/>
-                <w:sz w:val="18"/>
-              </w:rPr>
-              <w:t>가격·플랜·결제·환불</w:t>
+              <w:t>4장의 출시 후·결정 필요 항목은 현재 구현하지 않는다.</w:t>
             </w:r>
           </w:p>
         </w:tc>
@@ -1932,7 +1871,7 @@
         <w:pStyle w:val="Heading1"/>
       </w:pPr>
       <w:r>
-        <w:t>2. MVP 기능 정의</w:t>
+        <w:t>2. 필수 구현 기능 정의</w:t>
       </w:r>
     </w:p>
     <w:p>
@@ -1942,7 +1881,7 @@
           <w:color w:val="16243A"/>
           <w:sz w:val="22"/>
         </w:rPr>
-        <w:t>아래 28개 기능만 MVP 구현 대상으로 봅니다. 사용자 여정을 완료하거나 잘못된 외부 전송·공개 발행을 막는 기능, 실제 운영에 필요한 최소 통제만 남겼습니다.</w:t>
+        <w:t>아래 28개 기능은 MVP 필수 구현 대상입니다. 사용자 여정을 완료하거나 잘못된 외부 전송·공개 발행을 막는 기능, 실제 운영에 필요한 최소 통제만 남겼습니다.</w:t>
       </w:r>
     </w:p>
     <w:p>
@@ -9744,7 +9683,7 @@
         <w:color w:val="5E6878"/>
         <w:sz w:val="17"/>
       </w:rPr>
-      <w:t>핵심 기능정의서   ·   FDS-2026-08-v2.6</w:t>
+      <w:t>핵심 기능정의서   ·   FDS-2026-08-v2.7</w:t>
     </w:r>
   </w:p>
 </w:hdr>

</xml_diff>

<commit_message>
docs: align functional spec boundaries
</commit_message>
<xml_diff>
--- a/docs/기능정의서.docx
+++ b/docs/기능정의서.docx
@@ -9625,7 +9625,7 @@
                 <w:color w:val="16243A"/>
                 <w:sz w:val="20"/>
               </w:rPr>
-              <w:t>국가별 법률 콘텐츠의 적정성, 공식 사이트 수집 허용, AI 공급업체와 데이터 보유정책, 상품·가격과 외부 변호사 운영은 기술검토 부록의 착수 게이트를 별도로 확인해야 합니다. 이 문서는 법률 자문이 아닙니다.</w:t>
+              <w:t>국가별 법률 콘텐츠의 적정성, 공식 사이트 수집 허용, AI 공급업체와 데이터 보유정책은 기술검토 부록의 착수 게이트를 별도로 확인해야 합니다. 이 문서는 법률 자문이 아닙니다.</w:t>
             </w:r>
           </w:p>
         </w:tc>
@@ -9683,7 +9683,7 @@
         <w:color w:val="5E6878"/>
         <w:sz w:val="17"/>
       </w:rPr>
-      <w:t>핵심 기능정의서   ·   FDS-2026-08-v2.7</w:t>
+      <w:t>핵심 기능정의서   ·   FDS-2026-08-v2.8</w:t>
     </w:r>
   </w:p>
 </w:hdr>

</xml_diff>